<commit_message>
Java 3 "Implementación Firma"
</commit_message>
<xml_diff>
--- a/backend/src/main/resources/plantillas/Acta de Entrega 2 2 - copia.docx
+++ b/backend/src/main/resources/plantillas/Acta de Entrega 2 2 - copia.docx
@@ -1,6 +1,6 @@
 
 <file path=word/document.xml><?xml version="1.0" encoding="utf-8"?>
-<w:document xmlns:wpc="http://schemas.microsoft.com/office/word/2010/wordprocessingCanvas" xmlns:cx="http://schemas.microsoft.com/office/drawing/2014/chartex" xmlns:cx1="http://schemas.microsoft.com/office/drawing/2015/9/8/chartex" xmlns:cx2="http://schemas.microsoft.com/office/drawing/2015/10/21/chartex" xmlns:cx3="http://schemas.microsoft.com/office/drawing/2016/5/9/chartex" xmlns:cx4="http://schemas.microsoft.com/office/drawing/2016/5/10/chartex" xmlns:cx5="http://schemas.microsoft.com/office/drawing/2016/5/11/chartex" xmlns:cx6="http://schemas.microsoft.com/office/drawing/2016/5/12/chartex" xmlns:cx7="http://schemas.microsoft.com/office/drawing/2016/5/13/chartex" xmlns:cx8="http://schemas.microsoft.com/office/drawing/2016/5/14/chartex" xmlns:mc="http://schemas.openxmlformats.org/markup-compatibility/2006" xmlns:aink="http://schemas.microsoft.com/office/drawing/2016/ink" xmlns:am3d="http://schemas.microsoft.com/office/drawing/2017/model3d" xmlns:o="urn:schemas-microsoft-com:office:office" xmlns:oel="http://schemas.microsoft.com/office/2019/extlst" xmlns:r="http://schemas.openxmlformats.org/officeDocument/2006/relationships" xmlns:m="http://schemas.openxmlformats.org/officeDocument/2006/math" xmlns:v="urn:schemas-microsoft-com:vml" xmlns:wp14="http://schemas.microsoft.com/office/word/2010/wordprocessingDrawing" xmlns:wp="http://schemas.openxmlformats.org/drawingml/2006/wordprocessingDrawing" xmlns:w10="urn:schemas-microsoft-com:office:word" xmlns:w="http://schemas.openxmlformats.org/wordprocessingml/2006/main" xmlns:w14="http://schemas.microsoft.com/office/word/2010/wordml" xmlns:w15="http://schemas.microsoft.com/office/word/2012/wordml" xmlns:w16cex="http://schemas.microsoft.com/office/word/2018/wordml/cex" xmlns:w16cid="http://schemas.microsoft.com/office/word/2016/wordml/cid" xmlns:w16="http://schemas.microsoft.com/office/word/2018/wordml" xmlns:w16du="http://schemas.microsoft.com/office/word/2023/wordml/word16du" xmlns:w16sdtdh="http://schemas.microsoft.com/office/word/2020/wordml/sdtdatahash" xmlns:w16sdtfl="http://schemas.microsoft.com/office/word/2024/wordml/sdtformatlock" xmlns:w16se="http://schemas.microsoft.com/office/word/2015/wordml/symex" xmlns:wpg="http://schemas.microsoft.com/office/word/2010/wordprocessingGroup" xmlns:wpi="http://schemas.microsoft.com/office/word/2010/wordprocessingInk" xmlns:wne="http://schemas.microsoft.com/office/word/2006/wordml" xmlns:wps="http://schemas.microsoft.com/office/word/2010/wordprocessingShape" mc:Ignorable="w14 w15 w16se w16cid w16 w16cex w16sdtdh w16sdtfl w16du wp14">
+<w:document xmlns:wpc="http://schemas.microsoft.com/office/word/2010/wordprocessingCanvas" xmlns:cx="http://schemas.microsoft.com/office/drawing/2014/chartex" xmlns:cx1="http://schemas.microsoft.com/office/drawing/2015/9/8/chartex" xmlns:cx2="http://schemas.microsoft.com/office/drawing/2015/10/21/chartex" xmlns:cx3="http://schemas.microsoft.com/office/drawing/2016/5/9/chartex" xmlns:cx4="http://schemas.microsoft.com/office/drawing/2016/5/10/chartex" xmlns:cx5="http://schemas.microsoft.com/office/drawing/2016/5/11/chartex" xmlns:cx6="http://schemas.microsoft.com/office/drawing/2016/5/12/chartex" xmlns:cx7="http://schemas.microsoft.com/office/drawing/2016/5/13/chartex" xmlns:cx8="http://schemas.microsoft.com/office/drawing/2016/5/14/chartex" xmlns:mc="http://schemas.openxmlformats.org/markup-compatibility/2006" xmlns:aink="http://schemas.microsoft.com/office/drawing/2016/ink" xmlns:am3d="http://schemas.microsoft.com/office/drawing/2017/model3d" xmlns:o="urn:schemas-microsoft-com:office:office" xmlns:oel="http://schemas.microsoft.com/office/2019/extlst" xmlns:r="http://schemas.openxmlformats.org/officeDocument/2006/relationships" xmlns:m="http://schemas.openxmlformats.org/officeDocument/2006/math" xmlns:v="urn:schemas-microsoft-com:vml" xmlns:wp14="http://schemas.microsoft.com/office/word/2010/wordprocessingDrawing" xmlns:wp="http://schemas.openxmlformats.org/drawingml/2006/wordprocessingDrawing" xmlns:w10="urn:schemas-microsoft-com:office:word" xmlns:w="http://schemas.openxmlformats.org/wordprocessingml/2006/main" xmlns:w14="http://schemas.microsoft.com/office/word/2010/wordml" xmlns:w15="http://schemas.microsoft.com/office/word/2012/wordml" xmlns:w16cei="http://schemas.microsoft.com/office/word/2026/wordml/cei" xmlns:w16cex="http://schemas.microsoft.com/office/word/2018/wordml/cex" xmlns:w16cid="http://schemas.microsoft.com/office/word/2016/wordml/cid" xmlns:w16="http://schemas.microsoft.com/office/word/2018/wordml" xmlns:w16du="http://schemas.microsoft.com/office/word/2023/wordml/word16du" xmlns:w16sdtdh="http://schemas.microsoft.com/office/word/2020/wordml/sdtdatahash" xmlns:w16sdtfl="http://schemas.microsoft.com/office/word/2024/wordml/sdtformatlock" xmlns:w16se="http://schemas.microsoft.com/office/word/2015/wordml/symex" xmlns:wpg="http://schemas.microsoft.com/office/word/2010/wordprocessingGroup" xmlns:wpi="http://schemas.microsoft.com/office/word/2010/wordprocessingInk" xmlns:wne="http://schemas.microsoft.com/office/word/2006/wordml" xmlns:wps="http://schemas.microsoft.com/office/word/2010/wordprocessingShape" mc:Ignorable="w14 w15 w16se w16cid w16 w16cex w16sdtdh w16sdtfl w16du wp14">
   <w:body>
     <w:tbl>
       <w:tblPr>
@@ -62,7 +62,7 @@
                 <v:shape id="_x0000_i1025" type="#_x0000_t75" style="width:2in;height:42pt" o:ole="">
                   <v:imagedata r:id="rId8" o:title=""/>
                 </v:shape>
-                <o:OLEObject Type="Embed" ProgID="PBrush" ShapeID="_x0000_i1025" DrawAspect="Content" ObjectID="_1845806455" r:id="rId9"/>
+                <o:OLEObject Type="Embed" ProgID="PBrush" ShapeID="_x0000_i1025" DrawAspect="Content" ObjectID="_1846988437" r:id="rId9"/>
               </w:object>
             </w:r>
           </w:p>
@@ -405,7 +405,6 @@
                 <w:lang w:val="es-CO"/>
               </w:rPr>
             </w:pPr>
-            <w:proofErr w:type="gramStart"/>
             <w:r>
               <w:rPr>
                 <w:rFonts w:ascii="Arial Narrow" w:hAnsi="Arial Narrow" w:cs="Arial"/>
@@ -448,7 +447,6 @@
               <w:t>o</w:t>
             </w:r>
             <w:proofErr w:type="spellEnd"/>
-            <w:proofErr w:type="gramEnd"/>
             <w:r>
               <w:rPr>
                 <w:rFonts w:ascii="Arial Narrow" w:hAnsi="Arial Narrow" w:cs="Arial"/>
@@ -513,7 +511,6 @@
               </w:rPr>
             </w:pPr>
             <w:bookmarkStart w:id="1" w:name="OLE_LINK9"/>
-            <w:proofErr w:type="gramStart"/>
             <w:r>
               <w:rPr>
                 <w:rFonts w:ascii="Arial Narrow" w:hAnsi="Arial Narrow" w:cs="Arial"/>
@@ -533,18 +530,7 @@
                 <w:szCs w:val="22"/>
                 <w:lang w:val="es-CO"/>
               </w:rPr>
-              <w:t>entregado</w:t>
-            </w:r>
-            <w:proofErr w:type="gramEnd"/>
-            <w:r>
-              <w:rPr>
-                <w:rFonts w:ascii="Arial Narrow" w:hAnsi="Arial Narrow" w:cs="Arial"/>
-                <w:bCs/>
-                <w:sz w:val="22"/>
-                <w:szCs w:val="22"/>
-                <w:lang w:val="es-CO"/>
-              </w:rPr>
-              <w:t>_a</w:t>
+              <w:t>entregado_a</w:t>
             </w:r>
             <w:proofErr w:type="spellEnd"/>
             <w:r>
@@ -603,7 +589,6 @@
               </w:rPr>
             </w:pPr>
             <w:bookmarkStart w:id="2" w:name="OLE_LINK10"/>
-            <w:proofErr w:type="gramStart"/>
             <w:r>
               <w:rPr>
                 <w:rFonts w:ascii="Arial Narrow" w:hAnsi="Arial Narrow" w:cs="Arial"/>
@@ -633,18 +618,7 @@
                 <w:szCs w:val="22"/>
                 <w:lang w:val="es-CO"/>
               </w:rPr>
-              <w:t>cargo</w:t>
-            </w:r>
-            <w:proofErr w:type="gramEnd"/>
-            <w:r>
-              <w:rPr>
-                <w:rFonts w:ascii="Arial Narrow" w:hAnsi="Arial Narrow" w:cs="Arial"/>
-                <w:bCs/>
-                <w:sz w:val="22"/>
-                <w:szCs w:val="22"/>
-                <w:lang w:val="es-CO"/>
-              </w:rPr>
-              <w:t>_</w:t>
+              <w:t>cargo_</w:t>
             </w:r>
             <w:r>
               <w:rPr>
@@ -734,7 +708,6 @@
               </w:rPr>
             </w:pPr>
             <w:bookmarkStart w:id="4" w:name="OLE_LINK6"/>
-            <w:proofErr w:type="gramStart"/>
             <w:r>
               <w:rPr>
                 <w:rFonts w:ascii="Arial Narrow" w:hAnsi="Arial Narrow" w:cs="Arial"/>
@@ -754,18 +727,7 @@
                 <w:szCs w:val="22"/>
                 <w:lang w:val="es-CO"/>
               </w:rPr>
-              <w:t>entregado</w:t>
-            </w:r>
-            <w:proofErr w:type="gramEnd"/>
-            <w:r>
-              <w:rPr>
-                <w:rFonts w:ascii="Arial Narrow" w:hAnsi="Arial Narrow" w:cs="Arial"/>
-                <w:bCs/>
-                <w:sz w:val="22"/>
-                <w:szCs w:val="22"/>
-                <w:lang w:val="es-CO"/>
-              </w:rPr>
-              <w:t>_</w:t>
+              <w:t>entregado_</w:t>
             </w:r>
             <w:r>
               <w:rPr>
@@ -835,7 +797,6 @@
                 <w:lang w:val="es-CO"/>
               </w:rPr>
             </w:pPr>
-            <w:proofErr w:type="gramStart"/>
             <w:r>
               <w:rPr>
                 <w:rFonts w:ascii="Arial Narrow" w:hAnsi="Arial Narrow" w:cs="Arial"/>
@@ -865,18 +826,7 @@
                 <w:szCs w:val="22"/>
                 <w:lang w:val="es-CO"/>
               </w:rPr>
-              <w:t>cargo</w:t>
-            </w:r>
-            <w:proofErr w:type="gramEnd"/>
-            <w:r>
-              <w:rPr>
-                <w:rFonts w:ascii="Arial Narrow" w:hAnsi="Arial Narrow" w:cs="Arial"/>
-                <w:bCs/>
-                <w:sz w:val="22"/>
-                <w:szCs w:val="22"/>
-                <w:lang w:val="es-CO"/>
-              </w:rPr>
-              <w:t>_entrega</w:t>
+              <w:t>cargo_entrega</w:t>
             </w:r>
             <w:proofErr w:type="spellEnd"/>
             <w:r>
@@ -946,7 +896,6 @@
                 <w:lang w:val="es-CO"/>
               </w:rPr>
             </w:pPr>
-            <w:proofErr w:type="gramStart"/>
             <w:r>
               <w:rPr>
                 <w:rFonts w:ascii="Arial Narrow" w:hAnsi="Arial Narrow" w:cs="Arial"/>
@@ -956,19 +905,7 @@
                 <w:u w:val="single"/>
                 <w:lang w:val="es-CO"/>
               </w:rPr>
-              <w:t>{{ asunto</w:t>
-            </w:r>
-            <w:proofErr w:type="gramEnd"/>
-            <w:r>
-              <w:rPr>
-                <w:rFonts w:ascii="Arial Narrow" w:hAnsi="Arial Narrow" w:cs="Arial"/>
-                <w:bCs/>
-                <w:sz w:val="22"/>
-                <w:szCs w:val="22"/>
-                <w:u w:val="single"/>
-                <w:lang w:val="es-CO"/>
-              </w:rPr>
-              <w:t xml:space="preserve"> }}</w:t>
+              <w:t>{{ asunto }}</w:t>
             </w:r>
           </w:p>
         </w:tc>
@@ -1015,10 +952,10 @@
       </w:tblPr>
       <w:tblGrid>
         <w:gridCol w:w="2156"/>
-        <w:gridCol w:w="2239"/>
-        <w:gridCol w:w="2127"/>
-        <w:gridCol w:w="2350"/>
-        <w:gridCol w:w="1619"/>
+        <w:gridCol w:w="1701"/>
+        <w:gridCol w:w="2665"/>
+        <w:gridCol w:w="2155"/>
+        <w:gridCol w:w="1814"/>
       </w:tblGrid>
       <w:tr>
         <w:tc>
@@ -1084,7 +1021,7 @@
         </w:tc>
         <w:tc>
           <w:tcPr>
-            <w:tcW w:w="2239" w:type="dxa"/>
+            <w:tcW w:w="1701" w:type="dxa"/>
             <w:shd w:val="clear" w:color="auto" w:fill="F2F2F2"/>
             <w:vAlign w:val="center"/>
           </w:tcPr>
@@ -1112,7 +1049,7 @@
         </w:tc>
         <w:tc>
           <w:tcPr>
-            <w:tcW w:w="2127" w:type="dxa"/>
+            <w:tcW w:w="2665" w:type="dxa"/>
             <w:shd w:val="clear" w:color="auto" w:fill="F2F2F2"/>
             <w:vAlign w:val="center"/>
           </w:tcPr>
@@ -1140,7 +1077,7 @@
         </w:tc>
         <w:tc>
           <w:tcPr>
-            <w:tcW w:w="2350" w:type="dxa"/>
+            <w:tcW w:w="2155" w:type="dxa"/>
             <w:shd w:val="clear" w:color="auto" w:fill="F2F2F2"/>
             <w:vAlign w:val="center"/>
           </w:tcPr>
@@ -1168,7 +1105,7 @@
         </w:tc>
         <w:tc>
           <w:tcPr>
-            <w:tcW w:w="1619" w:type="dxa"/>
+            <w:tcW w:w="1814" w:type="dxa"/>
             <w:shd w:val="clear" w:color="auto" w:fill="F2F2F2"/>
             <w:vAlign w:val="center"/>
           </w:tcPr>
@@ -1196,6 +1133,9 @@
         </w:tc>
       </w:tr>
       <w:tr>
+        <w:trPr>
+          <w:trHeight w:val="284"/>
+        </w:trPr>
         <w:tc>
           <w:tcPr>
             <w:tcW w:w="2156" w:type="dxa"/>
@@ -1214,34 +1154,22 @@
             </w:pPr>
             <w:bookmarkStart w:id="5" w:name="OLE_LINK5"/>
             <w:bookmarkStart w:id="6" w:name="OLE_LINK7"/>
-            <w:proofErr w:type="gramStart"/>
-            <w:r>
-              <w:rPr>
-                <w:rFonts w:ascii="Arial Narrow" w:hAnsi="Arial Narrow" w:cs="Arial"/>
-                <w:bCs/>
-                <w:sz w:val="22"/>
-                <w:szCs w:val="22"/>
-                <w:lang w:val="es-CO"/>
-              </w:rPr>
-              <w:t>{{ eq</w:t>
-            </w:r>
-            <w:proofErr w:type="gramEnd"/>
-            <w:r>
-              <w:rPr>
-                <w:rFonts w:ascii="Arial Narrow" w:hAnsi="Arial Narrow" w:cs="Arial"/>
-                <w:bCs/>
-                <w:sz w:val="22"/>
-                <w:szCs w:val="22"/>
-                <w:lang w:val="es-CO"/>
-              </w:rPr>
-              <w:t>_1_marca }}</w:t>
+            <w:r>
+              <w:rPr>
+                <w:rFonts w:ascii="Arial Narrow" w:hAnsi="Arial Narrow" w:cs="Arial"/>
+                <w:bCs/>
+                <w:sz w:val="22"/>
+                <w:szCs w:val="22"/>
+                <w:lang w:val="es-CO"/>
+              </w:rPr>
+              <w:t>{{ eq_1_marca }}</w:t>
             </w:r>
             <w:bookmarkEnd w:id="5"/>
           </w:p>
         </w:tc>
         <w:tc>
           <w:tcPr>
-            <w:tcW w:w="2239" w:type="dxa"/>
+            <w:tcW w:w="1701" w:type="dxa"/>
             <w:shd w:val="clear" w:color="auto" w:fill="FFFFFF"/>
           </w:tcPr>
           <w:p>
@@ -1255,36 +1183,24 @@
                 <w:lang w:val="es-CO"/>
               </w:rPr>
             </w:pPr>
-            <w:bookmarkStart w:id="7" w:name="OLE_LINK2"/>
-            <w:bookmarkStart w:id="8" w:name="OLE_LINK12"/>
-            <w:proofErr w:type="gramStart"/>
-            <w:r>
-              <w:rPr>
-                <w:rFonts w:ascii="Arial Narrow" w:hAnsi="Arial Narrow" w:cs="Arial"/>
-                <w:bCs/>
-                <w:sz w:val="22"/>
-                <w:szCs w:val="22"/>
-                <w:lang w:val="es-CO"/>
-              </w:rPr>
-              <w:t>{{ eq</w:t>
-            </w:r>
-            <w:proofErr w:type="gramEnd"/>
-            <w:r>
-              <w:rPr>
-                <w:rFonts w:ascii="Arial Narrow" w:hAnsi="Arial Narrow" w:cs="Arial"/>
-                <w:bCs/>
-                <w:sz w:val="22"/>
-                <w:szCs w:val="22"/>
-                <w:lang w:val="es-CO"/>
-              </w:rPr>
-              <w:t>_1_tipo }}</w:t>
-            </w:r>
-            <w:bookmarkEnd w:id="8"/>
+            <w:bookmarkStart w:id="7" w:name="OLE_LINK12"/>
+            <w:bookmarkStart w:id="8" w:name="OLE_LINK2"/>
+            <w:r>
+              <w:rPr>
+                <w:rFonts w:ascii="Arial Narrow" w:hAnsi="Arial Narrow" w:cs="Arial"/>
+                <w:bCs/>
+                <w:sz w:val="22"/>
+                <w:szCs w:val="22"/>
+                <w:lang w:val="es-CO"/>
+              </w:rPr>
+              <w:t>{{ eq_1_tipo }}</w:t>
+            </w:r>
+            <w:bookmarkEnd w:id="7"/>
           </w:p>
         </w:tc>
         <w:tc>
           <w:tcPr>
-            <w:tcW w:w="2127" w:type="dxa"/>
+            <w:tcW w:w="2665" w:type="dxa"/>
             <w:shd w:val="clear" w:color="auto" w:fill="FFFFFF"/>
           </w:tcPr>
           <w:p>
@@ -1299,35 +1215,23 @@
               </w:rPr>
             </w:pPr>
             <w:bookmarkStart w:id="9" w:name="OLE_LINK13"/>
-            <w:bookmarkEnd w:id="7"/>
-            <w:proofErr w:type="gramStart"/>
-            <w:r>
-              <w:rPr>
-                <w:rFonts w:ascii="Arial Narrow" w:hAnsi="Arial Narrow" w:cs="Arial"/>
-                <w:bCs/>
-                <w:sz w:val="22"/>
-                <w:szCs w:val="22"/>
-                <w:lang w:val="es-CO"/>
-              </w:rPr>
-              <w:t>{{ eq</w:t>
-            </w:r>
-            <w:proofErr w:type="gramEnd"/>
-            <w:r>
-              <w:rPr>
-                <w:rFonts w:ascii="Arial Narrow" w:hAnsi="Arial Narrow" w:cs="Arial"/>
-                <w:bCs/>
-                <w:sz w:val="22"/>
-                <w:szCs w:val="22"/>
-                <w:lang w:val="es-CO"/>
-              </w:rPr>
-              <w:t>_1_modelo }}</w:t>
+            <w:bookmarkEnd w:id="8"/>
+            <w:r>
+              <w:rPr>
+                <w:rFonts w:ascii="Arial Narrow" w:hAnsi="Arial Narrow" w:cs="Arial"/>
+                <w:bCs/>
+                <w:sz w:val="22"/>
+                <w:szCs w:val="22"/>
+                <w:lang w:val="es-CO"/>
+              </w:rPr>
+              <w:t>{{ eq_1_modelo }}</w:t>
             </w:r>
             <w:bookmarkEnd w:id="9"/>
           </w:p>
         </w:tc>
         <w:tc>
           <w:tcPr>
-            <w:tcW w:w="2350" w:type="dxa"/>
+            <w:tcW w:w="2155" w:type="dxa"/>
             <w:shd w:val="clear" w:color="auto" w:fill="FFFFFF"/>
           </w:tcPr>
           <w:p>
@@ -1342,34 +1246,22 @@
               </w:rPr>
             </w:pPr>
             <w:bookmarkStart w:id="10" w:name="OLE_LINK14"/>
-            <w:proofErr w:type="gramStart"/>
-            <w:r>
-              <w:rPr>
-                <w:rFonts w:ascii="Arial Narrow" w:hAnsi="Arial Narrow" w:cs="Arial"/>
-                <w:bCs/>
-                <w:sz w:val="22"/>
-                <w:szCs w:val="22"/>
-                <w:lang w:val="es-CO"/>
-              </w:rPr>
-              <w:t>{{ eq</w:t>
-            </w:r>
-            <w:proofErr w:type="gramEnd"/>
-            <w:r>
-              <w:rPr>
-                <w:rFonts w:ascii="Arial Narrow" w:hAnsi="Arial Narrow" w:cs="Arial"/>
-                <w:bCs/>
-                <w:sz w:val="22"/>
-                <w:szCs w:val="22"/>
-                <w:lang w:val="es-CO"/>
-              </w:rPr>
-              <w:t>_1_serial }}</w:t>
+            <w:r>
+              <w:rPr>
+                <w:rFonts w:ascii="Arial Narrow" w:hAnsi="Arial Narrow" w:cs="Arial"/>
+                <w:bCs/>
+                <w:sz w:val="22"/>
+                <w:szCs w:val="22"/>
+                <w:lang w:val="es-CO"/>
+              </w:rPr>
+              <w:t>{{ eq_1_serial }}</w:t>
             </w:r>
             <w:bookmarkEnd w:id="10"/>
           </w:p>
         </w:tc>
         <w:tc>
           <w:tcPr>
-            <w:tcW w:w="1619" w:type="dxa"/>
+            <w:tcW w:w="1814" w:type="dxa"/>
             <w:shd w:val="clear" w:color="auto" w:fill="FFFFFF"/>
           </w:tcPr>
           <w:p>
@@ -1384,7 +1276,6 @@
               </w:rPr>
             </w:pPr>
             <w:bookmarkStart w:id="11" w:name="OLE_LINK8"/>
-            <w:proofErr w:type="gramStart"/>
             <w:r>
               <w:rPr>
                 <w:rFonts w:ascii="Arial Narrow" w:hAnsi="Arial Narrow" w:cs="Arial"/>
@@ -1413,18 +1304,7 @@
                 <w:szCs w:val="22"/>
                 <w:lang w:val="es-CO"/>
               </w:rPr>
-              <w:t>eq</w:t>
-            </w:r>
-            <w:proofErr w:type="gramEnd"/>
-            <w:r>
-              <w:rPr>
-                <w:rFonts w:ascii="Arial Narrow" w:hAnsi="Arial Narrow" w:cs="Arial"/>
-                <w:bCs/>
-                <w:sz w:val="22"/>
-                <w:szCs w:val="22"/>
-                <w:lang w:val="es-CO"/>
-              </w:rPr>
-              <w:t>_1_inventario</w:t>
+              <w:t>eq_1_inventario</w:t>
             </w:r>
             <w:r>
               <w:rPr>
@@ -1458,27 +1338,15 @@
             <w:shd w:val="clear" w:color="auto" w:fill="FFFFFF"/>
           </w:tcPr>
           <w:p>
-            <w:proofErr w:type="gramStart"/>
-            <w:r>
-              <w:rPr>
-                <w:rFonts w:ascii="Arial Narrow" w:hAnsi="Arial Narrow" w:cs="Arial"/>
-                <w:bCs/>
-                <w:sz w:val="22"/>
-                <w:szCs w:val="22"/>
-                <w:lang w:val="es-CO"/>
-              </w:rPr>
-              <w:t>{{ eq</w:t>
-            </w:r>
-            <w:proofErr w:type="gramEnd"/>
-            <w:r>
-              <w:rPr>
-                <w:rFonts w:ascii="Arial Narrow" w:hAnsi="Arial Narrow" w:cs="Arial"/>
-                <w:bCs/>
-                <w:sz w:val="22"/>
-                <w:szCs w:val="22"/>
-                <w:lang w:val="es-CO"/>
-              </w:rPr>
-              <w:t>_</w:t>
+            <w:r>
+              <w:rPr>
+                <w:rFonts w:ascii="Arial Narrow" w:hAnsi="Arial Narrow" w:cs="Arial"/>
+                <w:bCs/>
+                <w:sz w:val="22"/>
+                <w:szCs w:val="22"/>
+                <w:lang w:val="es-CO"/>
+              </w:rPr>
+              <w:t>{{ eq_</w:t>
             </w:r>
             <w:r>
               <w:rPr>
@@ -1504,31 +1372,19 @@
         </w:tc>
         <w:tc>
           <w:tcPr>
-            <w:tcW w:w="2239" w:type="dxa"/>
+            <w:tcW w:w="1701" w:type="dxa"/>
             <w:shd w:val="clear" w:color="auto" w:fill="FFFFFF"/>
           </w:tcPr>
           <w:p>
-            <w:proofErr w:type="gramStart"/>
-            <w:r>
-              <w:rPr>
-                <w:rFonts w:ascii="Arial Narrow" w:hAnsi="Arial Narrow" w:cs="Arial"/>
-                <w:bCs/>
-                <w:sz w:val="22"/>
-                <w:szCs w:val="22"/>
-                <w:lang w:val="es-CO"/>
-              </w:rPr>
-              <w:t>{{ eq</w:t>
-            </w:r>
-            <w:proofErr w:type="gramEnd"/>
-            <w:r>
-              <w:rPr>
-                <w:rFonts w:ascii="Arial Narrow" w:hAnsi="Arial Narrow" w:cs="Arial"/>
-                <w:bCs/>
-                <w:sz w:val="22"/>
-                <w:szCs w:val="22"/>
-                <w:lang w:val="es-CO"/>
-              </w:rPr>
-              <w:t>_</w:t>
+            <w:r>
+              <w:rPr>
+                <w:rFonts w:ascii="Arial Narrow" w:hAnsi="Arial Narrow" w:cs="Arial"/>
+                <w:bCs/>
+                <w:sz w:val="22"/>
+                <w:szCs w:val="22"/>
+                <w:lang w:val="es-CO"/>
+              </w:rPr>
+              <w:t>{{ eq_</w:t>
             </w:r>
             <w:r>
               <w:rPr>
@@ -1554,31 +1410,19 @@
         </w:tc>
         <w:tc>
           <w:tcPr>
-            <w:tcW w:w="2127" w:type="dxa"/>
+            <w:tcW w:w="2665" w:type="dxa"/>
             <w:shd w:val="clear" w:color="auto" w:fill="FFFFFF"/>
           </w:tcPr>
           <w:p>
-            <w:proofErr w:type="gramStart"/>
-            <w:r>
-              <w:rPr>
-                <w:rFonts w:ascii="Arial Narrow" w:hAnsi="Arial Narrow" w:cs="Arial"/>
-                <w:bCs/>
-                <w:sz w:val="22"/>
-                <w:szCs w:val="22"/>
-                <w:lang w:val="es-CO"/>
-              </w:rPr>
-              <w:t>{{ eq</w:t>
-            </w:r>
-            <w:proofErr w:type="gramEnd"/>
-            <w:r>
-              <w:rPr>
-                <w:rFonts w:ascii="Arial Narrow" w:hAnsi="Arial Narrow" w:cs="Arial"/>
-                <w:bCs/>
-                <w:sz w:val="22"/>
-                <w:szCs w:val="22"/>
-                <w:lang w:val="es-CO"/>
-              </w:rPr>
-              <w:t>_</w:t>
+            <w:r>
+              <w:rPr>
+                <w:rFonts w:ascii="Arial Narrow" w:hAnsi="Arial Narrow" w:cs="Arial"/>
+                <w:bCs/>
+                <w:sz w:val="22"/>
+                <w:szCs w:val="22"/>
+                <w:lang w:val="es-CO"/>
+              </w:rPr>
+              <w:t>{{ eq_</w:t>
             </w:r>
             <w:r>
               <w:rPr>
@@ -1604,31 +1448,19 @@
         </w:tc>
         <w:tc>
           <w:tcPr>
-            <w:tcW w:w="2350" w:type="dxa"/>
+            <w:tcW w:w="2155" w:type="dxa"/>
             <w:shd w:val="clear" w:color="auto" w:fill="FFFFFF"/>
           </w:tcPr>
           <w:p>
-            <w:proofErr w:type="gramStart"/>
-            <w:r>
-              <w:rPr>
-                <w:rFonts w:ascii="Arial Narrow" w:hAnsi="Arial Narrow" w:cs="Arial"/>
-                <w:bCs/>
-                <w:sz w:val="22"/>
-                <w:szCs w:val="22"/>
-                <w:lang w:val="es-CO"/>
-              </w:rPr>
-              <w:t>{{ eq</w:t>
-            </w:r>
-            <w:proofErr w:type="gramEnd"/>
-            <w:r>
-              <w:rPr>
-                <w:rFonts w:ascii="Arial Narrow" w:hAnsi="Arial Narrow" w:cs="Arial"/>
-                <w:bCs/>
-                <w:sz w:val="22"/>
-                <w:szCs w:val="22"/>
-                <w:lang w:val="es-CO"/>
-              </w:rPr>
-              <w:t>_</w:t>
+            <w:r>
+              <w:rPr>
+                <w:rFonts w:ascii="Arial Narrow" w:hAnsi="Arial Narrow" w:cs="Arial"/>
+                <w:bCs/>
+                <w:sz w:val="22"/>
+                <w:szCs w:val="22"/>
+                <w:lang w:val="es-CO"/>
+              </w:rPr>
+              <w:t>{{ eq_</w:t>
             </w:r>
             <w:r>
               <w:rPr>
@@ -1654,11 +1486,10 @@
         </w:tc>
         <w:tc>
           <w:tcPr>
-            <w:tcW w:w="1619" w:type="dxa"/>
+            <w:tcW w:w="1814" w:type="dxa"/>
             <w:shd w:val="clear" w:color="auto" w:fill="FFFFFF"/>
           </w:tcPr>
           <w:p>
-            <w:proofErr w:type="gramStart"/>
             <w:r>
               <w:rPr>
                 <w:rFonts w:ascii="Arial Narrow" w:hAnsi="Arial Narrow" w:cs="Arial"/>
@@ -1687,18 +1518,7 @@
                 <w:szCs w:val="22"/>
                 <w:lang w:val="es-CO"/>
               </w:rPr>
-              <w:t>eq</w:t>
-            </w:r>
-            <w:proofErr w:type="gramEnd"/>
-            <w:r>
-              <w:rPr>
-                <w:rFonts w:ascii="Arial Narrow" w:hAnsi="Arial Narrow" w:cs="Arial"/>
-                <w:bCs/>
-                <w:sz w:val="22"/>
-                <w:szCs w:val="22"/>
-                <w:lang w:val="es-CO"/>
-              </w:rPr>
-              <w:t>_</w:t>
+              <w:t>eq_</w:t>
             </w:r>
             <w:r>
               <w:rPr>
@@ -1750,27 +1570,15 @@
             <w:shd w:val="clear" w:color="auto" w:fill="FFFFFF"/>
           </w:tcPr>
           <w:p>
-            <w:proofErr w:type="gramStart"/>
-            <w:r>
-              <w:rPr>
-                <w:rFonts w:ascii="Arial Narrow" w:hAnsi="Arial Narrow" w:cs="Arial"/>
-                <w:bCs/>
-                <w:sz w:val="22"/>
-                <w:szCs w:val="22"/>
-                <w:lang w:val="es-CO"/>
-              </w:rPr>
-              <w:t>{{ eq</w:t>
-            </w:r>
-            <w:proofErr w:type="gramEnd"/>
-            <w:r>
-              <w:rPr>
-                <w:rFonts w:ascii="Arial Narrow" w:hAnsi="Arial Narrow" w:cs="Arial"/>
-                <w:bCs/>
-                <w:sz w:val="22"/>
-                <w:szCs w:val="22"/>
-                <w:lang w:val="es-CO"/>
-              </w:rPr>
-              <w:t>_</w:t>
+            <w:r>
+              <w:rPr>
+                <w:rFonts w:ascii="Arial Narrow" w:hAnsi="Arial Narrow" w:cs="Arial"/>
+                <w:bCs/>
+                <w:sz w:val="22"/>
+                <w:szCs w:val="22"/>
+                <w:lang w:val="es-CO"/>
+              </w:rPr>
+              <w:t>{{ eq_</w:t>
             </w:r>
             <w:r>
               <w:rPr>
@@ -1796,31 +1604,19 @@
         </w:tc>
         <w:tc>
           <w:tcPr>
-            <w:tcW w:w="2239" w:type="dxa"/>
+            <w:tcW w:w="1701" w:type="dxa"/>
             <w:shd w:val="clear" w:color="auto" w:fill="FFFFFF"/>
           </w:tcPr>
           <w:p>
-            <w:proofErr w:type="gramStart"/>
-            <w:r>
-              <w:rPr>
-                <w:rFonts w:ascii="Arial Narrow" w:hAnsi="Arial Narrow" w:cs="Arial"/>
-                <w:bCs/>
-                <w:sz w:val="22"/>
-                <w:szCs w:val="22"/>
-                <w:lang w:val="es-CO"/>
-              </w:rPr>
-              <w:t>{{ eq</w:t>
-            </w:r>
-            <w:proofErr w:type="gramEnd"/>
-            <w:r>
-              <w:rPr>
-                <w:rFonts w:ascii="Arial Narrow" w:hAnsi="Arial Narrow" w:cs="Arial"/>
-                <w:bCs/>
-                <w:sz w:val="22"/>
-                <w:szCs w:val="22"/>
-                <w:lang w:val="es-CO"/>
-              </w:rPr>
-              <w:t>_</w:t>
+            <w:r>
+              <w:rPr>
+                <w:rFonts w:ascii="Arial Narrow" w:hAnsi="Arial Narrow" w:cs="Arial"/>
+                <w:bCs/>
+                <w:sz w:val="22"/>
+                <w:szCs w:val="22"/>
+                <w:lang w:val="es-CO"/>
+              </w:rPr>
+              <w:t>{{ eq_</w:t>
             </w:r>
             <w:r>
               <w:rPr>
@@ -1846,31 +1642,19 @@
         </w:tc>
         <w:tc>
           <w:tcPr>
-            <w:tcW w:w="2127" w:type="dxa"/>
+            <w:tcW w:w="2665" w:type="dxa"/>
             <w:shd w:val="clear" w:color="auto" w:fill="FFFFFF"/>
           </w:tcPr>
           <w:p>
-            <w:proofErr w:type="gramStart"/>
-            <w:r>
-              <w:rPr>
-                <w:rFonts w:ascii="Arial Narrow" w:hAnsi="Arial Narrow" w:cs="Arial"/>
-                <w:bCs/>
-                <w:sz w:val="22"/>
-                <w:szCs w:val="22"/>
-                <w:lang w:val="es-CO"/>
-              </w:rPr>
-              <w:t>{{ eq</w:t>
-            </w:r>
-            <w:proofErr w:type="gramEnd"/>
-            <w:r>
-              <w:rPr>
-                <w:rFonts w:ascii="Arial Narrow" w:hAnsi="Arial Narrow" w:cs="Arial"/>
-                <w:bCs/>
-                <w:sz w:val="22"/>
-                <w:szCs w:val="22"/>
-                <w:lang w:val="es-CO"/>
-              </w:rPr>
-              <w:t>_</w:t>
+            <w:r>
+              <w:rPr>
+                <w:rFonts w:ascii="Arial Narrow" w:hAnsi="Arial Narrow" w:cs="Arial"/>
+                <w:bCs/>
+                <w:sz w:val="22"/>
+                <w:szCs w:val="22"/>
+                <w:lang w:val="es-CO"/>
+              </w:rPr>
+              <w:t>{{ eq_</w:t>
             </w:r>
             <w:r>
               <w:rPr>
@@ -1896,31 +1680,19 @@
         </w:tc>
         <w:tc>
           <w:tcPr>
-            <w:tcW w:w="2350" w:type="dxa"/>
+            <w:tcW w:w="2155" w:type="dxa"/>
             <w:shd w:val="clear" w:color="auto" w:fill="FFFFFF"/>
           </w:tcPr>
           <w:p>
-            <w:proofErr w:type="gramStart"/>
-            <w:r>
-              <w:rPr>
-                <w:rFonts w:ascii="Arial Narrow" w:hAnsi="Arial Narrow" w:cs="Arial"/>
-                <w:bCs/>
-                <w:sz w:val="22"/>
-                <w:szCs w:val="22"/>
-                <w:lang w:val="es-CO"/>
-              </w:rPr>
-              <w:t>{{ eq</w:t>
-            </w:r>
-            <w:proofErr w:type="gramEnd"/>
-            <w:r>
-              <w:rPr>
-                <w:rFonts w:ascii="Arial Narrow" w:hAnsi="Arial Narrow" w:cs="Arial"/>
-                <w:bCs/>
-                <w:sz w:val="22"/>
-                <w:szCs w:val="22"/>
-                <w:lang w:val="es-CO"/>
-              </w:rPr>
-              <w:t>_</w:t>
+            <w:r>
+              <w:rPr>
+                <w:rFonts w:ascii="Arial Narrow" w:hAnsi="Arial Narrow" w:cs="Arial"/>
+                <w:bCs/>
+                <w:sz w:val="22"/>
+                <w:szCs w:val="22"/>
+                <w:lang w:val="es-CO"/>
+              </w:rPr>
+              <w:t>{{ eq_</w:t>
             </w:r>
             <w:r>
               <w:rPr>
@@ -1946,11 +1718,10 @@
         </w:tc>
         <w:tc>
           <w:tcPr>
-            <w:tcW w:w="1619" w:type="dxa"/>
+            <w:tcW w:w="1814" w:type="dxa"/>
             <w:shd w:val="clear" w:color="auto" w:fill="FFFFFF"/>
           </w:tcPr>
           <w:p>
-            <w:proofErr w:type="gramStart"/>
             <w:r>
               <w:rPr>
                 <w:rFonts w:ascii="Arial Narrow" w:hAnsi="Arial Narrow" w:cs="Arial"/>
@@ -1979,18 +1750,7 @@
                 <w:szCs w:val="22"/>
                 <w:lang w:val="es-CO"/>
               </w:rPr>
-              <w:t>eq</w:t>
-            </w:r>
-            <w:proofErr w:type="gramEnd"/>
-            <w:r>
-              <w:rPr>
-                <w:rFonts w:ascii="Arial Narrow" w:hAnsi="Arial Narrow" w:cs="Arial"/>
-                <w:bCs/>
-                <w:sz w:val="22"/>
-                <w:szCs w:val="22"/>
-                <w:lang w:val="es-CO"/>
-              </w:rPr>
-              <w:t>_</w:t>
+              <w:t>eq_</w:t>
             </w:r>
             <w:r>
               <w:rPr>
@@ -2001,298 +1761,6 @@
                 <w:lang w:val="es-CO"/>
               </w:rPr>
               <w:t>3</w:t>
-            </w:r>
-            <w:r>
-              <w:rPr>
-                <w:rFonts w:ascii="Arial Narrow" w:hAnsi="Arial Narrow" w:cs="Arial"/>
-                <w:bCs/>
-                <w:sz w:val="22"/>
-                <w:szCs w:val="22"/>
-                <w:lang w:val="es-CO"/>
-              </w:rPr>
-              <w:t>_inventario</w:t>
-            </w:r>
-            <w:r>
-              <w:rPr>
-                <w:rFonts w:ascii="Arial Narrow" w:hAnsi="Arial Narrow" w:cs="Arial"/>
-                <w:bCs/>
-                <w:sz w:val="22"/>
-                <w:szCs w:val="22"/>
-                <w:lang w:val="es-CO"/>
-              </w:rPr>
-              <w:t xml:space="preserve"> }</w:t>
-            </w:r>
-            <w:r>
-              <w:rPr>
-                <w:rFonts w:ascii="Arial Narrow" w:hAnsi="Arial Narrow" w:cs="Arial"/>
-                <w:bCs/>
-                <w:sz w:val="22"/>
-                <w:szCs w:val="22"/>
-                <w:lang w:val="es-CO"/>
-              </w:rPr>
-              <w:t>}</w:t>
-            </w:r>
-          </w:p>
-        </w:tc>
-      </w:tr>
-      <w:tr>
-        <w:tc>
-          <w:tcPr>
-            <w:tcW w:w="2156" w:type="dxa"/>
-            <w:shd w:val="clear" w:color="auto" w:fill="FFFFFF"/>
-          </w:tcPr>
-          <w:p>
-            <w:proofErr w:type="gramStart"/>
-            <w:r>
-              <w:rPr>
-                <w:rFonts w:ascii="Arial Narrow" w:hAnsi="Arial Narrow" w:cs="Arial"/>
-                <w:bCs/>
-                <w:sz w:val="22"/>
-                <w:szCs w:val="22"/>
-                <w:lang w:val="es-CO"/>
-              </w:rPr>
-              <w:t>{{ eq</w:t>
-            </w:r>
-            <w:proofErr w:type="gramEnd"/>
-            <w:r>
-              <w:rPr>
-                <w:rFonts w:ascii="Arial Narrow" w:hAnsi="Arial Narrow" w:cs="Arial"/>
-                <w:bCs/>
-                <w:sz w:val="22"/>
-                <w:szCs w:val="22"/>
-                <w:lang w:val="es-CO"/>
-              </w:rPr>
-              <w:t>_</w:t>
-            </w:r>
-            <w:r>
-              <w:rPr>
-                <w:rFonts w:ascii="Arial Narrow" w:hAnsi="Arial Narrow" w:cs="Arial"/>
-                <w:bCs/>
-                <w:sz w:val="22"/>
-                <w:szCs w:val="22"/>
-                <w:lang w:val="es-CO"/>
-              </w:rPr>
-              <w:t>4</w:t>
-            </w:r>
-            <w:r>
-              <w:rPr>
-                <w:rFonts w:ascii="Arial Narrow" w:hAnsi="Arial Narrow" w:cs="Arial"/>
-                <w:bCs/>
-                <w:sz w:val="22"/>
-                <w:szCs w:val="22"/>
-                <w:lang w:val="es-CO"/>
-              </w:rPr>
-              <w:t>_marca }}</w:t>
-            </w:r>
-          </w:p>
-        </w:tc>
-        <w:tc>
-          <w:tcPr>
-            <w:tcW w:w="2239" w:type="dxa"/>
-            <w:shd w:val="clear" w:color="auto" w:fill="FFFFFF"/>
-          </w:tcPr>
-          <w:p>
-            <w:proofErr w:type="gramStart"/>
-            <w:r>
-              <w:rPr>
-                <w:rFonts w:ascii="Arial Narrow" w:hAnsi="Arial Narrow" w:cs="Arial"/>
-                <w:bCs/>
-                <w:sz w:val="22"/>
-                <w:szCs w:val="22"/>
-                <w:lang w:val="es-CO"/>
-              </w:rPr>
-              <w:t>{{ eq</w:t>
-            </w:r>
-            <w:proofErr w:type="gramEnd"/>
-            <w:r>
-              <w:rPr>
-                <w:rFonts w:ascii="Arial Narrow" w:hAnsi="Arial Narrow" w:cs="Arial"/>
-                <w:bCs/>
-                <w:sz w:val="22"/>
-                <w:szCs w:val="22"/>
-                <w:lang w:val="es-CO"/>
-              </w:rPr>
-              <w:t>_</w:t>
-            </w:r>
-            <w:r>
-              <w:rPr>
-                <w:rFonts w:ascii="Arial Narrow" w:hAnsi="Arial Narrow" w:cs="Arial"/>
-                <w:bCs/>
-                <w:sz w:val="22"/>
-                <w:szCs w:val="22"/>
-                <w:lang w:val="es-CO"/>
-              </w:rPr>
-              <w:t>4</w:t>
-            </w:r>
-            <w:r>
-              <w:rPr>
-                <w:rFonts w:ascii="Arial Narrow" w:hAnsi="Arial Narrow" w:cs="Arial"/>
-                <w:bCs/>
-                <w:sz w:val="22"/>
-                <w:szCs w:val="22"/>
-                <w:lang w:val="es-CO"/>
-              </w:rPr>
-              <w:t>_tipo }}</w:t>
-            </w:r>
-          </w:p>
-        </w:tc>
-        <w:tc>
-          <w:tcPr>
-            <w:tcW w:w="2127" w:type="dxa"/>
-            <w:shd w:val="clear" w:color="auto" w:fill="FFFFFF"/>
-          </w:tcPr>
-          <w:p>
-            <w:proofErr w:type="gramStart"/>
-            <w:r>
-              <w:rPr>
-                <w:rFonts w:ascii="Arial Narrow" w:hAnsi="Arial Narrow" w:cs="Arial"/>
-                <w:bCs/>
-                <w:sz w:val="22"/>
-                <w:szCs w:val="22"/>
-                <w:lang w:val="es-CO"/>
-              </w:rPr>
-              <w:t>{{ eq</w:t>
-            </w:r>
-            <w:proofErr w:type="gramEnd"/>
-            <w:r>
-              <w:rPr>
-                <w:rFonts w:ascii="Arial Narrow" w:hAnsi="Arial Narrow" w:cs="Arial"/>
-                <w:bCs/>
-                <w:sz w:val="22"/>
-                <w:szCs w:val="22"/>
-                <w:lang w:val="es-CO"/>
-              </w:rPr>
-              <w:t>_</w:t>
-            </w:r>
-            <w:r>
-              <w:rPr>
-                <w:rFonts w:ascii="Arial Narrow" w:hAnsi="Arial Narrow" w:cs="Arial"/>
-                <w:bCs/>
-                <w:sz w:val="22"/>
-                <w:szCs w:val="22"/>
-                <w:lang w:val="es-CO"/>
-              </w:rPr>
-              <w:t>4</w:t>
-            </w:r>
-            <w:r>
-              <w:rPr>
-                <w:rFonts w:ascii="Arial Narrow" w:hAnsi="Arial Narrow" w:cs="Arial"/>
-                <w:bCs/>
-                <w:sz w:val="22"/>
-                <w:szCs w:val="22"/>
-                <w:lang w:val="es-CO"/>
-              </w:rPr>
-              <w:t>_modelo }}</w:t>
-            </w:r>
-          </w:p>
-        </w:tc>
-        <w:tc>
-          <w:tcPr>
-            <w:tcW w:w="2350" w:type="dxa"/>
-            <w:shd w:val="clear" w:color="auto" w:fill="FFFFFF"/>
-          </w:tcPr>
-          <w:p>
-            <w:proofErr w:type="gramStart"/>
-            <w:r>
-              <w:rPr>
-                <w:rFonts w:ascii="Arial Narrow" w:hAnsi="Arial Narrow" w:cs="Arial"/>
-                <w:bCs/>
-                <w:sz w:val="22"/>
-                <w:szCs w:val="22"/>
-                <w:lang w:val="es-CO"/>
-              </w:rPr>
-              <w:t>{{ eq</w:t>
-            </w:r>
-            <w:proofErr w:type="gramEnd"/>
-            <w:r>
-              <w:rPr>
-                <w:rFonts w:ascii="Arial Narrow" w:hAnsi="Arial Narrow" w:cs="Arial"/>
-                <w:bCs/>
-                <w:sz w:val="22"/>
-                <w:szCs w:val="22"/>
-                <w:lang w:val="es-CO"/>
-              </w:rPr>
-              <w:t>_</w:t>
-            </w:r>
-            <w:r>
-              <w:rPr>
-                <w:rFonts w:ascii="Arial Narrow" w:hAnsi="Arial Narrow" w:cs="Arial"/>
-                <w:bCs/>
-                <w:sz w:val="22"/>
-                <w:szCs w:val="22"/>
-                <w:lang w:val="es-CO"/>
-              </w:rPr>
-              <w:t>4</w:t>
-            </w:r>
-            <w:r>
-              <w:rPr>
-                <w:rFonts w:ascii="Arial Narrow" w:hAnsi="Arial Narrow" w:cs="Arial"/>
-                <w:bCs/>
-                <w:sz w:val="22"/>
-                <w:szCs w:val="22"/>
-                <w:lang w:val="es-CO"/>
-              </w:rPr>
-              <w:t>_serial }}</w:t>
-            </w:r>
-          </w:p>
-        </w:tc>
-        <w:tc>
-          <w:tcPr>
-            <w:tcW w:w="1619" w:type="dxa"/>
-            <w:shd w:val="clear" w:color="auto" w:fill="FFFFFF"/>
-          </w:tcPr>
-          <w:p>
-            <w:proofErr w:type="gramStart"/>
-            <w:r>
-              <w:rPr>
-                <w:rFonts w:ascii="Arial Narrow" w:hAnsi="Arial Narrow" w:cs="Arial"/>
-                <w:bCs/>
-                <w:sz w:val="22"/>
-                <w:szCs w:val="22"/>
-                <w:lang w:val="es-CO"/>
-              </w:rPr>
-              <w:t>{</w:t>
-            </w:r>
-            <w:r>
-              <w:rPr>
-                <w:rFonts w:ascii="Arial Narrow" w:hAnsi="Arial Narrow" w:cs="Arial"/>
-                <w:bCs/>
-                <w:sz w:val="22"/>
-                <w:szCs w:val="22"/>
-                <w:lang w:val="es-CO"/>
-              </w:rPr>
-              <w:t xml:space="preserve">{ </w:t>
-            </w:r>
-            <w:r>
-              <w:rPr>
-                <w:rFonts w:ascii="Arial Narrow" w:hAnsi="Arial Narrow" w:cs="Arial"/>
-                <w:bCs/>
-                <w:sz w:val="22"/>
-                <w:szCs w:val="22"/>
-                <w:lang w:val="es-CO"/>
-              </w:rPr>
-              <w:t>eq</w:t>
-            </w:r>
-            <w:proofErr w:type="gramEnd"/>
-            <w:r>
-              <w:rPr>
-                <w:rFonts w:ascii="Arial Narrow" w:hAnsi="Arial Narrow" w:cs="Arial"/>
-                <w:bCs/>
-                <w:sz w:val="22"/>
-                <w:szCs w:val="22"/>
-                <w:lang w:val="es-CO"/>
-              </w:rPr>
-              <w:t>_</w:t>
-            </w:r>
-            <w:r>
-              <w:rPr>
-                <w:rFonts w:ascii="Arial Narrow" w:hAnsi="Arial Narrow" w:cs="Arial"/>
-                <w:bCs/>
-                <w:sz w:val="22"/>
-                <w:szCs w:val="22"/>
-                <w:lang w:val="es-CO"/>
-              </w:rPr>
-              <w:t>4</w:t>
             </w:r>
             <w:r>
               <w:rPr>
@@ -2531,25 +1999,14 @@
             </w:pPr>
             <w:bookmarkStart w:id="12" w:name="OLE_LINK1"/>
             <w:bookmarkStart w:id="13" w:name="OLE_LINK4"/>
-            <w:proofErr w:type="gramStart"/>
-            <w:r>
-              <w:rPr>
-                <w:rFonts w:ascii="Arial Narrow" w:hAnsi="Arial Narrow"/>
-                <w:sz w:val="22"/>
-                <w:szCs w:val="22"/>
-                <w:lang w:val="es-CO"/>
-              </w:rPr>
-              <w:t>{{ hw</w:t>
-            </w:r>
-            <w:proofErr w:type="gramEnd"/>
-            <w:r>
-              <w:rPr>
-                <w:rFonts w:ascii="Arial Narrow" w:hAnsi="Arial Narrow"/>
-                <w:sz w:val="22"/>
-                <w:szCs w:val="22"/>
-                <w:lang w:val="es-CO"/>
-              </w:rPr>
-              <w:t>_1_tipo }}</w:t>
+            <w:r>
+              <w:rPr>
+                <w:rFonts w:ascii="Arial Narrow" w:hAnsi="Arial Narrow"/>
+                <w:sz w:val="22"/>
+                <w:szCs w:val="22"/>
+                <w:lang w:val="es-CO"/>
+              </w:rPr>
+              <w:t>{{ hw_1_tipo }}</w:t>
             </w:r>
             <w:bookmarkEnd w:id="12"/>
           </w:p>
@@ -2568,25 +2025,14 @@
                 <w:lang w:val="es-CO"/>
               </w:rPr>
             </w:pPr>
-            <w:proofErr w:type="gramStart"/>
-            <w:r>
-              <w:rPr>
-                <w:rFonts w:ascii="Arial Narrow" w:hAnsi="Arial Narrow"/>
-                <w:sz w:val="22"/>
-                <w:szCs w:val="22"/>
-                <w:lang w:val="es-CO"/>
-              </w:rPr>
-              <w:t>{{ hw</w:t>
-            </w:r>
-            <w:proofErr w:type="gramEnd"/>
-            <w:r>
-              <w:rPr>
-                <w:rFonts w:ascii="Arial Narrow" w:hAnsi="Arial Narrow"/>
-                <w:sz w:val="22"/>
-                <w:szCs w:val="22"/>
-                <w:lang w:val="es-CO"/>
-              </w:rPr>
-              <w:t>_1_descripcion }}</w:t>
+            <w:r>
+              <w:rPr>
+                <w:rFonts w:ascii="Arial Narrow" w:hAnsi="Arial Narrow"/>
+                <w:sz w:val="22"/>
+                <w:szCs w:val="22"/>
+                <w:lang w:val="es-CO"/>
+              </w:rPr>
+              <w:t>{{ hw_1_descripcion }}</w:t>
             </w:r>
           </w:p>
         </w:tc>
@@ -2604,25 +2050,14 @@
                 <w:lang w:val="es-CO"/>
               </w:rPr>
             </w:pPr>
-            <w:proofErr w:type="gramStart"/>
-            <w:r>
-              <w:rPr>
-                <w:rFonts w:ascii="Arial Narrow" w:hAnsi="Arial Narrow"/>
-                <w:sz w:val="22"/>
-                <w:szCs w:val="22"/>
-                <w:lang w:val="es-CO"/>
-              </w:rPr>
-              <w:t>{{ hw</w:t>
-            </w:r>
-            <w:proofErr w:type="gramEnd"/>
-            <w:r>
-              <w:rPr>
-                <w:rFonts w:ascii="Arial Narrow" w:hAnsi="Arial Narrow"/>
-                <w:sz w:val="22"/>
-                <w:szCs w:val="22"/>
-                <w:lang w:val="es-CO"/>
-              </w:rPr>
-              <w:t>_1_programa }}</w:t>
+            <w:r>
+              <w:rPr>
+                <w:rFonts w:ascii="Arial Narrow" w:hAnsi="Arial Narrow"/>
+                <w:sz w:val="22"/>
+                <w:szCs w:val="22"/>
+                <w:lang w:val="es-CO"/>
+              </w:rPr>
+              <w:t>{{ hw_1_programa }}</w:t>
             </w:r>
           </w:p>
         </w:tc>
@@ -2642,25 +2077,14 @@
                 <w:szCs w:val="22"/>
               </w:rPr>
             </w:pPr>
-            <w:proofErr w:type="gramStart"/>
-            <w:r>
-              <w:rPr>
-                <w:rFonts w:ascii="Arial Narrow" w:hAnsi="Arial Narrow"/>
-                <w:sz w:val="22"/>
-                <w:szCs w:val="22"/>
-                <w:lang w:val="es-CO"/>
-              </w:rPr>
-              <w:t>{{ hw</w:t>
-            </w:r>
-            <w:proofErr w:type="gramEnd"/>
-            <w:r>
-              <w:rPr>
-                <w:rFonts w:ascii="Arial Narrow" w:hAnsi="Arial Narrow"/>
-                <w:sz w:val="22"/>
-                <w:szCs w:val="22"/>
-                <w:lang w:val="es-CO"/>
-              </w:rPr>
-              <w:t>_</w:t>
+            <w:r>
+              <w:rPr>
+                <w:rFonts w:ascii="Arial Narrow" w:hAnsi="Arial Narrow"/>
+                <w:sz w:val="22"/>
+                <w:szCs w:val="22"/>
+                <w:lang w:val="es-CO"/>
+              </w:rPr>
+              <w:t>{{ hw_</w:t>
             </w:r>
             <w:r>
               <w:rPr>
@@ -2695,25 +2119,14 @@
                 <w:szCs w:val="22"/>
               </w:rPr>
             </w:pPr>
-            <w:proofErr w:type="gramStart"/>
-            <w:r>
-              <w:rPr>
-                <w:rFonts w:ascii="Arial Narrow" w:hAnsi="Arial Narrow"/>
-                <w:sz w:val="22"/>
-                <w:szCs w:val="22"/>
-                <w:lang w:val="es-CO"/>
-              </w:rPr>
-              <w:t>{{ hw</w:t>
-            </w:r>
-            <w:proofErr w:type="gramEnd"/>
-            <w:r>
-              <w:rPr>
-                <w:rFonts w:ascii="Arial Narrow" w:hAnsi="Arial Narrow"/>
-                <w:sz w:val="22"/>
-                <w:szCs w:val="22"/>
-                <w:lang w:val="es-CO"/>
-              </w:rPr>
-              <w:t>_</w:t>
+            <w:r>
+              <w:rPr>
+                <w:rFonts w:ascii="Arial Narrow" w:hAnsi="Arial Narrow"/>
+                <w:sz w:val="22"/>
+                <w:szCs w:val="22"/>
+                <w:lang w:val="es-CO"/>
+              </w:rPr>
+              <w:t>{{ hw_</w:t>
             </w:r>
             <w:r>
               <w:rPr>
@@ -2748,25 +2161,14 @@
                 <w:szCs w:val="22"/>
               </w:rPr>
             </w:pPr>
-            <w:proofErr w:type="gramStart"/>
-            <w:r>
-              <w:rPr>
-                <w:rFonts w:ascii="Arial Narrow" w:hAnsi="Arial Narrow"/>
-                <w:sz w:val="22"/>
-                <w:szCs w:val="22"/>
-                <w:lang w:val="es-CO"/>
-              </w:rPr>
-              <w:t>{{ hw</w:t>
-            </w:r>
-            <w:proofErr w:type="gramEnd"/>
-            <w:r>
-              <w:rPr>
-                <w:rFonts w:ascii="Arial Narrow" w:hAnsi="Arial Narrow"/>
-                <w:sz w:val="22"/>
-                <w:szCs w:val="22"/>
-                <w:lang w:val="es-CO"/>
-              </w:rPr>
-              <w:t>_</w:t>
+            <w:r>
+              <w:rPr>
+                <w:rFonts w:ascii="Arial Narrow" w:hAnsi="Arial Narrow"/>
+                <w:sz w:val="22"/>
+                <w:szCs w:val="22"/>
+                <w:lang w:val="es-CO"/>
+              </w:rPr>
+              <w:t>{{ hw_</w:t>
             </w:r>
             <w:r>
               <w:rPr>
@@ -2803,25 +2205,14 @@
                 <w:szCs w:val="22"/>
               </w:rPr>
             </w:pPr>
-            <w:proofErr w:type="gramStart"/>
-            <w:r>
-              <w:rPr>
-                <w:rFonts w:ascii="Arial Narrow" w:hAnsi="Arial Narrow"/>
-                <w:sz w:val="22"/>
-                <w:szCs w:val="22"/>
-                <w:lang w:val="es-CO"/>
-              </w:rPr>
-              <w:t>{{ hw</w:t>
-            </w:r>
-            <w:proofErr w:type="gramEnd"/>
-            <w:r>
-              <w:rPr>
-                <w:rFonts w:ascii="Arial Narrow" w:hAnsi="Arial Narrow"/>
-                <w:sz w:val="22"/>
-                <w:szCs w:val="22"/>
-                <w:lang w:val="es-CO"/>
-              </w:rPr>
-              <w:t>_</w:t>
+            <w:r>
+              <w:rPr>
+                <w:rFonts w:ascii="Arial Narrow" w:hAnsi="Arial Narrow"/>
+                <w:sz w:val="22"/>
+                <w:szCs w:val="22"/>
+                <w:lang w:val="es-CO"/>
+              </w:rPr>
+              <w:t>{{ hw_</w:t>
             </w:r>
             <w:r>
               <w:rPr>
@@ -2856,25 +2247,14 @@
                 <w:szCs w:val="22"/>
               </w:rPr>
             </w:pPr>
-            <w:proofErr w:type="gramStart"/>
-            <w:r>
-              <w:rPr>
-                <w:rFonts w:ascii="Arial Narrow" w:hAnsi="Arial Narrow"/>
-                <w:sz w:val="22"/>
-                <w:szCs w:val="22"/>
-                <w:lang w:val="es-CO"/>
-              </w:rPr>
-              <w:t>{{ hw</w:t>
-            </w:r>
-            <w:proofErr w:type="gramEnd"/>
-            <w:r>
-              <w:rPr>
-                <w:rFonts w:ascii="Arial Narrow" w:hAnsi="Arial Narrow"/>
-                <w:sz w:val="22"/>
-                <w:szCs w:val="22"/>
-                <w:lang w:val="es-CO"/>
-              </w:rPr>
-              <w:t>_</w:t>
+            <w:r>
+              <w:rPr>
+                <w:rFonts w:ascii="Arial Narrow" w:hAnsi="Arial Narrow"/>
+                <w:sz w:val="22"/>
+                <w:szCs w:val="22"/>
+                <w:lang w:val="es-CO"/>
+              </w:rPr>
+              <w:t>{{ hw_</w:t>
             </w:r>
             <w:r>
               <w:rPr>
@@ -2909,25 +2289,14 @@
                 <w:szCs w:val="22"/>
               </w:rPr>
             </w:pPr>
-            <w:proofErr w:type="gramStart"/>
-            <w:r>
-              <w:rPr>
-                <w:rFonts w:ascii="Arial Narrow" w:hAnsi="Arial Narrow"/>
-                <w:sz w:val="22"/>
-                <w:szCs w:val="22"/>
-                <w:lang w:val="es-CO"/>
-              </w:rPr>
-              <w:t>{{ hw</w:t>
-            </w:r>
-            <w:proofErr w:type="gramEnd"/>
-            <w:r>
-              <w:rPr>
-                <w:rFonts w:ascii="Arial Narrow" w:hAnsi="Arial Narrow"/>
-                <w:sz w:val="22"/>
-                <w:szCs w:val="22"/>
-                <w:lang w:val="es-CO"/>
-              </w:rPr>
-              <w:t>_</w:t>
+            <w:r>
+              <w:rPr>
+                <w:rFonts w:ascii="Arial Narrow" w:hAnsi="Arial Narrow"/>
+                <w:sz w:val="22"/>
+                <w:szCs w:val="22"/>
+                <w:lang w:val="es-CO"/>
+              </w:rPr>
+              <w:t>{{ hw_</w:t>
             </w:r>
             <w:r>
               <w:rPr>
@@ -2964,25 +2333,14 @@
                 <w:szCs w:val="22"/>
               </w:rPr>
             </w:pPr>
-            <w:proofErr w:type="gramStart"/>
-            <w:r>
-              <w:rPr>
-                <w:rFonts w:ascii="Arial Narrow" w:hAnsi="Arial Narrow"/>
-                <w:sz w:val="22"/>
-                <w:szCs w:val="22"/>
-                <w:lang w:val="es-CO"/>
-              </w:rPr>
-              <w:t>{{ hw</w:t>
-            </w:r>
-            <w:proofErr w:type="gramEnd"/>
-            <w:r>
-              <w:rPr>
-                <w:rFonts w:ascii="Arial Narrow" w:hAnsi="Arial Narrow"/>
-                <w:sz w:val="22"/>
-                <w:szCs w:val="22"/>
-                <w:lang w:val="es-CO"/>
-              </w:rPr>
-              <w:t>_</w:t>
+            <w:r>
+              <w:rPr>
+                <w:rFonts w:ascii="Arial Narrow" w:hAnsi="Arial Narrow"/>
+                <w:sz w:val="22"/>
+                <w:szCs w:val="22"/>
+                <w:lang w:val="es-CO"/>
+              </w:rPr>
+              <w:t>{{ hw_</w:t>
             </w:r>
             <w:r>
               <w:rPr>
@@ -3017,25 +2375,14 @@
                 <w:szCs w:val="22"/>
               </w:rPr>
             </w:pPr>
-            <w:proofErr w:type="gramStart"/>
-            <w:r>
-              <w:rPr>
-                <w:rFonts w:ascii="Arial Narrow" w:hAnsi="Arial Narrow"/>
-                <w:sz w:val="22"/>
-                <w:szCs w:val="22"/>
-                <w:lang w:val="es-CO"/>
-              </w:rPr>
-              <w:t>{{ hw</w:t>
-            </w:r>
-            <w:proofErr w:type="gramEnd"/>
-            <w:r>
-              <w:rPr>
-                <w:rFonts w:ascii="Arial Narrow" w:hAnsi="Arial Narrow"/>
-                <w:sz w:val="22"/>
-                <w:szCs w:val="22"/>
-                <w:lang w:val="es-CO"/>
-              </w:rPr>
-              <w:t>_</w:t>
+            <w:r>
+              <w:rPr>
+                <w:rFonts w:ascii="Arial Narrow" w:hAnsi="Arial Narrow"/>
+                <w:sz w:val="22"/>
+                <w:szCs w:val="22"/>
+                <w:lang w:val="es-CO"/>
+              </w:rPr>
+              <w:t>{{ hw_</w:t>
             </w:r>
             <w:r>
               <w:rPr>
@@ -3070,25 +2417,14 @@
                 <w:szCs w:val="22"/>
               </w:rPr>
             </w:pPr>
-            <w:proofErr w:type="gramStart"/>
-            <w:r>
-              <w:rPr>
-                <w:rFonts w:ascii="Arial Narrow" w:hAnsi="Arial Narrow"/>
-                <w:sz w:val="22"/>
-                <w:szCs w:val="22"/>
-                <w:lang w:val="es-CO"/>
-              </w:rPr>
-              <w:t>{{ hw</w:t>
-            </w:r>
-            <w:proofErr w:type="gramEnd"/>
-            <w:r>
-              <w:rPr>
-                <w:rFonts w:ascii="Arial Narrow" w:hAnsi="Arial Narrow"/>
-                <w:sz w:val="22"/>
-                <w:szCs w:val="22"/>
-                <w:lang w:val="es-CO"/>
-              </w:rPr>
-              <w:t>_</w:t>
+            <w:r>
+              <w:rPr>
+                <w:rFonts w:ascii="Arial Narrow" w:hAnsi="Arial Narrow"/>
+                <w:sz w:val="22"/>
+                <w:szCs w:val="22"/>
+                <w:lang w:val="es-CO"/>
+              </w:rPr>
+              <w:t>{{ hw_</w:t>
             </w:r>
             <w:r>
               <w:rPr>
@@ -3125,25 +2461,14 @@
                 <w:szCs w:val="22"/>
               </w:rPr>
             </w:pPr>
-            <w:proofErr w:type="gramStart"/>
-            <w:r>
-              <w:rPr>
-                <w:rFonts w:ascii="Arial Narrow" w:hAnsi="Arial Narrow"/>
-                <w:sz w:val="22"/>
-                <w:szCs w:val="22"/>
-                <w:lang w:val="es-CO"/>
-              </w:rPr>
-              <w:t>{{ hw</w:t>
-            </w:r>
-            <w:proofErr w:type="gramEnd"/>
-            <w:r>
-              <w:rPr>
-                <w:rFonts w:ascii="Arial Narrow" w:hAnsi="Arial Narrow"/>
-                <w:sz w:val="22"/>
-                <w:szCs w:val="22"/>
-                <w:lang w:val="es-CO"/>
-              </w:rPr>
-              <w:t>_</w:t>
+            <w:r>
+              <w:rPr>
+                <w:rFonts w:ascii="Arial Narrow" w:hAnsi="Arial Narrow"/>
+                <w:sz w:val="22"/>
+                <w:szCs w:val="22"/>
+                <w:lang w:val="es-CO"/>
+              </w:rPr>
+              <w:t>{{ hw_</w:t>
             </w:r>
             <w:r>
               <w:rPr>
@@ -3178,25 +2503,14 @@
                 <w:szCs w:val="22"/>
               </w:rPr>
             </w:pPr>
-            <w:proofErr w:type="gramStart"/>
-            <w:r>
-              <w:rPr>
-                <w:rFonts w:ascii="Arial Narrow" w:hAnsi="Arial Narrow"/>
-                <w:sz w:val="22"/>
-                <w:szCs w:val="22"/>
-                <w:lang w:val="es-CO"/>
-              </w:rPr>
-              <w:t>{{ hw</w:t>
-            </w:r>
-            <w:proofErr w:type="gramEnd"/>
-            <w:r>
-              <w:rPr>
-                <w:rFonts w:ascii="Arial Narrow" w:hAnsi="Arial Narrow"/>
-                <w:sz w:val="22"/>
-                <w:szCs w:val="22"/>
-                <w:lang w:val="es-CO"/>
-              </w:rPr>
-              <w:t>_</w:t>
+            <w:r>
+              <w:rPr>
+                <w:rFonts w:ascii="Arial Narrow" w:hAnsi="Arial Narrow"/>
+                <w:sz w:val="22"/>
+                <w:szCs w:val="22"/>
+                <w:lang w:val="es-CO"/>
+              </w:rPr>
+              <w:t>{{ hw_</w:t>
             </w:r>
             <w:r>
               <w:rPr>
@@ -3231,25 +2545,14 @@
                 <w:szCs w:val="22"/>
               </w:rPr>
             </w:pPr>
-            <w:proofErr w:type="gramStart"/>
-            <w:r>
-              <w:rPr>
-                <w:rFonts w:ascii="Arial Narrow" w:hAnsi="Arial Narrow"/>
-                <w:sz w:val="22"/>
-                <w:szCs w:val="22"/>
-                <w:lang w:val="es-CO"/>
-              </w:rPr>
-              <w:t>{{ hw</w:t>
-            </w:r>
-            <w:proofErr w:type="gramEnd"/>
-            <w:r>
-              <w:rPr>
-                <w:rFonts w:ascii="Arial Narrow" w:hAnsi="Arial Narrow"/>
-                <w:sz w:val="22"/>
-                <w:szCs w:val="22"/>
-                <w:lang w:val="es-CO"/>
-              </w:rPr>
-              <w:t>_</w:t>
+            <w:r>
+              <w:rPr>
+                <w:rFonts w:ascii="Arial Narrow" w:hAnsi="Arial Narrow"/>
+                <w:sz w:val="22"/>
+                <w:szCs w:val="22"/>
+                <w:lang w:val="es-CO"/>
+              </w:rPr>
+              <w:t>{{ hw_</w:t>
             </w:r>
             <w:r>
               <w:rPr>
@@ -3286,25 +2589,14 @@
                 <w:szCs w:val="22"/>
               </w:rPr>
             </w:pPr>
-            <w:proofErr w:type="gramStart"/>
-            <w:r>
-              <w:rPr>
-                <w:rFonts w:ascii="Arial Narrow" w:hAnsi="Arial Narrow"/>
-                <w:sz w:val="22"/>
-                <w:szCs w:val="22"/>
-                <w:lang w:val="es-CO"/>
-              </w:rPr>
-              <w:t>{{ hw</w:t>
-            </w:r>
-            <w:proofErr w:type="gramEnd"/>
-            <w:r>
-              <w:rPr>
-                <w:rFonts w:ascii="Arial Narrow" w:hAnsi="Arial Narrow"/>
-                <w:sz w:val="22"/>
-                <w:szCs w:val="22"/>
-                <w:lang w:val="es-CO"/>
-              </w:rPr>
-              <w:t>_</w:t>
+            <w:r>
+              <w:rPr>
+                <w:rFonts w:ascii="Arial Narrow" w:hAnsi="Arial Narrow"/>
+                <w:sz w:val="22"/>
+                <w:szCs w:val="22"/>
+                <w:lang w:val="es-CO"/>
+              </w:rPr>
+              <w:t>{{ hw_</w:t>
             </w:r>
             <w:r>
               <w:rPr>
@@ -3339,25 +2631,14 @@
                 <w:szCs w:val="22"/>
               </w:rPr>
             </w:pPr>
-            <w:proofErr w:type="gramStart"/>
-            <w:r>
-              <w:rPr>
-                <w:rFonts w:ascii="Arial Narrow" w:hAnsi="Arial Narrow"/>
-                <w:sz w:val="22"/>
-                <w:szCs w:val="22"/>
-                <w:lang w:val="es-CO"/>
-              </w:rPr>
-              <w:t>{{ hw</w:t>
-            </w:r>
-            <w:proofErr w:type="gramEnd"/>
-            <w:r>
-              <w:rPr>
-                <w:rFonts w:ascii="Arial Narrow" w:hAnsi="Arial Narrow"/>
-                <w:sz w:val="22"/>
-                <w:szCs w:val="22"/>
-                <w:lang w:val="es-CO"/>
-              </w:rPr>
-              <w:t>_</w:t>
+            <w:r>
+              <w:rPr>
+                <w:rFonts w:ascii="Arial Narrow" w:hAnsi="Arial Narrow"/>
+                <w:sz w:val="22"/>
+                <w:szCs w:val="22"/>
+                <w:lang w:val="es-CO"/>
+              </w:rPr>
+              <w:t>{{ hw_</w:t>
             </w:r>
             <w:r>
               <w:rPr>
@@ -3392,25 +2673,14 @@
                 <w:szCs w:val="22"/>
               </w:rPr>
             </w:pPr>
-            <w:proofErr w:type="gramStart"/>
-            <w:r>
-              <w:rPr>
-                <w:rFonts w:ascii="Arial Narrow" w:hAnsi="Arial Narrow"/>
-                <w:sz w:val="22"/>
-                <w:szCs w:val="22"/>
-                <w:lang w:val="es-CO"/>
-              </w:rPr>
-              <w:t>{{ hw</w:t>
-            </w:r>
-            <w:proofErr w:type="gramEnd"/>
-            <w:r>
-              <w:rPr>
-                <w:rFonts w:ascii="Arial Narrow" w:hAnsi="Arial Narrow"/>
-                <w:sz w:val="22"/>
-                <w:szCs w:val="22"/>
-                <w:lang w:val="es-CO"/>
-              </w:rPr>
-              <w:t>_</w:t>
+            <w:r>
+              <w:rPr>
+                <w:rFonts w:ascii="Arial Narrow" w:hAnsi="Arial Narrow"/>
+                <w:sz w:val="22"/>
+                <w:szCs w:val="22"/>
+                <w:lang w:val="es-CO"/>
+              </w:rPr>
+              <w:t>{{ hw_</w:t>
             </w:r>
             <w:r>
               <w:rPr>
@@ -3447,25 +2717,14 @@
                 <w:szCs w:val="22"/>
               </w:rPr>
             </w:pPr>
-            <w:proofErr w:type="gramStart"/>
-            <w:r>
-              <w:rPr>
-                <w:rFonts w:ascii="Arial Narrow" w:hAnsi="Arial Narrow"/>
-                <w:sz w:val="22"/>
-                <w:szCs w:val="22"/>
-                <w:lang w:val="es-CO"/>
-              </w:rPr>
-              <w:t>{{ hw</w:t>
-            </w:r>
-            <w:proofErr w:type="gramEnd"/>
-            <w:r>
-              <w:rPr>
-                <w:rFonts w:ascii="Arial Narrow" w:hAnsi="Arial Narrow"/>
-                <w:sz w:val="22"/>
-                <w:szCs w:val="22"/>
-                <w:lang w:val="es-CO"/>
-              </w:rPr>
-              <w:t>_</w:t>
+            <w:r>
+              <w:rPr>
+                <w:rFonts w:ascii="Arial Narrow" w:hAnsi="Arial Narrow"/>
+                <w:sz w:val="22"/>
+                <w:szCs w:val="22"/>
+                <w:lang w:val="es-CO"/>
+              </w:rPr>
+              <w:t>{{ hw_</w:t>
             </w:r>
             <w:r>
               <w:rPr>
@@ -3500,25 +2759,14 @@
                 <w:szCs w:val="22"/>
               </w:rPr>
             </w:pPr>
-            <w:proofErr w:type="gramStart"/>
-            <w:r>
-              <w:rPr>
-                <w:rFonts w:ascii="Arial Narrow" w:hAnsi="Arial Narrow"/>
-                <w:sz w:val="22"/>
-                <w:szCs w:val="22"/>
-                <w:lang w:val="es-CO"/>
-              </w:rPr>
-              <w:t>{{ hw</w:t>
-            </w:r>
-            <w:proofErr w:type="gramEnd"/>
-            <w:r>
-              <w:rPr>
-                <w:rFonts w:ascii="Arial Narrow" w:hAnsi="Arial Narrow"/>
-                <w:sz w:val="22"/>
-                <w:szCs w:val="22"/>
-                <w:lang w:val="es-CO"/>
-              </w:rPr>
-              <w:t>_</w:t>
+            <w:r>
+              <w:rPr>
+                <w:rFonts w:ascii="Arial Narrow" w:hAnsi="Arial Narrow"/>
+                <w:sz w:val="22"/>
+                <w:szCs w:val="22"/>
+                <w:lang w:val="es-CO"/>
+              </w:rPr>
+              <w:t>{{ hw_</w:t>
             </w:r>
             <w:r>
               <w:rPr>
@@ -3553,25 +2801,14 @@
                 <w:szCs w:val="22"/>
               </w:rPr>
             </w:pPr>
-            <w:proofErr w:type="gramStart"/>
-            <w:r>
-              <w:rPr>
-                <w:rFonts w:ascii="Arial Narrow" w:hAnsi="Arial Narrow"/>
-                <w:sz w:val="22"/>
-                <w:szCs w:val="22"/>
-                <w:lang w:val="es-CO"/>
-              </w:rPr>
-              <w:t>{{ hw</w:t>
-            </w:r>
-            <w:proofErr w:type="gramEnd"/>
-            <w:r>
-              <w:rPr>
-                <w:rFonts w:ascii="Arial Narrow" w:hAnsi="Arial Narrow"/>
-                <w:sz w:val="22"/>
-                <w:szCs w:val="22"/>
-                <w:lang w:val="es-CO"/>
-              </w:rPr>
-              <w:t>_</w:t>
+            <w:r>
+              <w:rPr>
+                <w:rFonts w:ascii="Arial Narrow" w:hAnsi="Arial Narrow"/>
+                <w:sz w:val="22"/>
+                <w:szCs w:val="22"/>
+                <w:lang w:val="es-CO"/>
+              </w:rPr>
+              <w:t>{{ hw_</w:t>
             </w:r>
             <w:r>
               <w:rPr>
@@ -3608,25 +2845,14 @@
                 <w:szCs w:val="22"/>
               </w:rPr>
             </w:pPr>
-            <w:proofErr w:type="gramStart"/>
-            <w:r>
-              <w:rPr>
-                <w:rFonts w:ascii="Arial Narrow" w:hAnsi="Arial Narrow"/>
-                <w:sz w:val="22"/>
-                <w:szCs w:val="22"/>
-                <w:lang w:val="es-CO"/>
-              </w:rPr>
-              <w:t>{{ hw</w:t>
-            </w:r>
-            <w:proofErr w:type="gramEnd"/>
-            <w:r>
-              <w:rPr>
-                <w:rFonts w:ascii="Arial Narrow" w:hAnsi="Arial Narrow"/>
-                <w:sz w:val="22"/>
-                <w:szCs w:val="22"/>
-                <w:lang w:val="es-CO"/>
-              </w:rPr>
-              <w:t>_</w:t>
+            <w:r>
+              <w:rPr>
+                <w:rFonts w:ascii="Arial Narrow" w:hAnsi="Arial Narrow"/>
+                <w:sz w:val="22"/>
+                <w:szCs w:val="22"/>
+                <w:lang w:val="es-CO"/>
+              </w:rPr>
+              <w:t>{{ hw_</w:t>
             </w:r>
             <w:r>
               <w:rPr>
@@ -3661,25 +2887,14 @@
                 <w:szCs w:val="22"/>
               </w:rPr>
             </w:pPr>
-            <w:proofErr w:type="gramStart"/>
-            <w:r>
-              <w:rPr>
-                <w:rFonts w:ascii="Arial Narrow" w:hAnsi="Arial Narrow"/>
-                <w:sz w:val="22"/>
-                <w:szCs w:val="22"/>
-                <w:lang w:val="es-CO"/>
-              </w:rPr>
-              <w:t>{{ hw</w:t>
-            </w:r>
-            <w:proofErr w:type="gramEnd"/>
-            <w:r>
-              <w:rPr>
-                <w:rFonts w:ascii="Arial Narrow" w:hAnsi="Arial Narrow"/>
-                <w:sz w:val="22"/>
-                <w:szCs w:val="22"/>
-                <w:lang w:val="es-CO"/>
-              </w:rPr>
-              <w:t>_</w:t>
+            <w:r>
+              <w:rPr>
+                <w:rFonts w:ascii="Arial Narrow" w:hAnsi="Arial Narrow"/>
+                <w:sz w:val="22"/>
+                <w:szCs w:val="22"/>
+                <w:lang w:val="es-CO"/>
+              </w:rPr>
+              <w:t>{{ hw_</w:t>
             </w:r>
             <w:r>
               <w:rPr>
@@ -3714,25 +2929,14 @@
                 <w:szCs w:val="22"/>
               </w:rPr>
             </w:pPr>
-            <w:proofErr w:type="gramStart"/>
-            <w:r>
-              <w:rPr>
-                <w:rFonts w:ascii="Arial Narrow" w:hAnsi="Arial Narrow"/>
-                <w:sz w:val="22"/>
-                <w:szCs w:val="22"/>
-                <w:lang w:val="es-CO"/>
-              </w:rPr>
-              <w:t>{{ hw</w:t>
-            </w:r>
-            <w:proofErr w:type="gramEnd"/>
-            <w:r>
-              <w:rPr>
-                <w:rFonts w:ascii="Arial Narrow" w:hAnsi="Arial Narrow"/>
-                <w:sz w:val="22"/>
-                <w:szCs w:val="22"/>
-                <w:lang w:val="es-CO"/>
-              </w:rPr>
-              <w:t>_</w:t>
+            <w:r>
+              <w:rPr>
+                <w:rFonts w:ascii="Arial Narrow" w:hAnsi="Arial Narrow"/>
+                <w:sz w:val="22"/>
+                <w:szCs w:val="22"/>
+                <w:lang w:val="es-CO"/>
+              </w:rPr>
+              <w:t>{{ hw_</w:t>
             </w:r>
             <w:r>
               <w:rPr>
@@ -3756,6 +2960,9 @@
         </w:tc>
       </w:tr>
       <w:tr>
+        <w:trPr>
+          <w:trHeight w:val="109"/>
+        </w:trPr>
         <w:tc>
           <w:tcPr>
             <w:tcW w:w="3190" w:type="dxa"/>
@@ -3769,25 +2976,14 @@
                 <w:szCs w:val="22"/>
               </w:rPr>
             </w:pPr>
-            <w:proofErr w:type="gramStart"/>
-            <w:r>
-              <w:rPr>
-                <w:rFonts w:ascii="Arial Narrow" w:hAnsi="Arial Narrow"/>
-                <w:sz w:val="22"/>
-                <w:szCs w:val="22"/>
-                <w:lang w:val="es-CO"/>
-              </w:rPr>
-              <w:t>{{ hw</w:t>
-            </w:r>
-            <w:proofErr w:type="gramEnd"/>
-            <w:r>
-              <w:rPr>
-                <w:rFonts w:ascii="Arial Narrow" w:hAnsi="Arial Narrow"/>
-                <w:sz w:val="22"/>
-                <w:szCs w:val="22"/>
-                <w:lang w:val="es-CO"/>
-              </w:rPr>
-              <w:t>_</w:t>
+            <w:r>
+              <w:rPr>
+                <w:rFonts w:ascii="Arial Narrow" w:hAnsi="Arial Narrow"/>
+                <w:sz w:val="22"/>
+                <w:szCs w:val="22"/>
+                <w:lang w:val="es-CO"/>
+              </w:rPr>
+              <w:t>{{ hw_</w:t>
             </w:r>
             <w:r>
               <w:rPr>
@@ -3822,25 +3018,14 @@
                 <w:szCs w:val="22"/>
               </w:rPr>
             </w:pPr>
-            <w:proofErr w:type="gramStart"/>
-            <w:r>
-              <w:rPr>
-                <w:rFonts w:ascii="Arial Narrow" w:hAnsi="Arial Narrow"/>
-                <w:sz w:val="22"/>
-                <w:szCs w:val="22"/>
-                <w:lang w:val="es-CO"/>
-              </w:rPr>
-              <w:t>{{ hw</w:t>
-            </w:r>
-            <w:proofErr w:type="gramEnd"/>
-            <w:r>
-              <w:rPr>
-                <w:rFonts w:ascii="Arial Narrow" w:hAnsi="Arial Narrow"/>
-                <w:sz w:val="22"/>
-                <w:szCs w:val="22"/>
-                <w:lang w:val="es-CO"/>
-              </w:rPr>
-              <w:t>_</w:t>
+            <w:r>
+              <w:rPr>
+                <w:rFonts w:ascii="Arial Narrow" w:hAnsi="Arial Narrow"/>
+                <w:sz w:val="22"/>
+                <w:szCs w:val="22"/>
+                <w:lang w:val="es-CO"/>
+              </w:rPr>
+              <w:t>{{ hw_</w:t>
             </w:r>
             <w:r>
               <w:rPr>
@@ -3875,25 +3060,14 @@
                 <w:szCs w:val="22"/>
               </w:rPr>
             </w:pPr>
-            <w:proofErr w:type="gramStart"/>
-            <w:r>
-              <w:rPr>
-                <w:rFonts w:ascii="Arial Narrow" w:hAnsi="Arial Narrow"/>
-                <w:sz w:val="22"/>
-                <w:szCs w:val="22"/>
-                <w:lang w:val="es-CO"/>
-              </w:rPr>
-              <w:t>{{ hw</w:t>
-            </w:r>
-            <w:proofErr w:type="gramEnd"/>
-            <w:r>
-              <w:rPr>
-                <w:rFonts w:ascii="Arial Narrow" w:hAnsi="Arial Narrow"/>
-                <w:sz w:val="22"/>
-                <w:szCs w:val="22"/>
-                <w:lang w:val="es-CO"/>
-              </w:rPr>
-              <w:t>_</w:t>
+            <w:r>
+              <w:rPr>
+                <w:rFonts w:ascii="Arial Narrow" w:hAnsi="Arial Narrow"/>
+                <w:sz w:val="22"/>
+                <w:szCs w:val="22"/>
+                <w:lang w:val="es-CO"/>
+              </w:rPr>
+              <w:t>{{ hw_</w:t>
             </w:r>
             <w:r>
               <w:rPr>
@@ -3903,328 +3077,6 @@
                 <w:lang w:val="es-CO"/>
               </w:rPr>
               <w:t>9</w:t>
-            </w:r>
-            <w:r>
-              <w:rPr>
-                <w:rFonts w:ascii="Arial Narrow" w:hAnsi="Arial Narrow"/>
-                <w:sz w:val="22"/>
-                <w:szCs w:val="22"/>
-                <w:lang w:val="es-CO"/>
-              </w:rPr>
-              <w:t>_programa }}</w:t>
-            </w:r>
-          </w:p>
-        </w:tc>
-      </w:tr>
-      <w:tr>
-        <w:tc>
-          <w:tcPr>
-            <w:tcW w:w="3190" w:type="dxa"/>
-            <w:shd w:val="clear" w:color="auto" w:fill="FFFFFF"/>
-          </w:tcPr>
-          <w:p>
-            <w:pPr>
-              <w:rPr>
-                <w:rFonts w:ascii="Arial Narrow" w:hAnsi="Arial Narrow"/>
-                <w:sz w:val="22"/>
-                <w:szCs w:val="22"/>
-              </w:rPr>
-            </w:pPr>
-            <w:proofErr w:type="gramStart"/>
-            <w:r>
-              <w:rPr>
-                <w:rFonts w:ascii="Arial Narrow" w:hAnsi="Arial Narrow"/>
-                <w:sz w:val="22"/>
-                <w:szCs w:val="22"/>
-                <w:lang w:val="es-CO"/>
-              </w:rPr>
-              <w:t>{{ hw</w:t>
-            </w:r>
-            <w:proofErr w:type="gramEnd"/>
-            <w:r>
-              <w:rPr>
-                <w:rFonts w:ascii="Arial Narrow" w:hAnsi="Arial Narrow"/>
-                <w:sz w:val="22"/>
-                <w:szCs w:val="22"/>
-                <w:lang w:val="es-CO"/>
-              </w:rPr>
-              <w:t>_</w:t>
-            </w:r>
-            <w:r>
-              <w:rPr>
-                <w:rFonts w:ascii="Arial Narrow" w:hAnsi="Arial Narrow"/>
-                <w:sz w:val="22"/>
-                <w:szCs w:val="22"/>
-                <w:lang w:val="es-CO"/>
-              </w:rPr>
-              <w:t>10</w:t>
-            </w:r>
-            <w:r>
-              <w:rPr>
-                <w:rFonts w:ascii="Arial Narrow" w:hAnsi="Arial Narrow"/>
-                <w:sz w:val="22"/>
-                <w:szCs w:val="22"/>
-                <w:lang w:val="es-CO"/>
-              </w:rPr>
-              <w:t>_tipo }}</w:t>
-            </w:r>
-          </w:p>
-        </w:tc>
-        <w:tc>
-          <w:tcPr>
-            <w:tcW w:w="3190" w:type="dxa"/>
-            <w:shd w:val="clear" w:color="auto" w:fill="FFFFFF"/>
-          </w:tcPr>
-          <w:p>
-            <w:pPr>
-              <w:rPr>
-                <w:rFonts w:ascii="Arial Narrow" w:hAnsi="Arial Narrow"/>
-                <w:sz w:val="22"/>
-                <w:szCs w:val="22"/>
-              </w:rPr>
-            </w:pPr>
-            <w:proofErr w:type="gramStart"/>
-            <w:r>
-              <w:rPr>
-                <w:rFonts w:ascii="Arial Narrow" w:hAnsi="Arial Narrow"/>
-                <w:sz w:val="22"/>
-                <w:szCs w:val="22"/>
-                <w:lang w:val="es-CO"/>
-              </w:rPr>
-              <w:t>{{ hw</w:t>
-            </w:r>
-            <w:proofErr w:type="gramEnd"/>
-            <w:r>
-              <w:rPr>
-                <w:rFonts w:ascii="Arial Narrow" w:hAnsi="Arial Narrow"/>
-                <w:sz w:val="22"/>
-                <w:szCs w:val="22"/>
-                <w:lang w:val="es-CO"/>
-              </w:rPr>
-              <w:t>_1</w:t>
-            </w:r>
-            <w:r>
-              <w:rPr>
-                <w:rFonts w:ascii="Arial Narrow" w:hAnsi="Arial Narrow"/>
-                <w:sz w:val="22"/>
-                <w:szCs w:val="22"/>
-                <w:lang w:val="es-CO"/>
-              </w:rPr>
-              <w:t>0</w:t>
-            </w:r>
-            <w:r>
-              <w:rPr>
-                <w:rFonts w:ascii="Arial Narrow" w:hAnsi="Arial Narrow"/>
-                <w:sz w:val="22"/>
-                <w:szCs w:val="22"/>
-                <w:lang w:val="es-CO"/>
-              </w:rPr>
-              <w:t>_descripcion }}</w:t>
-            </w:r>
-          </w:p>
-        </w:tc>
-        <w:tc>
-          <w:tcPr>
-            <w:tcW w:w="4111" w:type="dxa"/>
-            <w:shd w:val="clear" w:color="auto" w:fill="FFFFFF"/>
-          </w:tcPr>
-          <w:p>
-            <w:pPr>
-              <w:rPr>
-                <w:rFonts w:ascii="Arial Narrow" w:hAnsi="Arial Narrow"/>
-                <w:sz w:val="22"/>
-                <w:szCs w:val="22"/>
-              </w:rPr>
-            </w:pPr>
-            <w:proofErr w:type="gramStart"/>
-            <w:r>
-              <w:rPr>
-                <w:rFonts w:ascii="Arial Narrow" w:hAnsi="Arial Narrow"/>
-                <w:sz w:val="22"/>
-                <w:szCs w:val="22"/>
-                <w:lang w:val="es-CO"/>
-              </w:rPr>
-              <w:t>{{ hw</w:t>
-            </w:r>
-            <w:proofErr w:type="gramEnd"/>
-            <w:r>
-              <w:rPr>
-                <w:rFonts w:ascii="Arial Narrow" w:hAnsi="Arial Narrow"/>
-                <w:sz w:val="22"/>
-                <w:szCs w:val="22"/>
-                <w:lang w:val="es-CO"/>
-              </w:rPr>
-              <w:t>_1</w:t>
-            </w:r>
-            <w:r>
-              <w:rPr>
-                <w:rFonts w:ascii="Arial Narrow" w:hAnsi="Arial Narrow"/>
-                <w:sz w:val="22"/>
-                <w:szCs w:val="22"/>
-                <w:lang w:val="es-CO"/>
-              </w:rPr>
-              <w:t>0</w:t>
-            </w:r>
-            <w:r>
-              <w:rPr>
-                <w:rFonts w:ascii="Arial Narrow" w:hAnsi="Arial Narrow"/>
-                <w:sz w:val="22"/>
-                <w:szCs w:val="22"/>
-                <w:lang w:val="es-CO"/>
-              </w:rPr>
-              <w:t>_programa }}</w:t>
-            </w:r>
-          </w:p>
-        </w:tc>
-      </w:tr>
-      <w:tr>
-        <w:tc>
-          <w:tcPr>
-            <w:tcW w:w="3190" w:type="dxa"/>
-            <w:shd w:val="clear" w:color="auto" w:fill="FFFFFF"/>
-          </w:tcPr>
-          <w:p>
-            <w:pPr>
-              <w:rPr>
-                <w:rFonts w:ascii="Arial Narrow" w:hAnsi="Arial Narrow"/>
-                <w:sz w:val="22"/>
-                <w:szCs w:val="22"/>
-              </w:rPr>
-            </w:pPr>
-            <w:proofErr w:type="gramStart"/>
-            <w:r>
-              <w:rPr>
-                <w:rFonts w:ascii="Arial Narrow" w:hAnsi="Arial Narrow"/>
-                <w:sz w:val="22"/>
-                <w:szCs w:val="22"/>
-                <w:lang w:val="es-CO"/>
-              </w:rPr>
-              <w:t>{{ hw</w:t>
-            </w:r>
-            <w:proofErr w:type="gramEnd"/>
-            <w:r>
-              <w:rPr>
-                <w:rFonts w:ascii="Arial Narrow" w:hAnsi="Arial Narrow"/>
-                <w:sz w:val="22"/>
-                <w:szCs w:val="22"/>
-                <w:lang w:val="es-CO"/>
-              </w:rPr>
-              <w:t>_</w:t>
-            </w:r>
-            <w:r>
-              <w:rPr>
-                <w:rFonts w:ascii="Arial Narrow" w:hAnsi="Arial Narrow"/>
-                <w:sz w:val="22"/>
-                <w:szCs w:val="22"/>
-                <w:lang w:val="es-CO"/>
-              </w:rPr>
-              <w:t>11</w:t>
-            </w:r>
-            <w:r>
-              <w:rPr>
-                <w:rFonts w:ascii="Arial Narrow" w:hAnsi="Arial Narrow"/>
-                <w:sz w:val="22"/>
-                <w:szCs w:val="22"/>
-                <w:lang w:val="es-CO"/>
-              </w:rPr>
-              <w:t>_tipo }}</w:t>
-            </w:r>
-          </w:p>
-        </w:tc>
-        <w:tc>
-          <w:tcPr>
-            <w:tcW w:w="3190" w:type="dxa"/>
-            <w:shd w:val="clear" w:color="auto" w:fill="FFFFFF"/>
-          </w:tcPr>
-          <w:p>
-            <w:pPr>
-              <w:rPr>
-                <w:rFonts w:ascii="Arial Narrow" w:hAnsi="Arial Narrow"/>
-                <w:sz w:val="22"/>
-                <w:szCs w:val="22"/>
-              </w:rPr>
-            </w:pPr>
-            <w:proofErr w:type="gramStart"/>
-            <w:r>
-              <w:rPr>
-                <w:rFonts w:ascii="Arial Narrow" w:hAnsi="Arial Narrow"/>
-                <w:sz w:val="22"/>
-                <w:szCs w:val="22"/>
-                <w:lang w:val="es-CO"/>
-              </w:rPr>
-              <w:t>{{ hw</w:t>
-            </w:r>
-            <w:proofErr w:type="gramEnd"/>
-            <w:r>
-              <w:rPr>
-                <w:rFonts w:ascii="Arial Narrow" w:hAnsi="Arial Narrow"/>
-                <w:sz w:val="22"/>
-                <w:szCs w:val="22"/>
-                <w:lang w:val="es-CO"/>
-              </w:rPr>
-              <w:t>_1</w:t>
-            </w:r>
-            <w:r>
-              <w:rPr>
-                <w:rFonts w:ascii="Arial Narrow" w:hAnsi="Arial Narrow"/>
-                <w:sz w:val="22"/>
-                <w:szCs w:val="22"/>
-                <w:lang w:val="es-CO"/>
-              </w:rPr>
-              <w:t>1</w:t>
-            </w:r>
-            <w:r>
-              <w:rPr>
-                <w:rFonts w:ascii="Arial Narrow" w:hAnsi="Arial Narrow"/>
-                <w:sz w:val="22"/>
-                <w:szCs w:val="22"/>
-                <w:lang w:val="es-CO"/>
-              </w:rPr>
-              <w:t>_descripcion }}</w:t>
-            </w:r>
-          </w:p>
-        </w:tc>
-        <w:tc>
-          <w:tcPr>
-            <w:tcW w:w="4111" w:type="dxa"/>
-            <w:shd w:val="clear" w:color="auto" w:fill="FFFFFF"/>
-          </w:tcPr>
-          <w:p>
-            <w:pPr>
-              <w:rPr>
-                <w:rFonts w:ascii="Arial Narrow" w:hAnsi="Arial Narrow"/>
-                <w:sz w:val="22"/>
-                <w:szCs w:val="22"/>
-              </w:rPr>
-            </w:pPr>
-            <w:proofErr w:type="gramStart"/>
-            <w:r>
-              <w:rPr>
-                <w:rFonts w:ascii="Arial Narrow" w:hAnsi="Arial Narrow"/>
-                <w:sz w:val="22"/>
-                <w:szCs w:val="22"/>
-                <w:lang w:val="es-CO"/>
-              </w:rPr>
-              <w:t>{{ hw</w:t>
-            </w:r>
-            <w:proofErr w:type="gramEnd"/>
-            <w:r>
-              <w:rPr>
-                <w:rFonts w:ascii="Arial Narrow" w:hAnsi="Arial Narrow"/>
-                <w:sz w:val="22"/>
-                <w:szCs w:val="22"/>
-                <w:lang w:val="es-CO"/>
-              </w:rPr>
-              <w:t>_1</w:t>
-            </w:r>
-            <w:r>
-              <w:rPr>
-                <w:rFonts w:ascii="Arial Narrow" w:hAnsi="Arial Narrow"/>
-                <w:sz w:val="22"/>
-                <w:szCs w:val="22"/>
-                <w:lang w:val="es-CO"/>
-              </w:rPr>
-              <w:t>1</w:t>
             </w:r>
             <w:r>
               <w:rPr>
@@ -4268,6 +3120,544 @@
         <w:t>Atentamente.</w:t>
       </w:r>
     </w:p>
+    <w:tbl>
+      <w:tblPr>
+        <w:tblpPr w:leftFromText="141" w:rightFromText="141" w:vertAnchor="text" w:horzAnchor="page" w:tblpX="4801" w:tblpY="416"/>
+        <w:tblW w:w="3285" w:type="dxa"/>
+        <w:tblCellMar>
+          <w:left w:w="0" w:type="dxa"/>
+          <w:right w:w="0" w:type="dxa"/>
+        </w:tblCellMar>
+        <w:tblLook w:val="04A0" w:firstRow="1" w:lastRow="0" w:firstColumn="1" w:lastColumn="0" w:noHBand="0" w:noVBand="1"/>
+      </w:tblPr>
+      <w:tblGrid>
+        <w:gridCol w:w="3285"/>
+      </w:tblGrid>
+      <w:tr>
+        <w:tc>
+          <w:tcPr>
+            <w:tcW w:w="3285" w:type="dxa"/>
+            <w:tcBorders>
+              <w:top w:val="single" w:sz="8" w:space="0" w:color="auto"/>
+              <w:left w:val="single" w:sz="8" w:space="0" w:color="auto"/>
+              <w:bottom w:val="single" w:sz="8" w:space="0" w:color="auto"/>
+              <w:right w:val="single" w:sz="8" w:space="0" w:color="auto"/>
+            </w:tcBorders>
+            <w:shd w:val="clear" w:color="auto" w:fill="F2F2F2"/>
+            <w:tcMar>
+              <w:top w:w="0" w:type="dxa"/>
+              <w:left w:w="108" w:type="dxa"/>
+              <w:bottom w:w="0" w:type="dxa"/>
+              <w:right w:w="108" w:type="dxa"/>
+            </w:tcMar>
+            <w:vAlign w:val="center"/>
+            <w:hideMark/>
+          </w:tcPr>
+          <w:p>
+            <w:pPr>
+              <w:jc w:val="center"/>
+            </w:pPr>
+            <w:bookmarkStart w:id="14" w:name="OLE_LINK20"/>
+            <w:bookmarkStart w:id="15" w:name="OLE_LINK17"/>
+            <w:r>
+              <w:rPr>
+                <w:rFonts w:ascii="Arial Narrow" w:hAnsi="Arial Narrow"/>
+                <w:b/>
+                <w:bCs/>
+                <w:color w:val="000000"/>
+                <w:sz w:val="22"/>
+                <w:szCs w:val="22"/>
+              </w:rPr>
+              <w:t>Entrega</w:t>
+            </w:r>
+          </w:p>
+        </w:tc>
+      </w:tr>
+      <w:tr>
+        <w:trPr>
+          <w:trHeight w:val="1000"/>
+        </w:trPr>
+        <w:tc>
+          <w:tcPr>
+            <w:tcW w:w="3285" w:type="dxa"/>
+            <w:tcBorders>
+              <w:top w:val="nil"/>
+              <w:left w:val="single" w:sz="8" w:space="0" w:color="auto"/>
+              <w:bottom w:val="single" w:sz="8" w:space="0" w:color="auto"/>
+              <w:right w:val="single" w:sz="8" w:space="0" w:color="auto"/>
+            </w:tcBorders>
+            <w:tcMar>
+              <w:top w:w="0" w:type="dxa"/>
+              <w:left w:w="108" w:type="dxa"/>
+              <w:bottom w:w="0" w:type="dxa"/>
+              <w:right w:w="108" w:type="dxa"/>
+            </w:tcMar>
+            <w:vAlign w:val="center"/>
+            <w:hideMark/>
+          </w:tcPr>
+          <w:p>
+            <w:pPr>
+              <w:jc w:val="center"/>
+              <w:rPr>
+                <w:rFonts w:ascii="Arial" w:hAnsi="Arial" w:cs="Arial"/>
+              </w:rPr>
+            </w:pPr>
+            <w:r>
+              <w:rPr>
+                <w:rFonts w:ascii="Arial Narrow" w:hAnsi="Arial Narrow" w:cs="Arial"/>
+                <w:bCs/>
+                <w:sz w:val="22"/>
+                <w:szCs w:val="22"/>
+              </w:rPr>
+              <w:t>{{</w:t>
+            </w:r>
+            <w:proofErr w:type="spellStart"/>
+            <w:r>
+              <w:rPr>
+                <w:rFonts w:ascii="Arial Narrow" w:hAnsi="Arial Narrow" w:cs="Arial"/>
+                <w:bCs/>
+                <w:sz w:val="22"/>
+                <w:szCs w:val="22"/>
+              </w:rPr>
+              <w:t>firma_usuario</w:t>
+            </w:r>
+            <w:proofErr w:type="spellEnd"/>
+            <w:r>
+              <w:rPr>
+                <w:rFonts w:ascii="Arial Narrow" w:hAnsi="Arial Narrow" w:cs="Arial"/>
+                <w:bCs/>
+                <w:sz w:val="22"/>
+                <w:szCs w:val="22"/>
+              </w:rPr>
+              <w:t>}}</w:t>
+            </w:r>
+          </w:p>
+          <w:p/>
+        </w:tc>
+      </w:tr>
+      <w:tr>
+        <w:trPr>
+          <w:trHeight w:val="217"/>
+        </w:trPr>
+        <w:tc>
+          <w:tcPr>
+            <w:tcW w:w="3285" w:type="dxa"/>
+            <w:tcBorders>
+              <w:top w:val="nil"/>
+              <w:left w:val="single" w:sz="8" w:space="0" w:color="auto"/>
+              <w:bottom w:val="single" w:sz="8" w:space="0" w:color="auto"/>
+              <w:right w:val="single" w:sz="8" w:space="0" w:color="auto"/>
+            </w:tcBorders>
+            <w:tcMar>
+              <w:top w:w="0" w:type="dxa"/>
+              <w:left w:w="108" w:type="dxa"/>
+              <w:bottom w:w="0" w:type="dxa"/>
+              <w:right w:w="108" w:type="dxa"/>
+            </w:tcMar>
+            <w:hideMark/>
+          </w:tcPr>
+          <w:p>
+            <w:r>
+              <w:rPr>
+                <w:rFonts w:ascii="Arial Narrow" w:hAnsi="Arial Narrow" w:cs="Arial"/>
+                <w:sz w:val="22"/>
+                <w:szCs w:val="22"/>
+              </w:rPr>
+              <w:t>Recibido por</w:t>
+            </w:r>
+            <w:r>
+              <w:rPr>
+                <w:rFonts w:ascii="Arial Narrow" w:hAnsi="Arial Narrow"/>
+                <w:sz w:val="22"/>
+                <w:szCs w:val="22"/>
+              </w:rPr>
+              <w:t>: {{</w:t>
+            </w:r>
+            <w:proofErr w:type="spellStart"/>
+            <w:r>
+              <w:rPr>
+                <w:rFonts w:ascii="Arial Narrow" w:hAnsi="Arial Narrow"/>
+                <w:sz w:val="22"/>
+                <w:szCs w:val="22"/>
+              </w:rPr>
+              <w:t>entregado_a</w:t>
+            </w:r>
+            <w:proofErr w:type="spellEnd"/>
+            <w:r>
+              <w:rPr>
+                <w:rFonts w:ascii="Arial Narrow" w:hAnsi="Arial Narrow"/>
+                <w:sz w:val="22"/>
+                <w:szCs w:val="22"/>
+              </w:rPr>
+              <w:t>}}</w:t>
+            </w:r>
+          </w:p>
+        </w:tc>
+      </w:tr>
+      <w:tr>
+        <w:tc>
+          <w:tcPr>
+            <w:tcW w:w="3285" w:type="dxa"/>
+            <w:tcBorders>
+              <w:top w:val="nil"/>
+              <w:left w:val="single" w:sz="8" w:space="0" w:color="auto"/>
+              <w:bottom w:val="single" w:sz="8" w:space="0" w:color="auto"/>
+              <w:right w:val="single" w:sz="8" w:space="0" w:color="auto"/>
+            </w:tcBorders>
+            <w:tcMar>
+              <w:top w:w="0" w:type="dxa"/>
+              <w:left w:w="108" w:type="dxa"/>
+              <w:bottom w:w="0" w:type="dxa"/>
+              <w:right w:w="108" w:type="dxa"/>
+            </w:tcMar>
+            <w:hideMark/>
+          </w:tcPr>
+          <w:p>
+            <w:bookmarkStart w:id="16" w:name="OLE_LINK15"/>
+            <w:r>
+              <w:rPr>
+                <w:rFonts w:ascii="Arial Narrow" w:hAnsi="Arial Narrow"/>
+                <w:sz w:val="22"/>
+                <w:szCs w:val="22"/>
+              </w:rPr>
+              <w:t>Cargo:</w:t>
+            </w:r>
+            <w:r>
+              <w:rPr>
+                <w:rFonts w:ascii="Arial Narrow" w:hAnsi="Arial Narrow" w:cs="Arial"/>
+                <w:bCs/>
+                <w:sz w:val="22"/>
+                <w:szCs w:val="22"/>
+                <w:lang w:val="es-CO"/>
+              </w:rPr>
+              <w:t xml:space="preserve"> {{</w:t>
+            </w:r>
+            <w:r>
+              <w:rPr>
+                <w:rFonts w:ascii="Arial Narrow" w:hAnsi="Arial Narrow" w:cs="Arial"/>
+                <w:bCs/>
+                <w:sz w:val="22"/>
+                <w:szCs w:val="22"/>
+                <w:lang w:val="es-CO"/>
+              </w:rPr>
+              <w:t xml:space="preserve"> </w:t>
+            </w:r>
+            <w:proofErr w:type="spellStart"/>
+            <w:r>
+              <w:rPr>
+                <w:rFonts w:ascii="Arial Narrow" w:hAnsi="Arial Narrow" w:cs="Arial"/>
+                <w:bCs/>
+                <w:sz w:val="22"/>
+                <w:szCs w:val="22"/>
+                <w:lang w:val="es-CO"/>
+              </w:rPr>
+              <w:t>cargo_recibe</w:t>
+            </w:r>
+            <w:proofErr w:type="spellEnd"/>
+            <w:r>
+              <w:rPr>
+                <w:rFonts w:ascii="Arial Narrow" w:hAnsi="Arial Narrow" w:cs="Arial"/>
+                <w:bCs/>
+                <w:sz w:val="22"/>
+                <w:szCs w:val="22"/>
+                <w:lang w:val="es-CO"/>
+              </w:rPr>
+              <w:t xml:space="preserve"> }}</w:t>
+            </w:r>
+          </w:p>
+        </w:tc>
+      </w:tr>
+    </w:tbl>
+    <w:tbl>
+      <w:tblPr>
+        <w:tblpPr w:leftFromText="141" w:rightFromText="141" w:vertAnchor="text" w:horzAnchor="page" w:tblpX="8071" w:tblpY="416"/>
+        <w:tblW w:w="3285" w:type="dxa"/>
+        <w:tblCellMar>
+          <w:left w:w="0" w:type="dxa"/>
+          <w:right w:w="0" w:type="dxa"/>
+        </w:tblCellMar>
+        <w:tblLook w:val="04A0" w:firstRow="1" w:lastRow="0" w:firstColumn="1" w:lastColumn="0" w:noHBand="0" w:noVBand="1"/>
+      </w:tblPr>
+      <w:tblGrid>
+        <w:gridCol w:w="3285"/>
+      </w:tblGrid>
+      <w:tr>
+        <w:tc>
+          <w:tcPr>
+            <w:tcW w:w="3285" w:type="dxa"/>
+            <w:tcBorders>
+              <w:top w:val="single" w:sz="8" w:space="0" w:color="auto"/>
+              <w:left w:val="single" w:sz="8" w:space="0" w:color="auto"/>
+              <w:bottom w:val="single" w:sz="8" w:space="0" w:color="auto"/>
+              <w:right w:val="single" w:sz="8" w:space="0" w:color="auto"/>
+            </w:tcBorders>
+            <w:shd w:val="clear" w:color="auto" w:fill="F2F2F2"/>
+            <w:tcMar>
+              <w:top w:w="0" w:type="dxa"/>
+              <w:left w:w="108" w:type="dxa"/>
+              <w:bottom w:w="0" w:type="dxa"/>
+              <w:right w:w="108" w:type="dxa"/>
+            </w:tcMar>
+            <w:vAlign w:val="center"/>
+            <w:hideMark/>
+          </w:tcPr>
+          <w:p>
+            <w:pPr>
+              <w:jc w:val="center"/>
+              <w:rPr>
+                <w:u w:val="single"/>
+              </w:rPr>
+            </w:pPr>
+            <w:bookmarkStart w:id="17" w:name="OLE_LINK19"/>
+            <w:r>
+              <w:rPr>
+                <w:rFonts w:ascii="Arial Narrow" w:hAnsi="Arial Narrow"/>
+                <w:b/>
+                <w:bCs/>
+                <w:color w:val="000000"/>
+                <w:sz w:val="22"/>
+                <w:szCs w:val="22"/>
+              </w:rPr>
+              <w:t>Foto Usuario</w:t>
+            </w:r>
+          </w:p>
+        </w:tc>
+      </w:tr>
+      <w:tr>
+        <w:trPr>
+          <w:trHeight w:val="1276"/>
+        </w:trPr>
+        <w:tc>
+          <w:tcPr>
+            <w:tcW w:w="3285" w:type="dxa"/>
+            <w:tcBorders>
+              <w:top w:val="nil"/>
+              <w:left w:val="single" w:sz="8" w:space="0" w:color="auto"/>
+              <w:right w:val="single" w:sz="8" w:space="0" w:color="auto"/>
+            </w:tcBorders>
+            <w:tcMar>
+              <w:top w:w="0" w:type="dxa"/>
+              <w:left w:w="108" w:type="dxa"/>
+              <w:bottom w:w="0" w:type="dxa"/>
+              <w:right w:w="108" w:type="dxa"/>
+            </w:tcMar>
+            <w:vAlign w:val="center"/>
+            <w:hideMark/>
+          </w:tcPr>
+          <w:p>
+            <w:pPr>
+              <w:jc w:val="center"/>
+              <w:rPr>
+                <w:rFonts w:ascii="Arial" w:hAnsi="Arial" w:cs="Arial"/>
+                <w:u w:val="single"/>
+              </w:rPr>
+            </w:pPr>
+            <w:bookmarkStart w:id="18" w:name="OLE_LINK16"/>
+            <w:r>
+              <w:rPr>
+                <w:rFonts w:ascii="Arial Narrow" w:hAnsi="Arial Narrow" w:cs="Arial"/>
+                <w:bCs/>
+                <w:sz w:val="22"/>
+                <w:szCs w:val="22"/>
+              </w:rPr>
+              <w:t>{{</w:t>
+            </w:r>
+            <w:proofErr w:type="spellStart"/>
+            <w:r>
+              <w:rPr>
+                <w:rFonts w:ascii="Arial Narrow" w:hAnsi="Arial Narrow" w:cs="Arial"/>
+                <w:bCs/>
+                <w:sz w:val="22"/>
+                <w:szCs w:val="22"/>
+              </w:rPr>
+              <w:t>foto_usuario</w:t>
+            </w:r>
+            <w:proofErr w:type="spellEnd"/>
+            <w:r>
+              <w:rPr>
+                <w:rFonts w:ascii="Arial Narrow" w:hAnsi="Arial Narrow" w:cs="Arial"/>
+                <w:bCs/>
+                <w:sz w:val="22"/>
+                <w:szCs w:val="22"/>
+              </w:rPr>
+              <w:t>}}</w:t>
+            </w:r>
+          </w:p>
+          <w:p/>
+        </w:tc>
+      </w:tr>
+      <w:tr>
+        <w:tc>
+          <w:tcPr>
+            <w:tcW w:w="3285" w:type="dxa"/>
+            <w:tcBorders>
+              <w:top w:val="nil"/>
+              <w:left w:val="single" w:sz="8" w:space="0" w:color="auto"/>
+              <w:bottom w:val="single" w:sz="8" w:space="0" w:color="auto"/>
+              <w:right w:val="single" w:sz="8" w:space="0" w:color="auto"/>
+            </w:tcBorders>
+            <w:tcMar>
+              <w:top w:w="0" w:type="dxa"/>
+              <w:left w:w="108" w:type="dxa"/>
+              <w:bottom w:w="0" w:type="dxa"/>
+              <w:right w:w="108" w:type="dxa"/>
+            </w:tcMar>
+            <w:vAlign w:val="center"/>
+          </w:tcPr>
+          <w:p/>
+        </w:tc>
+      </w:tr>
+    </w:tbl>
+    <w:tbl>
+      <w:tblPr>
+        <w:tblpPr w:leftFromText="141" w:rightFromText="141" w:vertAnchor="text" w:horzAnchor="page" w:tblpX="1126" w:tblpY="401"/>
+        <w:tblW w:w="3285" w:type="dxa"/>
+        <w:tblCellMar>
+          <w:left w:w="0" w:type="dxa"/>
+          <w:right w:w="0" w:type="dxa"/>
+        </w:tblCellMar>
+        <w:tblLook w:val="04A0" w:firstRow="1" w:lastRow="0" w:firstColumn="1" w:lastColumn="0" w:noHBand="0" w:noVBand="1"/>
+      </w:tblPr>
+      <w:tblGrid>
+        <w:gridCol w:w="3285"/>
+      </w:tblGrid>
+      <w:tr>
+        <w:tc>
+          <w:tcPr>
+            <w:tcW w:w="3285" w:type="dxa"/>
+            <w:tcBorders>
+              <w:top w:val="single" w:sz="8" w:space="0" w:color="auto"/>
+              <w:left w:val="single" w:sz="8" w:space="0" w:color="auto"/>
+              <w:bottom w:val="single" w:sz="8" w:space="0" w:color="auto"/>
+              <w:right w:val="single" w:sz="8" w:space="0" w:color="auto"/>
+            </w:tcBorders>
+            <w:shd w:val="clear" w:color="auto" w:fill="F2F2F2"/>
+            <w:tcMar>
+              <w:top w:w="0" w:type="dxa"/>
+              <w:left w:w="108" w:type="dxa"/>
+              <w:bottom w:w="0" w:type="dxa"/>
+              <w:right w:w="108" w:type="dxa"/>
+            </w:tcMar>
+            <w:vAlign w:val="center"/>
+            <w:hideMark/>
+          </w:tcPr>
+          <w:p>
+            <w:pPr>
+              <w:jc w:val="center"/>
+            </w:pPr>
+            <w:bookmarkStart w:id="19" w:name="OLE_LINK18"/>
+            <w:bookmarkEnd w:id="14"/>
+            <w:bookmarkEnd w:id="17"/>
+            <w:r>
+              <w:rPr>
+                <w:rFonts w:ascii="Arial Narrow" w:hAnsi="Arial Narrow"/>
+                <w:b/>
+                <w:bCs/>
+                <w:color w:val="000000"/>
+                <w:sz w:val="22"/>
+                <w:szCs w:val="22"/>
+              </w:rPr>
+              <w:t>Dirección Infraestructura</w:t>
+            </w:r>
+          </w:p>
+        </w:tc>
+      </w:tr>
+      <w:bookmarkEnd w:id="15"/>
+      <w:bookmarkEnd w:id="16"/>
+      <w:bookmarkEnd w:id="18"/>
+      <w:tr>
+        <w:trPr>
+          <w:trHeight w:val="1217"/>
+        </w:trPr>
+        <w:tc>
+          <w:tcPr>
+            <w:tcW w:w="3285" w:type="dxa"/>
+            <w:tcBorders>
+              <w:top w:val="nil"/>
+              <w:left w:val="single" w:sz="8" w:space="0" w:color="auto"/>
+              <w:right w:val="single" w:sz="8" w:space="0" w:color="auto"/>
+            </w:tcBorders>
+            <w:tcMar>
+              <w:top w:w="0" w:type="dxa"/>
+              <w:left w:w="108" w:type="dxa"/>
+              <w:bottom w:w="0" w:type="dxa"/>
+              <w:right w:w="108" w:type="dxa"/>
+            </w:tcMar>
+            <w:vAlign w:val="center"/>
+            <w:hideMark/>
+          </w:tcPr>
+          <w:p>
+            <w:pPr>
+              <w:rPr>
+                <w:rFonts w:ascii="Arial" w:hAnsi="Arial" w:cs="Arial"/>
+              </w:rPr>
+            </w:pPr>
+            <w:r>
+              <w:rPr>
+                <w:rFonts w:ascii="Arial Narrow" w:hAnsi="Arial Narrow" w:cs="Arial"/>
+                <w:bCs/>
+                <w:sz w:val="22"/>
+                <w:szCs w:val="22"/>
+              </w:rPr>
+              <w:t xml:space="preserve">         </w:t>
+            </w:r>
+            <w:r>
+              <w:rPr>
+                <w:rFonts w:ascii="Arial Narrow" w:hAnsi="Arial Narrow" w:cs="Arial"/>
+                <w:bCs/>
+                <w:sz w:val="22"/>
+                <w:szCs w:val="22"/>
+              </w:rPr>
+              <w:t xml:space="preserve">      </w:t>
+            </w:r>
+          </w:p>
+          <w:p>
+            <w:pPr>
+              <w:rPr>
+                <w:u w:val="single"/>
+              </w:rPr>
+            </w:pPr>
+          </w:p>
+        </w:tc>
+      </w:tr>
+      <w:tr>
+        <w:trPr>
+          <w:trHeight w:val="323"/>
+        </w:trPr>
+        <w:tc>
+          <w:tcPr>
+            <w:tcW w:w="3285" w:type="dxa"/>
+            <w:tcBorders>
+              <w:top w:val="nil"/>
+              <w:left w:val="single" w:sz="8" w:space="0" w:color="auto"/>
+              <w:bottom w:val="single" w:sz="8" w:space="0" w:color="auto"/>
+              <w:right w:val="single" w:sz="8" w:space="0" w:color="auto"/>
+            </w:tcBorders>
+            <w:tcMar>
+              <w:top w:w="0" w:type="dxa"/>
+              <w:left w:w="108" w:type="dxa"/>
+              <w:bottom w:w="0" w:type="dxa"/>
+              <w:right w:w="108" w:type="dxa"/>
+            </w:tcMar>
+            <w:hideMark/>
+          </w:tcPr>
+          <w:p/>
+        </w:tc>
+      </w:tr>
+      <w:bookmarkEnd w:id="19"/>
+    </w:tbl>
+    <w:p>
+      <w:pPr>
+        <w:pStyle w:val="Textoindependiente"/>
+        <w:ind w:hanging="993"/>
+        <w:jc w:val="left"/>
+        <w:rPr>
+          <w:rFonts w:ascii="Arial Narrow" w:hAnsi="Arial Narrow" w:cs="Arial"/>
+          <w:szCs w:val="22"/>
+          <w:u w:val="single"/>
+        </w:rPr>
+      </w:pPr>
+    </w:p>
     <w:p>
       <w:pPr>
         <w:rPr>
@@ -4281,129 +3671,9 @@
           <w:rFonts w:ascii="Arial" w:hAnsi="Arial" w:cs="Arial"/>
         </w:rPr>
       </w:pPr>
-      <w:r>
-        <w:rPr>
-          <w:rFonts w:ascii="Arial Narrow" w:hAnsi="Arial Narrow" w:cs="Arial"/>
-          <w:bCs/>
-          <w:sz w:val="22"/>
-          <w:szCs w:val="22"/>
-        </w:rPr>
-        <w:t xml:space="preserve">                                                                                                  </w:t>
-      </w:r>
     </w:p>
     <w:p>
       <w:pPr>
-        <w:rPr>
-          <w:rFonts w:ascii="Arial" w:hAnsi="Arial" w:cs="Arial"/>
-        </w:rPr>
-      </w:pPr>
-      <w:r>
-        <w:rPr>
-          <w:rFonts w:ascii="Arial" w:hAnsi="Arial" w:cs="Arial"/>
-        </w:rPr>
-        <w:t>________________</w:t>
-      </w:r>
-      <w:r>
-        <w:rPr>
-          <w:rFonts w:ascii="Arial" w:hAnsi="Arial" w:cs="Arial"/>
-        </w:rPr>
-        <w:t>____</w:t>
-      </w:r>
-      <w:r>
-        <w:rPr>
-          <w:rFonts w:ascii="Arial" w:hAnsi="Arial" w:cs="Arial"/>
-        </w:rPr>
-        <w:t>___</w:t>
-      </w:r>
-      <w:r>
-        <w:rPr>
-          <w:rFonts w:ascii="Arial" w:hAnsi="Arial" w:cs="Arial"/>
-        </w:rPr>
-        <w:tab/>
-      </w:r>
-      <w:r>
-        <w:rPr>
-          <w:rFonts w:ascii="Arial" w:hAnsi="Arial" w:cs="Arial"/>
-        </w:rPr>
-        <w:tab/>
-      </w:r>
-      <w:r>
-        <w:rPr>
-          <w:rFonts w:ascii="Arial" w:hAnsi="Arial" w:cs="Arial"/>
-        </w:rPr>
-        <w:t xml:space="preserve">                  </w:t>
-      </w:r>
-      <w:r>
-        <w:rPr>
-          <w:rFonts w:ascii="Arial" w:hAnsi="Arial" w:cs="Arial"/>
-        </w:rPr>
-        <w:t>_________________</w:t>
-      </w:r>
-      <w:r>
-        <w:rPr>
-          <w:rFonts w:ascii="Arial" w:hAnsi="Arial" w:cs="Arial"/>
-        </w:rPr>
-        <w:t>____</w:t>
-      </w:r>
-    </w:p>
-    <w:p>
-      <w:pPr>
-        <w:rPr>
-          <w:rFonts w:ascii="Arial Narrow" w:hAnsi="Arial Narrow" w:cs="Arial"/>
-          <w:sz w:val="22"/>
-          <w:szCs w:val="22"/>
-        </w:rPr>
-      </w:pPr>
-      <w:r>
-        <w:rPr>
-          <w:rFonts w:ascii="Arial Narrow" w:hAnsi="Arial Narrow" w:cs="Arial"/>
-          <w:sz w:val="22"/>
-          <w:szCs w:val="22"/>
-        </w:rPr>
-        <w:t xml:space="preserve">                                                        </w:t>
-      </w:r>
-      <w:r>
-        <w:rPr>
-          <w:rFonts w:ascii="Arial Narrow" w:hAnsi="Arial Narrow" w:cs="Arial"/>
-          <w:sz w:val="22"/>
-          <w:szCs w:val="22"/>
-        </w:rPr>
-        <w:t xml:space="preserve">  </w:t>
-      </w:r>
-      <w:r>
-        <w:rPr>
-          <w:rFonts w:ascii="Arial Narrow" w:hAnsi="Arial Narrow" w:cs="Arial"/>
-          <w:sz w:val="22"/>
-          <w:szCs w:val="22"/>
-        </w:rPr>
-        <w:t xml:space="preserve">       </w:t>
-      </w:r>
-      <w:r>
-        <w:rPr>
-          <w:rFonts w:ascii="Arial Narrow" w:hAnsi="Arial Narrow" w:cs="Arial"/>
-          <w:sz w:val="22"/>
-          <w:szCs w:val="22"/>
-        </w:rPr>
-        <w:t xml:space="preserve">                                           </w:t>
-      </w:r>
-      <w:r>
-        <w:rPr>
-          <w:rFonts w:ascii="Arial Narrow" w:hAnsi="Arial Narrow" w:cs="Arial"/>
-          <w:sz w:val="22"/>
-          <w:szCs w:val="22"/>
-        </w:rPr>
-        <w:t>Recibido</w:t>
-      </w:r>
-      <w:r>
-        <w:rPr>
-          <w:rFonts w:ascii="Arial Narrow" w:hAnsi="Arial Narrow" w:cs="Arial"/>
-          <w:sz w:val="22"/>
-          <w:szCs w:val="22"/>
-        </w:rPr>
-        <w:t xml:space="preserve"> por: </w:t>
-      </w:r>
-      <w:proofErr w:type="gramStart"/>
-      <w:r>
         <w:rPr>
           <w:rFonts w:ascii="Arial Narrow" w:hAnsi="Arial Narrow" w:cs="Arial"/>
           <w:bCs/>
@@ -4411,245 +3681,7 @@
           <w:szCs w:val="22"/>
           <w:lang w:val="es-CO"/>
         </w:rPr>
-        <w:t xml:space="preserve">{{ </w:t>
-      </w:r>
-      <w:proofErr w:type="spellStart"/>
-      <w:r>
-        <w:rPr>
-          <w:rFonts w:ascii="Arial Narrow" w:hAnsi="Arial Narrow" w:cs="Arial"/>
-          <w:bCs/>
-          <w:sz w:val="22"/>
-          <w:szCs w:val="22"/>
-          <w:lang w:val="es-CO"/>
-        </w:rPr>
-        <w:t>entregado</w:t>
-      </w:r>
-      <w:proofErr w:type="gramEnd"/>
-      <w:r>
-        <w:rPr>
-          <w:rFonts w:ascii="Arial Narrow" w:hAnsi="Arial Narrow" w:cs="Arial"/>
-          <w:bCs/>
-          <w:sz w:val="22"/>
-          <w:szCs w:val="22"/>
-          <w:lang w:val="es-CO"/>
-        </w:rPr>
-        <w:t>_</w:t>
-      </w:r>
-      <w:proofErr w:type="gramStart"/>
-      <w:r>
-        <w:rPr>
-          <w:rFonts w:ascii="Arial Narrow" w:hAnsi="Arial Narrow" w:cs="Arial"/>
-          <w:bCs/>
-          <w:sz w:val="22"/>
-          <w:szCs w:val="22"/>
-          <w:lang w:val="es-CO"/>
-        </w:rPr>
-        <w:t>a</w:t>
-      </w:r>
-      <w:proofErr w:type="spellEnd"/>
-      <w:r>
-        <w:rPr>
-          <w:rFonts w:ascii="Arial Narrow" w:hAnsi="Arial Narrow" w:cs="Arial"/>
-          <w:bCs/>
-          <w:sz w:val="22"/>
-          <w:szCs w:val="22"/>
-          <w:lang w:val="es-CO"/>
-        </w:rPr>
-        <w:t xml:space="preserve"> }</w:t>
-      </w:r>
-      <w:proofErr w:type="gramEnd"/>
-      <w:r>
-        <w:rPr>
-          <w:rFonts w:ascii="Arial Narrow" w:hAnsi="Arial Narrow" w:cs="Arial"/>
-          <w:bCs/>
-          <w:sz w:val="22"/>
-          <w:szCs w:val="22"/>
-          <w:lang w:val="es-CO"/>
-        </w:rPr>
-        <w:t>}</w:t>
-      </w:r>
-      <w:r>
-        <w:rPr>
-          <w:rFonts w:ascii="Arial Narrow" w:hAnsi="Arial Narrow" w:cs="Arial"/>
-          <w:sz w:val="22"/>
-          <w:szCs w:val="22"/>
-        </w:rPr>
-        <w:t xml:space="preserve"> </w:t>
-      </w:r>
-    </w:p>
-    <w:p>
-      <w:pPr>
-        <w:rPr>
-          <w:rFonts w:ascii="Arial Narrow" w:hAnsi="Arial Narrow" w:cs="Arial"/>
-          <w:sz w:val="22"/>
-          <w:szCs w:val="22"/>
-          <w:u w:val="single"/>
-        </w:rPr>
-      </w:pPr>
-      <w:r>
-        <w:rPr>
-          <w:rFonts w:ascii="Arial Narrow" w:hAnsi="Arial Narrow" w:cs="Arial"/>
-          <w:sz w:val="22"/>
-          <w:szCs w:val="22"/>
-        </w:rPr>
-        <w:t>Director de Infraestructura</w:t>
-      </w:r>
-      <w:r>
-        <w:rPr>
-          <w:rFonts w:ascii="Arial Narrow" w:hAnsi="Arial Narrow" w:cs="Arial"/>
-          <w:sz w:val="22"/>
-          <w:szCs w:val="22"/>
-        </w:rPr>
-        <w:tab/>
-      </w:r>
-      <w:r>
-        <w:rPr>
-          <w:rFonts w:ascii="Arial Narrow" w:hAnsi="Arial Narrow" w:cs="Arial"/>
-          <w:sz w:val="22"/>
-          <w:szCs w:val="22"/>
-        </w:rPr>
-        <w:tab/>
-      </w:r>
-      <w:r>
-        <w:rPr>
-          <w:rFonts w:ascii="Arial Narrow" w:hAnsi="Arial Narrow" w:cs="Arial"/>
-          <w:sz w:val="22"/>
-          <w:szCs w:val="22"/>
-        </w:rPr>
-        <w:tab/>
-      </w:r>
-      <w:r>
-        <w:rPr>
-          <w:rFonts w:ascii="Arial Narrow" w:hAnsi="Arial Narrow" w:cs="Arial"/>
-          <w:sz w:val="22"/>
-          <w:szCs w:val="22"/>
-        </w:rPr>
-        <w:tab/>
-      </w:r>
-      <w:r>
-        <w:rPr>
-          <w:rFonts w:ascii="Arial Narrow" w:hAnsi="Arial Narrow" w:cs="Arial"/>
-          <w:sz w:val="22"/>
-          <w:szCs w:val="22"/>
-        </w:rPr>
-        <w:t xml:space="preserve">     </w:t>
-      </w:r>
-      <w:r>
-        <w:rPr>
-          <w:rFonts w:ascii="Arial Narrow" w:hAnsi="Arial Narrow" w:cs="Arial"/>
-          <w:sz w:val="22"/>
-          <w:szCs w:val="22"/>
-        </w:rPr>
-        <w:t xml:space="preserve">             </w:t>
-      </w:r>
-      <w:r>
-        <w:rPr>
-          <w:rFonts w:ascii="Arial Narrow" w:hAnsi="Arial Narrow" w:cs="Arial"/>
-          <w:sz w:val="22"/>
-          <w:szCs w:val="22"/>
-        </w:rPr>
-        <w:t xml:space="preserve">     </w:t>
-      </w:r>
-      <w:r>
-        <w:rPr>
-          <w:rFonts w:ascii="Arial Narrow" w:hAnsi="Arial Narrow" w:cs="Arial"/>
-          <w:sz w:val="22"/>
-          <w:szCs w:val="22"/>
-        </w:rPr>
-        <w:t>Cargo</w:t>
-      </w:r>
-      <w:r>
-        <w:rPr>
-          <w:rFonts w:ascii="Arial Narrow" w:hAnsi="Arial Narrow" w:cs="Arial"/>
-          <w:sz w:val="22"/>
-          <w:szCs w:val="22"/>
-        </w:rPr>
-        <w:t>:</w:t>
-      </w:r>
-      <w:r>
-        <w:rPr>
-          <w:rFonts w:ascii="Arial Narrow" w:hAnsi="Arial Narrow" w:cs="Arial"/>
-          <w:sz w:val="22"/>
-          <w:szCs w:val="22"/>
-        </w:rPr>
-        <w:t xml:space="preserve"> </w:t>
-      </w:r>
-      <w:proofErr w:type="gramStart"/>
-      <w:r>
-        <w:rPr>
-          <w:rFonts w:ascii="Arial Narrow" w:hAnsi="Arial Narrow" w:cs="Arial"/>
-          <w:bCs/>
-          <w:sz w:val="22"/>
-          <w:szCs w:val="22"/>
-          <w:lang w:val="es-CO"/>
-        </w:rPr>
-        <w:t>{{</w:t>
-      </w:r>
-      <w:r>
-        <w:rPr>
-          <w:rFonts w:ascii="Arial Narrow" w:hAnsi="Arial Narrow" w:cs="Arial"/>
-          <w:bCs/>
-          <w:sz w:val="22"/>
-          <w:szCs w:val="22"/>
-          <w:lang w:val="es-CO"/>
-        </w:rPr>
-        <w:t xml:space="preserve"> </w:t>
-      </w:r>
-      <w:proofErr w:type="spellStart"/>
-      <w:r>
-        <w:rPr>
-          <w:rFonts w:ascii="Arial Narrow" w:hAnsi="Arial Narrow" w:cs="Arial"/>
-          <w:bCs/>
-          <w:sz w:val="22"/>
-          <w:szCs w:val="22"/>
-          <w:lang w:val="es-CO"/>
-        </w:rPr>
-        <w:t>cargo</w:t>
-      </w:r>
-      <w:proofErr w:type="gramEnd"/>
-      <w:r>
-        <w:rPr>
-          <w:rFonts w:ascii="Arial Narrow" w:hAnsi="Arial Narrow" w:cs="Arial"/>
-          <w:bCs/>
-          <w:sz w:val="22"/>
-          <w:szCs w:val="22"/>
-          <w:lang w:val="es-CO"/>
-        </w:rPr>
-        <w:t>_</w:t>
-      </w:r>
-      <w:proofErr w:type="gramStart"/>
-      <w:r>
-        <w:rPr>
-          <w:rFonts w:ascii="Arial Narrow" w:hAnsi="Arial Narrow" w:cs="Arial"/>
-          <w:bCs/>
-          <w:sz w:val="22"/>
-          <w:szCs w:val="22"/>
-          <w:lang w:val="es-CO"/>
-        </w:rPr>
-        <w:t>recibe</w:t>
-      </w:r>
-      <w:proofErr w:type="spellEnd"/>
-      <w:r>
-        <w:rPr>
-          <w:rFonts w:ascii="Arial Narrow" w:hAnsi="Arial Narrow" w:cs="Arial"/>
-          <w:bCs/>
-          <w:sz w:val="22"/>
-          <w:szCs w:val="22"/>
-          <w:lang w:val="es-CO"/>
-        </w:rPr>
-        <w:t xml:space="preserve"> }</w:t>
-      </w:r>
-      <w:proofErr w:type="gramEnd"/>
-      <w:r>
-        <w:rPr>
-          <w:rFonts w:ascii="Arial Narrow" w:hAnsi="Arial Narrow" w:cs="Arial"/>
-          <w:bCs/>
-          <w:sz w:val="22"/>
-          <w:szCs w:val="22"/>
-          <w:lang w:val="es-CO"/>
-        </w:rPr>
-        <w:t>}</w:t>
-      </w:r>
+      </w:pPr>
     </w:p>
     <w:sectPr>
       <w:headerReference w:type="default" r:id="rId10"/>
@@ -4664,7 +3696,7 @@
 </file>
 
 <file path=word/endnotes.xml><?xml version="1.0" encoding="utf-8"?>
-<w:endnotes xmlns:wpc="http://schemas.microsoft.com/office/word/2010/wordprocessingCanvas" xmlns:cx="http://schemas.microsoft.com/office/drawing/2014/chartex" xmlns:cx1="http://schemas.microsoft.com/office/drawing/2015/9/8/chartex" xmlns:cx2="http://schemas.microsoft.com/office/drawing/2015/10/21/chartex" xmlns:cx3="http://schemas.microsoft.com/office/drawing/2016/5/9/chartex" xmlns:cx4="http://schemas.microsoft.com/office/drawing/2016/5/10/chartex" xmlns:cx5="http://schemas.microsoft.com/office/drawing/2016/5/11/chartex" xmlns:cx6="http://schemas.microsoft.com/office/drawing/2016/5/12/chartex" xmlns:cx7="http://schemas.microsoft.com/office/drawing/2016/5/13/chartex" xmlns:cx8="http://schemas.microsoft.com/office/drawing/2016/5/14/chartex" xmlns:mc="http://schemas.openxmlformats.org/markup-compatibility/2006" xmlns:aink="http://schemas.microsoft.com/office/drawing/2016/ink" xmlns:am3d="http://schemas.microsoft.com/office/drawing/2017/model3d" xmlns:o="urn:schemas-microsoft-com:office:office" xmlns:oel="http://schemas.microsoft.com/office/2019/extlst" xmlns:r="http://schemas.openxmlformats.org/officeDocument/2006/relationships" xmlns:m="http://schemas.openxmlformats.org/officeDocument/2006/math" xmlns:v="urn:schemas-microsoft-com:vml" xmlns:wp14="http://schemas.microsoft.com/office/word/2010/wordprocessingDrawing" xmlns:wp="http://schemas.openxmlformats.org/drawingml/2006/wordprocessingDrawing" xmlns:w10="urn:schemas-microsoft-com:office:word" xmlns:w="http://schemas.openxmlformats.org/wordprocessingml/2006/main" xmlns:w14="http://schemas.microsoft.com/office/word/2010/wordml" xmlns:w15="http://schemas.microsoft.com/office/word/2012/wordml" xmlns:w16cex="http://schemas.microsoft.com/office/word/2018/wordml/cex" xmlns:w16cid="http://schemas.microsoft.com/office/word/2016/wordml/cid" xmlns:w16="http://schemas.microsoft.com/office/word/2018/wordml" xmlns:w16du="http://schemas.microsoft.com/office/word/2023/wordml/word16du" xmlns:w16sdtdh="http://schemas.microsoft.com/office/word/2020/wordml/sdtdatahash" xmlns:w16sdtfl="http://schemas.microsoft.com/office/word/2024/wordml/sdtformatlock" xmlns:w16se="http://schemas.microsoft.com/office/word/2015/wordml/symex" xmlns:wpg="http://schemas.microsoft.com/office/word/2010/wordprocessingGroup" xmlns:wpi="http://schemas.microsoft.com/office/word/2010/wordprocessingInk" xmlns:wne="http://schemas.microsoft.com/office/word/2006/wordml" xmlns:wps="http://schemas.microsoft.com/office/word/2010/wordprocessingShape" mc:Ignorable="w14 w15 w16se w16cid w16 w16cex w16sdtdh w16sdtfl w16du wp14">
+<w:endnotes xmlns:wpc="http://schemas.microsoft.com/office/word/2010/wordprocessingCanvas" xmlns:cx="http://schemas.microsoft.com/office/drawing/2014/chartex" xmlns:cx1="http://schemas.microsoft.com/office/drawing/2015/9/8/chartex" xmlns:cx2="http://schemas.microsoft.com/office/drawing/2015/10/21/chartex" xmlns:cx3="http://schemas.microsoft.com/office/drawing/2016/5/9/chartex" xmlns:cx4="http://schemas.microsoft.com/office/drawing/2016/5/10/chartex" xmlns:cx5="http://schemas.microsoft.com/office/drawing/2016/5/11/chartex" xmlns:cx6="http://schemas.microsoft.com/office/drawing/2016/5/12/chartex" xmlns:cx7="http://schemas.microsoft.com/office/drawing/2016/5/13/chartex" xmlns:cx8="http://schemas.microsoft.com/office/drawing/2016/5/14/chartex" xmlns:mc="http://schemas.openxmlformats.org/markup-compatibility/2006" xmlns:aink="http://schemas.microsoft.com/office/drawing/2016/ink" xmlns:am3d="http://schemas.microsoft.com/office/drawing/2017/model3d" xmlns:o="urn:schemas-microsoft-com:office:office" xmlns:oel="http://schemas.microsoft.com/office/2019/extlst" xmlns:r="http://schemas.openxmlformats.org/officeDocument/2006/relationships" xmlns:m="http://schemas.openxmlformats.org/officeDocument/2006/math" xmlns:v="urn:schemas-microsoft-com:vml" xmlns:wp14="http://schemas.microsoft.com/office/word/2010/wordprocessingDrawing" xmlns:wp="http://schemas.openxmlformats.org/drawingml/2006/wordprocessingDrawing" xmlns:w10="urn:schemas-microsoft-com:office:word" xmlns:w="http://schemas.openxmlformats.org/wordprocessingml/2006/main" xmlns:w14="http://schemas.microsoft.com/office/word/2010/wordml" xmlns:w15="http://schemas.microsoft.com/office/word/2012/wordml" xmlns:w16cei="http://schemas.microsoft.com/office/word/2026/wordml/cei" xmlns:w16cex="http://schemas.microsoft.com/office/word/2018/wordml/cex" xmlns:w16cid="http://schemas.microsoft.com/office/word/2016/wordml/cid" xmlns:w16="http://schemas.microsoft.com/office/word/2018/wordml" xmlns:w16du="http://schemas.microsoft.com/office/word/2023/wordml/word16du" xmlns:w16sdtdh="http://schemas.microsoft.com/office/word/2020/wordml/sdtdatahash" xmlns:w16sdtfl="http://schemas.microsoft.com/office/word/2024/wordml/sdtformatlock" xmlns:w16se="http://schemas.microsoft.com/office/word/2015/wordml/symex" xmlns:wpg="http://schemas.microsoft.com/office/word/2010/wordprocessingGroup" xmlns:wpi="http://schemas.microsoft.com/office/word/2010/wordprocessingInk" xmlns:wne="http://schemas.microsoft.com/office/word/2006/wordml" xmlns:wps="http://schemas.microsoft.com/office/word/2010/wordprocessingShape" mc:Ignorable="w14 w15 w16se w16cid w16 w16cex w16sdtdh w16sdtfl w16du wp14">
   <w:endnote w:type="separator" w:id="-1">
     <w:p>
       <w:r>
@@ -4683,7 +3715,7 @@
 </file>
 
 <file path=word/footer1.xml><?xml version="1.0" encoding="utf-8"?>
-<w:ftr xmlns:wpc="http://schemas.microsoft.com/office/word/2010/wordprocessingCanvas" xmlns:cx="http://schemas.microsoft.com/office/drawing/2014/chartex" xmlns:cx1="http://schemas.microsoft.com/office/drawing/2015/9/8/chartex" xmlns:cx2="http://schemas.microsoft.com/office/drawing/2015/10/21/chartex" xmlns:cx3="http://schemas.microsoft.com/office/drawing/2016/5/9/chartex" xmlns:cx4="http://schemas.microsoft.com/office/drawing/2016/5/10/chartex" xmlns:cx5="http://schemas.microsoft.com/office/drawing/2016/5/11/chartex" xmlns:cx6="http://schemas.microsoft.com/office/drawing/2016/5/12/chartex" xmlns:cx7="http://schemas.microsoft.com/office/drawing/2016/5/13/chartex" xmlns:cx8="http://schemas.microsoft.com/office/drawing/2016/5/14/chartex" xmlns:mc="http://schemas.openxmlformats.org/markup-compatibility/2006" xmlns:aink="http://schemas.microsoft.com/office/drawing/2016/ink" xmlns:am3d="http://schemas.microsoft.com/office/drawing/2017/model3d" xmlns:o="urn:schemas-microsoft-com:office:office" xmlns:oel="http://schemas.microsoft.com/office/2019/extlst" xmlns:r="http://schemas.openxmlformats.org/officeDocument/2006/relationships" xmlns:m="http://schemas.openxmlformats.org/officeDocument/2006/math" xmlns:v="urn:schemas-microsoft-com:vml" xmlns:wp14="http://schemas.microsoft.com/office/word/2010/wordprocessingDrawing" xmlns:wp="http://schemas.openxmlformats.org/drawingml/2006/wordprocessingDrawing" xmlns:w10="urn:schemas-microsoft-com:office:word" xmlns:w="http://schemas.openxmlformats.org/wordprocessingml/2006/main" xmlns:w14="http://schemas.microsoft.com/office/word/2010/wordml" xmlns:w15="http://schemas.microsoft.com/office/word/2012/wordml" xmlns:w16cex="http://schemas.microsoft.com/office/word/2018/wordml/cex" xmlns:w16cid="http://schemas.microsoft.com/office/word/2016/wordml/cid" xmlns:w16="http://schemas.microsoft.com/office/word/2018/wordml" xmlns:w16du="http://schemas.microsoft.com/office/word/2023/wordml/word16du" xmlns:w16sdtdh="http://schemas.microsoft.com/office/word/2020/wordml/sdtdatahash" xmlns:w16sdtfl="http://schemas.microsoft.com/office/word/2024/wordml/sdtformatlock" xmlns:w16se="http://schemas.microsoft.com/office/word/2015/wordml/symex" xmlns:wpg="http://schemas.microsoft.com/office/word/2010/wordprocessingGroup" xmlns:wpi="http://schemas.microsoft.com/office/word/2010/wordprocessingInk" xmlns:wne="http://schemas.microsoft.com/office/word/2006/wordml" xmlns:wps="http://schemas.microsoft.com/office/word/2010/wordprocessingShape" mc:Ignorable="w14 w15 w16se w16cid w16 w16cex w16sdtdh w16sdtfl w16du wp14">
+<w:ftr xmlns:wpc="http://schemas.microsoft.com/office/word/2010/wordprocessingCanvas" xmlns:cx="http://schemas.microsoft.com/office/drawing/2014/chartex" xmlns:cx1="http://schemas.microsoft.com/office/drawing/2015/9/8/chartex" xmlns:cx2="http://schemas.microsoft.com/office/drawing/2015/10/21/chartex" xmlns:cx3="http://schemas.microsoft.com/office/drawing/2016/5/9/chartex" xmlns:cx4="http://schemas.microsoft.com/office/drawing/2016/5/10/chartex" xmlns:cx5="http://schemas.microsoft.com/office/drawing/2016/5/11/chartex" xmlns:cx6="http://schemas.microsoft.com/office/drawing/2016/5/12/chartex" xmlns:cx7="http://schemas.microsoft.com/office/drawing/2016/5/13/chartex" xmlns:cx8="http://schemas.microsoft.com/office/drawing/2016/5/14/chartex" xmlns:mc="http://schemas.openxmlformats.org/markup-compatibility/2006" xmlns:aink="http://schemas.microsoft.com/office/drawing/2016/ink" xmlns:am3d="http://schemas.microsoft.com/office/drawing/2017/model3d" xmlns:o="urn:schemas-microsoft-com:office:office" xmlns:oel="http://schemas.microsoft.com/office/2019/extlst" xmlns:r="http://schemas.openxmlformats.org/officeDocument/2006/relationships" xmlns:m="http://schemas.openxmlformats.org/officeDocument/2006/math" xmlns:v="urn:schemas-microsoft-com:vml" xmlns:wp14="http://schemas.microsoft.com/office/word/2010/wordprocessingDrawing" xmlns:wp="http://schemas.openxmlformats.org/drawingml/2006/wordprocessingDrawing" xmlns:w10="urn:schemas-microsoft-com:office:word" xmlns:w="http://schemas.openxmlformats.org/wordprocessingml/2006/main" xmlns:w14="http://schemas.microsoft.com/office/word/2010/wordml" xmlns:w15="http://schemas.microsoft.com/office/word/2012/wordml" xmlns:w16cei="http://schemas.microsoft.com/office/word/2026/wordml/cei" xmlns:w16cex="http://schemas.microsoft.com/office/word/2018/wordml/cex" xmlns:w16cid="http://schemas.microsoft.com/office/word/2016/wordml/cid" xmlns:w16="http://schemas.microsoft.com/office/word/2018/wordml" xmlns:w16du="http://schemas.microsoft.com/office/word/2023/wordml/word16du" xmlns:w16sdtdh="http://schemas.microsoft.com/office/word/2020/wordml/sdtdatahash" xmlns:w16sdtfl="http://schemas.microsoft.com/office/word/2024/wordml/sdtformatlock" xmlns:w16se="http://schemas.microsoft.com/office/word/2015/wordml/symex" xmlns:wpg="http://schemas.microsoft.com/office/word/2010/wordprocessingGroup" xmlns:wpi="http://schemas.microsoft.com/office/word/2010/wordprocessingInk" xmlns:wne="http://schemas.microsoft.com/office/word/2006/wordml" xmlns:wps="http://schemas.microsoft.com/office/word/2010/wordprocessingShape" mc:Ignorable="w14 w15 w16se w16cid w16 w16cex w16sdtdh w16sdtfl w16du wp14">
   <w:tbl>
     <w:tblPr>
       <w:tblW w:w="10508" w:type="dxa"/>
@@ -4953,7 +3985,7 @@
 </file>
 
 <file path=word/footnotes.xml><?xml version="1.0" encoding="utf-8"?>
-<w:footnotes xmlns:wpc="http://schemas.microsoft.com/office/word/2010/wordprocessingCanvas" xmlns:cx="http://schemas.microsoft.com/office/drawing/2014/chartex" xmlns:cx1="http://schemas.microsoft.com/office/drawing/2015/9/8/chartex" xmlns:cx2="http://schemas.microsoft.com/office/drawing/2015/10/21/chartex" xmlns:cx3="http://schemas.microsoft.com/office/drawing/2016/5/9/chartex" xmlns:cx4="http://schemas.microsoft.com/office/drawing/2016/5/10/chartex" xmlns:cx5="http://schemas.microsoft.com/office/drawing/2016/5/11/chartex" xmlns:cx6="http://schemas.microsoft.com/office/drawing/2016/5/12/chartex" xmlns:cx7="http://schemas.microsoft.com/office/drawing/2016/5/13/chartex" xmlns:cx8="http://schemas.microsoft.com/office/drawing/2016/5/14/chartex" xmlns:mc="http://schemas.openxmlformats.org/markup-compatibility/2006" xmlns:aink="http://schemas.microsoft.com/office/drawing/2016/ink" xmlns:am3d="http://schemas.microsoft.com/office/drawing/2017/model3d" xmlns:o="urn:schemas-microsoft-com:office:office" xmlns:oel="http://schemas.microsoft.com/office/2019/extlst" xmlns:r="http://schemas.openxmlformats.org/officeDocument/2006/relationships" xmlns:m="http://schemas.openxmlformats.org/officeDocument/2006/math" xmlns:v="urn:schemas-microsoft-com:vml" xmlns:wp14="http://schemas.microsoft.com/office/word/2010/wordprocessingDrawing" xmlns:wp="http://schemas.openxmlformats.org/drawingml/2006/wordprocessingDrawing" xmlns:w10="urn:schemas-microsoft-com:office:word" xmlns:w="http://schemas.openxmlformats.org/wordprocessingml/2006/main" xmlns:w14="http://schemas.microsoft.com/office/word/2010/wordml" xmlns:w15="http://schemas.microsoft.com/office/word/2012/wordml" xmlns:w16cex="http://schemas.microsoft.com/office/word/2018/wordml/cex" xmlns:w16cid="http://schemas.microsoft.com/office/word/2016/wordml/cid" xmlns:w16="http://schemas.microsoft.com/office/word/2018/wordml" xmlns:w16du="http://schemas.microsoft.com/office/word/2023/wordml/word16du" xmlns:w16sdtdh="http://schemas.microsoft.com/office/word/2020/wordml/sdtdatahash" xmlns:w16sdtfl="http://schemas.microsoft.com/office/word/2024/wordml/sdtformatlock" xmlns:w16se="http://schemas.microsoft.com/office/word/2015/wordml/symex" xmlns:wpg="http://schemas.microsoft.com/office/word/2010/wordprocessingGroup" xmlns:wpi="http://schemas.microsoft.com/office/word/2010/wordprocessingInk" xmlns:wne="http://schemas.microsoft.com/office/word/2006/wordml" xmlns:wps="http://schemas.microsoft.com/office/word/2010/wordprocessingShape" mc:Ignorable="w14 w15 w16se w16cid w16 w16cex w16sdtdh w16sdtfl w16du wp14">
+<w:footnotes xmlns:wpc="http://schemas.microsoft.com/office/word/2010/wordprocessingCanvas" xmlns:cx="http://schemas.microsoft.com/office/drawing/2014/chartex" xmlns:cx1="http://schemas.microsoft.com/office/drawing/2015/9/8/chartex" xmlns:cx2="http://schemas.microsoft.com/office/drawing/2015/10/21/chartex" xmlns:cx3="http://schemas.microsoft.com/office/drawing/2016/5/9/chartex" xmlns:cx4="http://schemas.microsoft.com/office/drawing/2016/5/10/chartex" xmlns:cx5="http://schemas.microsoft.com/office/drawing/2016/5/11/chartex" xmlns:cx6="http://schemas.microsoft.com/office/drawing/2016/5/12/chartex" xmlns:cx7="http://schemas.microsoft.com/office/drawing/2016/5/13/chartex" xmlns:cx8="http://schemas.microsoft.com/office/drawing/2016/5/14/chartex" xmlns:mc="http://schemas.openxmlformats.org/markup-compatibility/2006" xmlns:aink="http://schemas.microsoft.com/office/drawing/2016/ink" xmlns:am3d="http://schemas.microsoft.com/office/drawing/2017/model3d" xmlns:o="urn:schemas-microsoft-com:office:office" xmlns:oel="http://schemas.microsoft.com/office/2019/extlst" xmlns:r="http://schemas.openxmlformats.org/officeDocument/2006/relationships" xmlns:m="http://schemas.openxmlformats.org/officeDocument/2006/math" xmlns:v="urn:schemas-microsoft-com:vml" xmlns:wp14="http://schemas.microsoft.com/office/word/2010/wordprocessingDrawing" xmlns:wp="http://schemas.openxmlformats.org/drawingml/2006/wordprocessingDrawing" xmlns:w10="urn:schemas-microsoft-com:office:word" xmlns:w="http://schemas.openxmlformats.org/wordprocessingml/2006/main" xmlns:w14="http://schemas.microsoft.com/office/word/2010/wordml" xmlns:w15="http://schemas.microsoft.com/office/word/2012/wordml" xmlns:w16cei="http://schemas.microsoft.com/office/word/2026/wordml/cei" xmlns:w16cex="http://schemas.microsoft.com/office/word/2018/wordml/cex" xmlns:w16cid="http://schemas.microsoft.com/office/word/2016/wordml/cid" xmlns:w16="http://schemas.microsoft.com/office/word/2018/wordml" xmlns:w16du="http://schemas.microsoft.com/office/word/2023/wordml/word16du" xmlns:w16sdtdh="http://schemas.microsoft.com/office/word/2020/wordml/sdtdatahash" xmlns:w16sdtfl="http://schemas.microsoft.com/office/word/2024/wordml/sdtformatlock" xmlns:w16se="http://schemas.microsoft.com/office/word/2015/wordml/symex" xmlns:wpg="http://schemas.microsoft.com/office/word/2010/wordprocessingGroup" xmlns:wpi="http://schemas.microsoft.com/office/word/2010/wordprocessingInk" xmlns:wne="http://schemas.microsoft.com/office/word/2006/wordml" xmlns:wps="http://schemas.microsoft.com/office/word/2010/wordprocessingShape" mc:Ignorable="w14 w15 w16se w16cid w16 w16cex w16sdtdh w16sdtfl w16du wp14">
   <w:footnote w:type="separator" w:id="-1">
     <w:p>
       <w:r>
@@ -4972,7 +4004,7 @@
 </file>
 
 <file path=word/header1.xml><?xml version="1.0" encoding="utf-8"?>
-<w:hdr xmlns:wpc="http://schemas.microsoft.com/office/word/2010/wordprocessingCanvas" xmlns:cx="http://schemas.microsoft.com/office/drawing/2014/chartex" xmlns:cx1="http://schemas.microsoft.com/office/drawing/2015/9/8/chartex" xmlns:cx2="http://schemas.microsoft.com/office/drawing/2015/10/21/chartex" xmlns:cx3="http://schemas.microsoft.com/office/drawing/2016/5/9/chartex" xmlns:cx4="http://schemas.microsoft.com/office/drawing/2016/5/10/chartex" xmlns:cx5="http://schemas.microsoft.com/office/drawing/2016/5/11/chartex" xmlns:cx6="http://schemas.microsoft.com/office/drawing/2016/5/12/chartex" xmlns:cx7="http://schemas.microsoft.com/office/drawing/2016/5/13/chartex" xmlns:cx8="http://schemas.microsoft.com/office/drawing/2016/5/14/chartex" xmlns:mc="http://schemas.openxmlformats.org/markup-compatibility/2006" xmlns:aink="http://schemas.microsoft.com/office/drawing/2016/ink" xmlns:am3d="http://schemas.microsoft.com/office/drawing/2017/model3d" xmlns:o="urn:schemas-microsoft-com:office:office" xmlns:oel="http://schemas.microsoft.com/office/2019/extlst" xmlns:r="http://schemas.openxmlformats.org/officeDocument/2006/relationships" xmlns:m="http://schemas.openxmlformats.org/officeDocument/2006/math" xmlns:v="urn:schemas-microsoft-com:vml" xmlns:wp14="http://schemas.microsoft.com/office/word/2010/wordprocessingDrawing" xmlns:wp="http://schemas.openxmlformats.org/drawingml/2006/wordprocessingDrawing" xmlns:w10="urn:schemas-microsoft-com:office:word" xmlns:w="http://schemas.openxmlformats.org/wordprocessingml/2006/main" xmlns:w14="http://schemas.microsoft.com/office/word/2010/wordml" xmlns:w15="http://schemas.microsoft.com/office/word/2012/wordml" xmlns:w16cex="http://schemas.microsoft.com/office/word/2018/wordml/cex" xmlns:w16cid="http://schemas.microsoft.com/office/word/2016/wordml/cid" xmlns:w16="http://schemas.microsoft.com/office/word/2018/wordml" xmlns:w16du="http://schemas.microsoft.com/office/word/2023/wordml/word16du" xmlns:w16sdtdh="http://schemas.microsoft.com/office/word/2020/wordml/sdtdatahash" xmlns:w16sdtfl="http://schemas.microsoft.com/office/word/2024/wordml/sdtformatlock" xmlns:w16se="http://schemas.microsoft.com/office/word/2015/wordml/symex" xmlns:wpg="http://schemas.microsoft.com/office/word/2010/wordprocessingGroup" xmlns:wpi="http://schemas.microsoft.com/office/word/2010/wordprocessingInk" xmlns:wne="http://schemas.microsoft.com/office/word/2006/wordml" xmlns:wps="http://schemas.microsoft.com/office/word/2010/wordprocessingShape" mc:Ignorable="w14 w15 w16se w16cid w16 w16cex w16sdtdh w16sdtfl w16du wp14">
+<w:hdr xmlns:wpc="http://schemas.microsoft.com/office/word/2010/wordprocessingCanvas" xmlns:cx="http://schemas.microsoft.com/office/drawing/2014/chartex" xmlns:cx1="http://schemas.microsoft.com/office/drawing/2015/9/8/chartex" xmlns:cx2="http://schemas.microsoft.com/office/drawing/2015/10/21/chartex" xmlns:cx3="http://schemas.microsoft.com/office/drawing/2016/5/9/chartex" xmlns:cx4="http://schemas.microsoft.com/office/drawing/2016/5/10/chartex" xmlns:cx5="http://schemas.microsoft.com/office/drawing/2016/5/11/chartex" xmlns:cx6="http://schemas.microsoft.com/office/drawing/2016/5/12/chartex" xmlns:cx7="http://schemas.microsoft.com/office/drawing/2016/5/13/chartex" xmlns:cx8="http://schemas.microsoft.com/office/drawing/2016/5/14/chartex" xmlns:mc="http://schemas.openxmlformats.org/markup-compatibility/2006" xmlns:aink="http://schemas.microsoft.com/office/drawing/2016/ink" xmlns:am3d="http://schemas.microsoft.com/office/drawing/2017/model3d" xmlns:o="urn:schemas-microsoft-com:office:office" xmlns:oel="http://schemas.microsoft.com/office/2019/extlst" xmlns:r="http://schemas.openxmlformats.org/officeDocument/2006/relationships" xmlns:m="http://schemas.openxmlformats.org/officeDocument/2006/math" xmlns:v="urn:schemas-microsoft-com:vml" xmlns:wp14="http://schemas.microsoft.com/office/word/2010/wordprocessingDrawing" xmlns:wp="http://schemas.openxmlformats.org/drawingml/2006/wordprocessingDrawing" xmlns:w10="urn:schemas-microsoft-com:office:word" xmlns:w="http://schemas.openxmlformats.org/wordprocessingml/2006/main" xmlns:w14="http://schemas.microsoft.com/office/word/2010/wordml" xmlns:w15="http://schemas.microsoft.com/office/word/2012/wordml" xmlns:w16cei="http://schemas.microsoft.com/office/word/2026/wordml/cei" xmlns:w16cex="http://schemas.microsoft.com/office/word/2018/wordml/cex" xmlns:w16cid="http://schemas.microsoft.com/office/word/2016/wordml/cid" xmlns:w16="http://schemas.microsoft.com/office/word/2018/wordml" xmlns:w16du="http://schemas.microsoft.com/office/word/2023/wordml/word16du" xmlns:w16sdtdh="http://schemas.microsoft.com/office/word/2020/wordml/sdtdatahash" xmlns:w16sdtfl="http://schemas.microsoft.com/office/word/2024/wordml/sdtformatlock" xmlns:w16se="http://schemas.microsoft.com/office/word/2015/wordml/symex" xmlns:wpg="http://schemas.microsoft.com/office/word/2010/wordprocessingGroup" xmlns:wpi="http://schemas.microsoft.com/office/word/2010/wordprocessingInk" xmlns:wne="http://schemas.microsoft.com/office/word/2006/wordml" xmlns:wps="http://schemas.microsoft.com/office/word/2010/wordprocessingShape" mc:Ignorable="w14 w15 w16se w16cid w16 w16cex w16sdtdh w16sdtfl w16du wp14">
   <w:p>
     <w:pPr>
       <w:pStyle w:val="Encabezado"/>
@@ -5002,7 +4034,7 @@
 </file>
 
 <file path=word/numbering.xml><?xml version="1.0" encoding="utf-8"?>
-<w:numbering xmlns:wpc="http://schemas.microsoft.com/office/word/2010/wordprocessingCanvas" xmlns:cx="http://schemas.microsoft.com/office/drawing/2014/chartex" xmlns:cx1="http://schemas.microsoft.com/office/drawing/2015/9/8/chartex" xmlns:cx2="http://schemas.microsoft.com/office/drawing/2015/10/21/chartex" xmlns:cx3="http://schemas.microsoft.com/office/drawing/2016/5/9/chartex" xmlns:cx4="http://schemas.microsoft.com/office/drawing/2016/5/10/chartex" xmlns:cx5="http://schemas.microsoft.com/office/drawing/2016/5/11/chartex" xmlns:cx6="http://schemas.microsoft.com/office/drawing/2016/5/12/chartex" xmlns:cx7="http://schemas.microsoft.com/office/drawing/2016/5/13/chartex" xmlns:cx8="http://schemas.microsoft.com/office/drawing/2016/5/14/chartex" xmlns:mc="http://schemas.openxmlformats.org/markup-compatibility/2006" xmlns:aink="http://schemas.microsoft.com/office/drawing/2016/ink" xmlns:am3d="http://schemas.microsoft.com/office/drawing/2017/model3d" xmlns:o="urn:schemas-microsoft-com:office:office" xmlns:oel="http://schemas.microsoft.com/office/2019/extlst" xmlns:r="http://schemas.openxmlformats.org/officeDocument/2006/relationships" xmlns:m="http://schemas.openxmlformats.org/officeDocument/2006/math" xmlns:v="urn:schemas-microsoft-com:vml" xmlns:wp14="http://schemas.microsoft.com/office/word/2010/wordprocessingDrawing" xmlns:wp="http://schemas.openxmlformats.org/drawingml/2006/wordprocessingDrawing" xmlns:w10="urn:schemas-microsoft-com:office:word" xmlns:w="http://schemas.openxmlformats.org/wordprocessingml/2006/main" xmlns:w14="http://schemas.microsoft.com/office/word/2010/wordml" xmlns:w15="http://schemas.microsoft.com/office/word/2012/wordml" xmlns:w16cex="http://schemas.microsoft.com/office/word/2018/wordml/cex" xmlns:w16cid="http://schemas.microsoft.com/office/word/2016/wordml/cid" xmlns:w16="http://schemas.microsoft.com/office/word/2018/wordml" xmlns:w16du="http://schemas.microsoft.com/office/word/2023/wordml/word16du" xmlns:w16sdtdh="http://schemas.microsoft.com/office/word/2020/wordml/sdtdatahash" xmlns:w16sdtfl="http://schemas.microsoft.com/office/word/2024/wordml/sdtformatlock" xmlns:w16se="http://schemas.microsoft.com/office/word/2015/wordml/symex" xmlns:wpg="http://schemas.microsoft.com/office/word/2010/wordprocessingGroup" xmlns:wpi="http://schemas.microsoft.com/office/word/2010/wordprocessingInk" xmlns:wne="http://schemas.microsoft.com/office/word/2006/wordml" xmlns:wps="http://schemas.microsoft.com/office/word/2010/wordprocessingShape" mc:Ignorable="w14 w15 w16se w16cid w16 w16cex w16sdtdh w16sdtfl w16du wp14">
+<w:numbering xmlns:wpc="http://schemas.microsoft.com/office/word/2010/wordprocessingCanvas" xmlns:cx="http://schemas.microsoft.com/office/drawing/2014/chartex" xmlns:cx1="http://schemas.microsoft.com/office/drawing/2015/9/8/chartex" xmlns:cx2="http://schemas.microsoft.com/office/drawing/2015/10/21/chartex" xmlns:cx3="http://schemas.microsoft.com/office/drawing/2016/5/9/chartex" xmlns:cx4="http://schemas.microsoft.com/office/drawing/2016/5/10/chartex" xmlns:cx5="http://schemas.microsoft.com/office/drawing/2016/5/11/chartex" xmlns:cx6="http://schemas.microsoft.com/office/drawing/2016/5/12/chartex" xmlns:cx7="http://schemas.microsoft.com/office/drawing/2016/5/13/chartex" xmlns:cx8="http://schemas.microsoft.com/office/drawing/2016/5/14/chartex" xmlns:mc="http://schemas.openxmlformats.org/markup-compatibility/2006" xmlns:aink="http://schemas.microsoft.com/office/drawing/2016/ink" xmlns:am3d="http://schemas.microsoft.com/office/drawing/2017/model3d" xmlns:o="urn:schemas-microsoft-com:office:office" xmlns:oel="http://schemas.microsoft.com/office/2019/extlst" xmlns:r="http://schemas.openxmlformats.org/officeDocument/2006/relationships" xmlns:m="http://schemas.openxmlformats.org/officeDocument/2006/math" xmlns:v="urn:schemas-microsoft-com:vml" xmlns:wp14="http://schemas.microsoft.com/office/word/2010/wordprocessingDrawing" xmlns:wp="http://schemas.openxmlformats.org/drawingml/2006/wordprocessingDrawing" xmlns:w10="urn:schemas-microsoft-com:office:word" xmlns:w="http://schemas.openxmlformats.org/wordprocessingml/2006/main" xmlns:w14="http://schemas.microsoft.com/office/word/2010/wordml" xmlns:w15="http://schemas.microsoft.com/office/word/2012/wordml" xmlns:w16cei="http://schemas.microsoft.com/office/word/2026/wordml/cei" xmlns:w16cex="http://schemas.microsoft.com/office/word/2018/wordml/cex" xmlns:w16cid="http://schemas.microsoft.com/office/word/2016/wordml/cid" xmlns:w16="http://schemas.microsoft.com/office/word/2018/wordml" xmlns:w16du="http://schemas.microsoft.com/office/word/2023/wordml/word16du" xmlns:w16sdtdh="http://schemas.microsoft.com/office/word/2020/wordml/sdtdatahash" xmlns:w16sdtfl="http://schemas.microsoft.com/office/word/2024/wordml/sdtformatlock" xmlns:w16se="http://schemas.microsoft.com/office/word/2015/wordml/symex" xmlns:wpg="http://schemas.microsoft.com/office/word/2010/wordprocessingGroup" xmlns:wpi="http://schemas.microsoft.com/office/word/2010/wordprocessingInk" xmlns:wne="http://schemas.microsoft.com/office/word/2006/wordml" xmlns:wps="http://schemas.microsoft.com/office/word/2010/wordprocessingShape" mc:Ignorable="w14 w15 w16se w16cid w16 w16cex w16sdtdh w16sdtfl w16du wp14">
   <w:abstractNum w:abstractNumId="0" w15:restartNumberingAfterBreak="0">
     <w:nsid w:val="FFFFFFFE"/>
     <w:multiLevelType w:val="singleLevel"/>
@@ -10548,7 +9580,7 @@
   <w:style w:type="paragraph" w:default="1" w:styleId="Normal">
     <w:name w:val="Normal"/>
     <w:qFormat/>
-    <w:rsid w:val="000E05A7"/>
+    <w:rsid w:val="0034516F"/>
     <w:rPr>
       <w:sz w:val="24"/>
       <w:szCs w:val="24"/>

</xml_diff>

<commit_message>
Java 3.2 "Arreglos panel de actas"
</commit_message>
<xml_diff>
--- a/backend/src/main/resources/plantillas/Acta de Entrega 2 2 - copia.docx
+++ b/backend/src/main/resources/plantillas/Acta de Entrega 2 2 - copia.docx
@@ -62,7 +62,7 @@
                 <v:shape id="_x0000_i1025" type="#_x0000_t75" style="width:2in;height:42pt" o:ole="">
                   <v:imagedata r:id="rId8" o:title=""/>
                 </v:shape>
-                <o:OLEObject Type="Embed" ProgID="PBrush" ShapeID="_x0000_i1025" DrawAspect="Content" ObjectID="_1846988437" r:id="rId9"/>
+                <o:OLEObject Type="Embed" ProgID="PBrush" ShapeID="_x0000_i1025" DrawAspect="Content" ObjectID="_1847260343" r:id="rId9"/>
               </w:object>
             </w:r>
           </w:p>
@@ -3257,6 +3257,13 @@
             <w:hideMark/>
           </w:tcPr>
           <w:p>
+            <w:pPr>
+              <w:rPr>
+                <w:rFonts w:ascii="Arial Narrow" w:hAnsi="Arial Narrow"/>
+                <w:sz w:val="22"/>
+                <w:szCs w:val="22"/>
+              </w:rPr>
+            </w:pPr>
             <w:r>
               <w:rPr>
                 <w:rFonts w:ascii="Arial Narrow" w:hAnsi="Arial Narrow" w:cs="Arial"/>
@@ -3292,6 +3299,7 @@
               <w:t>}}</w:t>
             </w:r>
           </w:p>
+          <w:p/>
         </w:tc>
       </w:tr>
       <w:tr>
@@ -3313,6 +3321,15 @@
             <w:hideMark/>
           </w:tcPr>
           <w:p>
+            <w:pPr>
+              <w:rPr>
+                <w:rFonts w:ascii="Arial Narrow" w:hAnsi="Arial Narrow" w:cs="Arial"/>
+                <w:bCs/>
+                <w:sz w:val="22"/>
+                <w:szCs w:val="22"/>
+                <w:lang w:val="es-CO"/>
+              </w:rPr>
+            </w:pPr>
             <w:bookmarkStart w:id="16" w:name="OLE_LINK15"/>
             <w:r>
               <w:rPr>
@@ -3330,18 +3347,29 @@
                 <w:szCs w:val="22"/>
                 <w:lang w:val="es-CO"/>
               </w:rPr>
-              <w:t xml:space="preserve"> {{</w:t>
-            </w:r>
-            <w:r>
-              <w:rPr>
-                <w:rFonts w:ascii="Arial Narrow" w:hAnsi="Arial Narrow" w:cs="Arial"/>
-                <w:bCs/>
-                <w:sz w:val="22"/>
-                <w:szCs w:val="22"/>
-                <w:lang w:val="es-CO"/>
-              </w:rPr>
               <w:t xml:space="preserve"> </w:t>
             </w:r>
+            <w:proofErr w:type="gramStart"/>
+            <w:r>
+              <w:rPr>
+                <w:rFonts w:ascii="Arial Narrow" w:hAnsi="Arial Narrow" w:cs="Arial"/>
+                <w:bCs/>
+                <w:sz w:val="22"/>
+                <w:szCs w:val="22"/>
+                <w:lang w:val="es-CO"/>
+              </w:rPr>
+              <w:t>{{</w:t>
+            </w:r>
+            <w:r>
+              <w:rPr>
+                <w:rFonts w:ascii="Arial Narrow" w:hAnsi="Arial Narrow" w:cs="Arial"/>
+                <w:bCs/>
+                <w:sz w:val="22"/>
+                <w:szCs w:val="22"/>
+                <w:lang w:val="es-CO"/>
+              </w:rPr>
+              <w:t xml:space="preserve"> </w:t>
+            </w:r>
             <w:proofErr w:type="spellStart"/>
             <w:r>
               <w:rPr>
@@ -3351,7 +3379,29 @@
                 <w:szCs w:val="22"/>
                 <w:lang w:val="es-CO"/>
               </w:rPr>
-              <w:t>cargo_recibe</w:t>
+              <w:t>cargo</w:t>
+            </w:r>
+            <w:proofErr w:type="gramEnd"/>
+            <w:r>
+              <w:rPr>
+                <w:rFonts w:ascii="Arial Narrow" w:hAnsi="Arial Narrow" w:cs="Arial"/>
+                <w:bCs/>
+                <w:sz w:val="22"/>
+                <w:szCs w:val="22"/>
+                <w:lang w:val="es-CO"/>
+              </w:rPr>
+              <w:t>_</w:t>
+            </w:r>
+            <w:proofErr w:type="gramStart"/>
+            <w:r>
+              <w:rPr>
+                <w:rFonts w:ascii="Arial Narrow" w:hAnsi="Arial Narrow" w:cs="Arial"/>
+                <w:bCs/>
+                <w:sz w:val="22"/>
+                <w:szCs w:val="22"/>
+                <w:lang w:val="es-CO"/>
+              </w:rPr>
+              <w:t>recibe</w:t>
             </w:r>
             <w:proofErr w:type="spellEnd"/>
             <w:r>
@@ -3362,9 +3412,21 @@
                 <w:szCs w:val="22"/>
                 <w:lang w:val="es-CO"/>
               </w:rPr>
-              <w:t xml:space="preserve"> }}</w:t>
+              <w:t xml:space="preserve"> }</w:t>
+            </w:r>
+            <w:proofErr w:type="gramEnd"/>
+            <w:r>
+              <w:rPr>
+                <w:rFonts w:ascii="Arial Narrow" w:hAnsi="Arial Narrow" w:cs="Arial"/>
+                <w:bCs/>
+                <w:sz w:val="22"/>
+                <w:szCs w:val="22"/>
+                <w:lang w:val="es-CO"/>
+              </w:rPr>
+              <w:t>}</w:t>
             </w:r>
           </w:p>
+          <w:p/>
         </w:tc>
       </w:tr>
     </w:tbl>

</xml_diff>

<commit_message>
Java 3.5.2 "Arreglo Alerta Usuario Bloqueado y Mejora Modulo Firmas"
</commit_message>
<xml_diff>
--- a/backend/src/main/resources/plantillas/Acta de Entrega 2 2 - copia.docx
+++ b/backend/src/main/resources/plantillas/Acta de Entrega 2 2 - copia.docx
@@ -1,6 +1,6 @@
 
 <file path=word/document.xml><?xml version="1.0" encoding="utf-8"?>
-<w:document xmlns:wpc="http://schemas.microsoft.com/office/word/2010/wordprocessingCanvas" xmlns:cx="http://schemas.microsoft.com/office/drawing/2014/chartex" xmlns:cx1="http://schemas.microsoft.com/office/drawing/2015/9/8/chartex" xmlns:cx2="http://schemas.microsoft.com/office/drawing/2015/10/21/chartex" xmlns:cx3="http://schemas.microsoft.com/office/drawing/2016/5/9/chartex" xmlns:cx4="http://schemas.microsoft.com/office/drawing/2016/5/10/chartex" xmlns:cx5="http://schemas.microsoft.com/office/drawing/2016/5/11/chartex" xmlns:cx6="http://schemas.microsoft.com/office/drawing/2016/5/12/chartex" xmlns:cx7="http://schemas.microsoft.com/office/drawing/2016/5/13/chartex" xmlns:cx8="http://schemas.microsoft.com/office/drawing/2016/5/14/chartex" xmlns:mc="http://schemas.openxmlformats.org/markup-compatibility/2006" xmlns:aink="http://schemas.microsoft.com/office/drawing/2016/ink" xmlns:am3d="http://schemas.microsoft.com/office/drawing/2017/model3d" xmlns:o="urn:schemas-microsoft-com:office:office" xmlns:oel="http://schemas.microsoft.com/office/2019/extlst" xmlns:r="http://schemas.openxmlformats.org/officeDocument/2006/relationships" xmlns:m="http://schemas.openxmlformats.org/officeDocument/2006/math" xmlns:v="urn:schemas-microsoft-com:vml" xmlns:wp14="http://schemas.microsoft.com/office/word/2010/wordprocessingDrawing" xmlns:wp="http://schemas.openxmlformats.org/drawingml/2006/wordprocessingDrawing" xmlns:w10="urn:schemas-microsoft-com:office:word" xmlns:w="http://schemas.openxmlformats.org/wordprocessingml/2006/main" xmlns:w14="http://schemas.microsoft.com/office/word/2010/wordml" xmlns:w15="http://schemas.microsoft.com/office/word/2012/wordml" xmlns:w16cei="http://schemas.microsoft.com/office/word/2026/wordml/cei" xmlns:w16cex="http://schemas.microsoft.com/office/word/2018/wordml/cex" xmlns:w16cid="http://schemas.microsoft.com/office/word/2016/wordml/cid" xmlns:w16="http://schemas.microsoft.com/office/word/2018/wordml" xmlns:w16du="http://schemas.microsoft.com/office/word/2023/wordml/word16du" xmlns:w16sdtdh="http://schemas.microsoft.com/office/word/2020/wordml/sdtdatahash" xmlns:w16sdtfl="http://schemas.microsoft.com/office/word/2024/wordml/sdtformatlock" xmlns:w16se="http://schemas.microsoft.com/office/word/2015/wordml/symex" xmlns:wpg="http://schemas.microsoft.com/office/word/2010/wordprocessingGroup" xmlns:wpi="http://schemas.microsoft.com/office/word/2010/wordprocessingInk" xmlns:wne="http://schemas.microsoft.com/office/word/2006/wordml" xmlns:wps="http://schemas.microsoft.com/office/word/2010/wordprocessingShape" mc:Ignorable="w14 w15 w16se w16cid w16 w16cex w16sdtdh w16sdtfl w16du wp14">
+<w:document xmlns:wpc="http://schemas.microsoft.com/office/word/2010/wordprocessingCanvas" xmlns:cx="http://schemas.microsoft.com/office/drawing/2014/chartex" xmlns:cx1="http://schemas.microsoft.com/office/drawing/2015/9/8/chartex" xmlns:cx2="http://schemas.microsoft.com/office/drawing/2015/10/21/chartex" xmlns:cx3="http://schemas.microsoft.com/office/drawing/2016/5/9/chartex" xmlns:cx4="http://schemas.microsoft.com/office/drawing/2016/5/10/chartex" xmlns:cx5="http://schemas.microsoft.com/office/drawing/2016/5/11/chartex" xmlns:cx6="http://schemas.microsoft.com/office/drawing/2016/5/12/chartex" xmlns:cx7="http://schemas.microsoft.com/office/drawing/2016/5/13/chartex" xmlns:cx8="http://schemas.microsoft.com/office/drawing/2016/5/14/chartex" xmlns:mc="http://schemas.openxmlformats.org/markup-compatibility/2006" xmlns:aink="http://schemas.microsoft.com/office/drawing/2016/ink" xmlns:am3d="http://schemas.microsoft.com/office/drawing/2017/model3d" xmlns:o="urn:schemas-microsoft-com:office:office" xmlns:oel="http://schemas.microsoft.com/office/2019/extlst" xmlns:r="http://schemas.openxmlformats.org/officeDocument/2006/relationships" xmlns:m="http://schemas.openxmlformats.org/officeDocument/2006/math" xmlns:v="urn:schemas-microsoft-com:vml" xmlns:wp14="http://schemas.microsoft.com/office/word/2010/wordprocessingDrawing" xmlns:wp="http://schemas.openxmlformats.org/drawingml/2006/wordprocessingDrawing" xmlns:w10="urn:schemas-microsoft-com:office:word" xmlns:w="http://schemas.openxmlformats.org/wordprocessingml/2006/main" xmlns:w14="http://schemas.microsoft.com/office/word/2010/wordml" xmlns:w15="http://schemas.microsoft.com/office/word/2012/wordml" xmlns:w16cex="http://schemas.microsoft.com/office/word/2018/wordml/cex" xmlns:w16cid="http://schemas.microsoft.com/office/word/2016/wordml/cid" xmlns:w16="http://schemas.microsoft.com/office/word/2018/wordml" xmlns:w16du="http://schemas.microsoft.com/office/word/2023/wordml/word16du" xmlns:w16sdtdh="http://schemas.microsoft.com/office/word/2020/wordml/sdtdatahash" xmlns:w16sdtfl="http://schemas.microsoft.com/office/word/2024/wordml/sdtformatlock" xmlns:w16se="http://schemas.microsoft.com/office/word/2015/wordml/symex" xmlns:wpg="http://schemas.microsoft.com/office/word/2010/wordprocessingGroup" xmlns:wpi="http://schemas.microsoft.com/office/word/2010/wordprocessingInk" xmlns:wne="http://schemas.microsoft.com/office/word/2006/wordml" xmlns:wps="http://schemas.microsoft.com/office/word/2010/wordprocessingShape" mc:Ignorable="w14 w15 w16se w16cid w16 w16cex w16sdtdh w16sdtfl w16du wp14">
   <w:body>
     <w:tbl>
       <w:tblPr>
@@ -62,7 +62,7 @@
                 <v:shape id="_x0000_i1025" type="#_x0000_t75" style="width:2in;height:42pt" o:ole="">
                   <v:imagedata r:id="rId8" o:title=""/>
                 </v:shape>
-                <o:OLEObject Type="Embed" ProgID="PBrush" ShapeID="_x0000_i1025" DrawAspect="Content" ObjectID="_1847260343" r:id="rId9"/>
+                <o:OLEObject Type="Embed" ProgID="PBrush" ShapeID="_x0000_i1025" DrawAspect="Content" ObjectID="_1849180962" r:id="rId9"/>
               </w:object>
             </w:r>
           </w:p>
@@ -302,7 +302,6 @@
                 <w:lang w:val="es-CO"/>
               </w:rPr>
             </w:pPr>
-            <w:proofErr w:type="gramStart"/>
             <w:r>
               <w:rPr>
                 <w:rFonts w:ascii="Arial Narrow" w:hAnsi="Arial Narrow"/>
@@ -325,7 +324,6 @@
               <w:t>dia</w:t>
             </w:r>
             <w:proofErr w:type="spellEnd"/>
-            <w:proofErr w:type="gramEnd"/>
             <w:r>
               <w:rPr>
                 <w:rFonts w:ascii="Arial Narrow" w:hAnsi="Arial Narrow"/>
@@ -355,7 +353,6 @@
                 <w:lang w:val="es-CO"/>
               </w:rPr>
             </w:pPr>
-            <w:proofErr w:type="gramStart"/>
             <w:r>
               <w:rPr>
                 <w:rFonts w:ascii="Arial Narrow" w:hAnsi="Arial Narrow"/>
@@ -376,7 +373,6 @@
               </w:rPr>
               <w:t>mes</w:t>
             </w:r>
-            <w:proofErr w:type="gramEnd"/>
             <w:r>
               <w:rPr>
                 <w:rFonts w:ascii="Arial Narrow" w:hAnsi="Arial Narrow"/>
@@ -797,6 +793,7 @@
                 <w:lang w:val="es-CO"/>
               </w:rPr>
             </w:pPr>
+            <w:bookmarkStart w:id="5" w:name="OLE_LINK15"/>
             <w:r>
               <w:rPr>
                 <w:rFonts w:ascii="Arial Narrow" w:hAnsi="Arial Narrow" w:cs="Arial"/>
@@ -839,6 +836,7 @@
               </w:rPr>
               <w:t xml:space="preserve"> }}</w:t>
             </w:r>
+            <w:bookmarkEnd w:id="5"/>
           </w:p>
         </w:tc>
       </w:tr>
@@ -1152,8 +1150,8 @@
                 <w:lang w:val="es-CO"/>
               </w:rPr>
             </w:pPr>
-            <w:bookmarkStart w:id="5" w:name="OLE_LINK5"/>
-            <w:bookmarkStart w:id="6" w:name="OLE_LINK7"/>
+            <w:bookmarkStart w:id="6" w:name="OLE_LINK5"/>
+            <w:bookmarkStart w:id="7" w:name="OLE_LINK7"/>
             <w:r>
               <w:rPr>
                 <w:rFonts w:ascii="Arial Narrow" w:hAnsi="Arial Narrow" w:cs="Arial"/>
@@ -1164,7 +1162,7 @@
               </w:rPr>
               <w:t>{{ eq_1_marca }}</w:t>
             </w:r>
-            <w:bookmarkEnd w:id="5"/>
+            <w:bookmarkEnd w:id="6"/>
           </w:p>
         </w:tc>
         <w:tc>
@@ -1183,8 +1181,8 @@
                 <w:lang w:val="es-CO"/>
               </w:rPr>
             </w:pPr>
-            <w:bookmarkStart w:id="7" w:name="OLE_LINK12"/>
-            <w:bookmarkStart w:id="8" w:name="OLE_LINK2"/>
+            <w:bookmarkStart w:id="8" w:name="OLE_LINK12"/>
+            <w:bookmarkStart w:id="9" w:name="OLE_LINK2"/>
             <w:r>
               <w:rPr>
                 <w:rFonts w:ascii="Arial Narrow" w:hAnsi="Arial Narrow" w:cs="Arial"/>
@@ -1195,7 +1193,7 @@
               </w:rPr>
               <w:t>{{ eq_1_tipo }}</w:t>
             </w:r>
-            <w:bookmarkEnd w:id="7"/>
+            <w:bookmarkEnd w:id="8"/>
           </w:p>
         </w:tc>
         <w:tc>
@@ -1214,8 +1212,8 @@
                 <w:lang w:val="es-CO"/>
               </w:rPr>
             </w:pPr>
-            <w:bookmarkStart w:id="9" w:name="OLE_LINK13"/>
-            <w:bookmarkEnd w:id="8"/>
+            <w:bookmarkStart w:id="10" w:name="OLE_LINK13"/>
+            <w:bookmarkEnd w:id="9"/>
             <w:r>
               <w:rPr>
                 <w:rFonts w:ascii="Arial Narrow" w:hAnsi="Arial Narrow" w:cs="Arial"/>
@@ -1226,7 +1224,7 @@
               </w:rPr>
               <w:t>{{ eq_1_modelo }}</w:t>
             </w:r>
-            <w:bookmarkEnd w:id="9"/>
+            <w:bookmarkEnd w:id="10"/>
           </w:p>
         </w:tc>
         <w:tc>
@@ -1245,7 +1243,7 @@
                 <w:lang w:val="es-CO"/>
               </w:rPr>
             </w:pPr>
-            <w:bookmarkStart w:id="10" w:name="OLE_LINK14"/>
+            <w:bookmarkStart w:id="11" w:name="OLE_LINK14"/>
             <w:r>
               <w:rPr>
                 <w:rFonts w:ascii="Arial Narrow" w:hAnsi="Arial Narrow" w:cs="Arial"/>
@@ -1256,7 +1254,7 @@
               </w:rPr>
               <w:t>{{ eq_1_serial }}</w:t>
             </w:r>
-            <w:bookmarkEnd w:id="10"/>
+            <w:bookmarkEnd w:id="11"/>
           </w:p>
         </w:tc>
         <w:tc>
@@ -1275,7 +1273,7 @@
                 <w:lang w:val="es-CO"/>
               </w:rPr>
             </w:pPr>
-            <w:bookmarkStart w:id="11" w:name="OLE_LINK8"/>
+            <w:bookmarkStart w:id="12" w:name="OLE_LINK8"/>
             <w:r>
               <w:rPr>
                 <w:rFonts w:ascii="Arial Narrow" w:hAnsi="Arial Narrow" w:cs="Arial"/>
@@ -1326,11 +1324,11 @@
               </w:rPr>
               <w:t>}</w:t>
             </w:r>
-            <w:bookmarkEnd w:id="11"/>
+            <w:bookmarkEnd w:id="12"/>
           </w:p>
         </w:tc>
       </w:tr>
-      <w:bookmarkEnd w:id="6"/>
+      <w:bookmarkEnd w:id="7"/>
       <w:tr>
         <w:tc>
           <w:tcPr>
@@ -1997,8 +1995,8 @@
                 <w:lang w:val="es-CO"/>
               </w:rPr>
             </w:pPr>
-            <w:bookmarkStart w:id="12" w:name="OLE_LINK1"/>
-            <w:bookmarkStart w:id="13" w:name="OLE_LINK4"/>
+            <w:bookmarkStart w:id="13" w:name="OLE_LINK1"/>
+            <w:bookmarkStart w:id="14" w:name="OLE_LINK4"/>
             <w:r>
               <w:rPr>
                 <w:rFonts w:ascii="Arial Narrow" w:hAnsi="Arial Narrow"/>
@@ -2008,7 +2006,7 @@
               </w:rPr>
               <w:t>{{ hw_1_tipo }}</w:t>
             </w:r>
-            <w:bookmarkEnd w:id="12"/>
+            <w:bookmarkEnd w:id="13"/>
           </w:p>
         </w:tc>
         <w:tc>
@@ -2062,7 +2060,7 @@
           </w:p>
         </w:tc>
       </w:tr>
-      <w:bookmarkEnd w:id="13"/>
+      <w:bookmarkEnd w:id="14"/>
       <w:tr>
         <w:tc>
           <w:tcPr>
@@ -3119,87 +3117,184 @@
         </w:rPr>
         <w:t>Atentamente.</w:t>
       </w:r>
+      <w:r>
+        <w:rPr>
+          <w:rFonts w:ascii="Arial Narrow" w:hAnsi="Arial Narrow" w:cs="Arial"/>
+          <w:szCs w:val="22"/>
+        </w:rPr>
+        <w:t xml:space="preserve"> </w:t>
+      </w:r>
     </w:p>
     <w:tbl>
       <w:tblPr>
-        <w:tblpPr w:leftFromText="141" w:rightFromText="141" w:vertAnchor="text" w:horzAnchor="page" w:tblpX="4801" w:tblpY="416"/>
-        <w:tblW w:w="3285" w:type="dxa"/>
+        <w:tblpPr w:leftFromText="141" w:rightFromText="141" w:vertAnchor="text" w:horzAnchor="page" w:tblpX="4942" w:tblpY="381"/>
+        <w:tblW w:w="0" w:type="auto"/>
+        <w:tblBorders>
+          <w:top w:val="single" w:sz="4" w:space="0" w:color="auto"/>
+          <w:left w:val="single" w:sz="4" w:space="0" w:color="auto"/>
+          <w:bottom w:val="single" w:sz="4" w:space="0" w:color="auto"/>
+          <w:right w:val="single" w:sz="4" w:space="0" w:color="auto"/>
+          <w:insideH w:val="single" w:sz="4" w:space="0" w:color="auto"/>
+          <w:insideV w:val="single" w:sz="4" w:space="0" w:color="auto"/>
+        </w:tblBorders>
         <w:tblCellMar>
-          <w:left w:w="0" w:type="dxa"/>
-          <w:right w:w="0" w:type="dxa"/>
+          <w:left w:w="70" w:type="dxa"/>
+          <w:right w:w="70" w:type="dxa"/>
         </w:tblCellMar>
-        <w:tblLook w:val="04A0" w:firstRow="1" w:lastRow="0" w:firstColumn="1" w:lastColumn="0" w:noHBand="0" w:noVBand="1"/>
+        <w:tblLook w:val="0000" w:firstRow="0" w:lastRow="0" w:firstColumn="0" w:lastColumn="0" w:noHBand="0" w:noVBand="0"/>
       </w:tblPr>
       <w:tblGrid>
-        <w:gridCol w:w="3285"/>
+        <w:gridCol w:w="3189"/>
+        <w:gridCol w:w="2977"/>
       </w:tblGrid>
       <w:tr>
+        <w:trPr>
+          <w:trHeight w:val="360"/>
+        </w:trPr>
         <w:tc>
           <w:tcPr>
-            <w:tcW w:w="3285" w:type="dxa"/>
+            <w:tcW w:w="3189" w:type="dxa"/>
             <w:tcBorders>
-              <w:top w:val="single" w:sz="8" w:space="0" w:color="auto"/>
-              <w:left w:val="single" w:sz="8" w:space="0" w:color="auto"/>
-              <w:bottom w:val="single" w:sz="8" w:space="0" w:color="auto"/>
-              <w:right w:val="single" w:sz="8" w:space="0" w:color="auto"/>
+              <w:top w:val="single" w:sz="12" w:space="0" w:color="auto"/>
+              <w:left w:val="single" w:sz="12" w:space="0" w:color="auto"/>
+              <w:bottom w:val="single" w:sz="12" w:space="0" w:color="auto"/>
+              <w:right w:val="single" w:sz="12" w:space="0" w:color="auto"/>
             </w:tcBorders>
-            <w:shd w:val="clear" w:color="auto" w:fill="F2F2F2"/>
-            <w:tcMar>
-              <w:top w:w="0" w:type="dxa"/>
-              <w:left w:w="108" w:type="dxa"/>
-              <w:bottom w:w="0" w:type="dxa"/>
-              <w:right w:w="108" w:type="dxa"/>
-            </w:tcMar>
-            <w:vAlign w:val="center"/>
-            <w:hideMark/>
+            <w:shd w:val="clear" w:color="auto" w:fill="D9D9D9" w:themeFill="background1" w:themeFillShade="D9"/>
           </w:tcPr>
           <w:p>
             <w:pPr>
               <w:jc w:val="center"/>
+              <w:rPr>
+                <w:rFonts w:ascii="Arial Narrow" w:hAnsi="Arial Narrow" w:cs="Arial"/>
+                <w:b/>
+                <w:bCs/>
+                <w:sz w:val="22"/>
+                <w:szCs w:val="22"/>
+              </w:rPr>
             </w:pPr>
-            <w:bookmarkStart w:id="14" w:name="OLE_LINK20"/>
-            <w:bookmarkStart w:id="15" w:name="OLE_LINK17"/>
-            <w:r>
-              <w:rPr>
-                <w:rFonts w:ascii="Arial Narrow" w:hAnsi="Arial Narrow"/>
+            <w:bookmarkStart w:id="15" w:name="OLE_LINK28"/>
+            <w:r>
+              <w:rPr>
+                <w:rFonts w:ascii="Arial Narrow" w:hAnsi="Arial Narrow" w:cs="Arial"/>
                 <w:b/>
                 <w:bCs/>
+                <w:sz w:val="22"/>
+                <w:szCs w:val="22"/>
+              </w:rPr>
+              <w:t>Entrega</w:t>
+            </w:r>
+          </w:p>
+        </w:tc>
+        <w:tc>
+          <w:tcPr>
+            <w:tcW w:w="2977" w:type="dxa"/>
+            <w:tcBorders>
+              <w:top w:val="single" w:sz="12" w:space="0" w:color="auto"/>
+              <w:left w:val="single" w:sz="12" w:space="0" w:color="auto"/>
+              <w:bottom w:val="single" w:sz="12" w:space="0" w:color="auto"/>
+              <w:right w:val="single" w:sz="12" w:space="0" w:color="auto"/>
+            </w:tcBorders>
+            <w:shd w:val="clear" w:color="auto" w:fill="D9D9D9" w:themeFill="background1" w:themeFillShade="D9"/>
+          </w:tcPr>
+          <w:p>
+            <w:pPr>
+              <w:jc w:val="center"/>
+              <w:rPr>
+                <w:rFonts w:ascii="Arial Narrow" w:hAnsi="Arial Narrow" w:cs="Arial"/>
+                <w:color w:val="D9D9D9" w:themeColor="background1" w:themeShade="D9"/>
+                <w:sz w:val="22"/>
+                <w:szCs w:val="22"/>
+              </w:rPr>
+            </w:pPr>
+            <w:r>
+              <w:rPr>
+                <w:rFonts w:ascii="Arial Narrow" w:hAnsi="Arial Narrow"/>
+                <w:b/>
+                <w:bCs/>
                 <w:color w:val="000000"/>
                 <w:sz w:val="22"/>
                 <w:szCs w:val="22"/>
               </w:rPr>
-              <w:t>Entrega</w:t>
+              <w:t>Foto Usuario</w:t>
             </w:r>
           </w:p>
         </w:tc>
       </w:tr>
       <w:tr>
         <w:trPr>
-          <w:trHeight w:val="1000"/>
+          <w:trHeight w:val="1280"/>
         </w:trPr>
         <w:tc>
           <w:tcPr>
-            <w:tcW w:w="3285" w:type="dxa"/>
+            <w:tcW w:w="3189" w:type="dxa"/>
             <w:tcBorders>
-              <w:top w:val="nil"/>
-              <w:left w:val="single" w:sz="8" w:space="0" w:color="auto"/>
-              <w:bottom w:val="single" w:sz="8" w:space="0" w:color="auto"/>
-              <w:right w:val="single" w:sz="8" w:space="0" w:color="auto"/>
+              <w:top w:val="single" w:sz="12" w:space="0" w:color="auto"/>
+              <w:left w:val="single" w:sz="12" w:space="0" w:color="auto"/>
+              <w:bottom w:val="single" w:sz="12" w:space="0" w:color="auto"/>
+              <w:right w:val="single" w:sz="12" w:space="0" w:color="auto"/>
             </w:tcBorders>
-            <w:tcMar>
-              <w:top w:w="0" w:type="dxa"/>
-              <w:left w:w="108" w:type="dxa"/>
-              <w:bottom w:w="0" w:type="dxa"/>
-              <w:right w:w="108" w:type="dxa"/>
-            </w:tcMar>
             <w:vAlign w:val="center"/>
-            <w:hideMark/>
+          </w:tcPr>
+          <w:p>
+            <w:pPr>
+              <w:ind w:left="88"/>
+              <w:jc w:val="center"/>
+              <w:rPr>
+                <w:rFonts w:ascii="Arial Narrow" w:hAnsi="Arial Narrow" w:cs="Arial"/>
+                <w:sz w:val="22"/>
+                <w:szCs w:val="22"/>
+              </w:rPr>
+            </w:pPr>
+            <w:r>
+              <w:rPr>
+                <w:rFonts w:ascii="Arial Narrow" w:hAnsi="Arial Narrow" w:cs="Arial"/>
+                <w:bCs/>
+                <w:sz w:val="22"/>
+                <w:szCs w:val="22"/>
+              </w:rPr>
+              <w:t>{{</w:t>
+            </w:r>
+            <w:proofErr w:type="spellStart"/>
+            <w:r>
+              <w:rPr>
+                <w:rFonts w:ascii="Arial Narrow" w:hAnsi="Arial Narrow" w:cs="Arial"/>
+                <w:bCs/>
+                <w:sz w:val="22"/>
+                <w:szCs w:val="22"/>
+              </w:rPr>
+              <w:t>firma_usuario</w:t>
+            </w:r>
+            <w:proofErr w:type="spellEnd"/>
+            <w:r>
+              <w:rPr>
+                <w:rFonts w:ascii="Arial Narrow" w:hAnsi="Arial Narrow" w:cs="Arial"/>
+                <w:bCs/>
+                <w:sz w:val="22"/>
+                <w:szCs w:val="22"/>
+              </w:rPr>
+              <w:t>}}</w:t>
+            </w:r>
+          </w:p>
+        </w:tc>
+        <w:tc>
+          <w:tcPr>
+            <w:tcW w:w="2977" w:type="dxa"/>
+            <w:vMerge w:val="restart"/>
+            <w:tcBorders>
+              <w:top w:val="single" w:sz="12" w:space="0" w:color="auto"/>
+              <w:left w:val="single" w:sz="12" w:space="0" w:color="auto"/>
+              <w:bottom w:val="single" w:sz="12" w:space="0" w:color="auto"/>
+              <w:right w:val="single" w:sz="12" w:space="0" w:color="auto"/>
+            </w:tcBorders>
+            <w:vAlign w:val="center"/>
           </w:tcPr>
           <w:p>
             <w:pPr>
               <w:jc w:val="center"/>
               <w:rPr>
                 <w:rFonts w:ascii="Arial" w:hAnsi="Arial" w:cs="Arial"/>
+                <w:u w:val="single"/>
               </w:rPr>
             </w:pPr>
             <w:r>
@@ -3219,7 +3314,7 @@
                 <w:sz w:val="22"/>
                 <w:szCs w:val="22"/>
               </w:rPr>
-              <w:t>firma_usuario</w:t>
+              <w:t>foto_usuario</w:t>
             </w:r>
             <w:proofErr w:type="spellEnd"/>
             <w:r>
@@ -3232,451 +3327,13 @@
               <w:t>}}</w:t>
             </w:r>
           </w:p>
-          <w:p/>
-        </w:tc>
-      </w:tr>
-      <w:tr>
-        <w:trPr>
-          <w:trHeight w:val="217"/>
-        </w:trPr>
-        <w:tc>
-          <w:tcPr>
-            <w:tcW w:w="3285" w:type="dxa"/>
-            <w:tcBorders>
-              <w:top w:val="nil"/>
-              <w:left w:val="single" w:sz="8" w:space="0" w:color="auto"/>
-              <w:bottom w:val="single" w:sz="8" w:space="0" w:color="auto"/>
-              <w:right w:val="single" w:sz="8" w:space="0" w:color="auto"/>
-            </w:tcBorders>
-            <w:tcMar>
-              <w:top w:w="0" w:type="dxa"/>
-              <w:left w:w="108" w:type="dxa"/>
-              <w:bottom w:w="0" w:type="dxa"/>
-              <w:right w:w="108" w:type="dxa"/>
-            </w:tcMar>
-            <w:hideMark/>
-          </w:tcPr>
-          <w:p>
-            <w:pPr>
-              <w:rPr>
-                <w:rFonts w:ascii="Arial Narrow" w:hAnsi="Arial Narrow"/>
-                <w:sz w:val="22"/>
-                <w:szCs w:val="22"/>
-              </w:rPr>
-            </w:pPr>
-            <w:r>
-              <w:rPr>
-                <w:rFonts w:ascii="Arial Narrow" w:hAnsi="Arial Narrow" w:cs="Arial"/>
-                <w:sz w:val="22"/>
-                <w:szCs w:val="22"/>
-              </w:rPr>
-              <w:t>Recibido por</w:t>
-            </w:r>
-            <w:r>
-              <w:rPr>
-                <w:rFonts w:ascii="Arial Narrow" w:hAnsi="Arial Narrow"/>
-                <w:sz w:val="22"/>
-                <w:szCs w:val="22"/>
-              </w:rPr>
-              <w:t>: {{</w:t>
-            </w:r>
-            <w:proofErr w:type="spellStart"/>
-            <w:r>
-              <w:rPr>
-                <w:rFonts w:ascii="Arial Narrow" w:hAnsi="Arial Narrow"/>
-                <w:sz w:val="22"/>
-                <w:szCs w:val="22"/>
-              </w:rPr>
-              <w:t>entregado_a</w:t>
-            </w:r>
-            <w:proofErr w:type="spellEnd"/>
-            <w:r>
-              <w:rPr>
-                <w:rFonts w:ascii="Arial Narrow" w:hAnsi="Arial Narrow"/>
-                <w:sz w:val="22"/>
-                <w:szCs w:val="22"/>
-              </w:rPr>
-              <w:t>}}</w:t>
-            </w:r>
-          </w:p>
-          <w:p/>
-        </w:tc>
-      </w:tr>
-      <w:tr>
-        <w:tc>
-          <w:tcPr>
-            <w:tcW w:w="3285" w:type="dxa"/>
-            <w:tcBorders>
-              <w:top w:val="nil"/>
-              <w:left w:val="single" w:sz="8" w:space="0" w:color="auto"/>
-              <w:bottom w:val="single" w:sz="8" w:space="0" w:color="auto"/>
-              <w:right w:val="single" w:sz="8" w:space="0" w:color="auto"/>
-            </w:tcBorders>
-            <w:tcMar>
-              <w:top w:w="0" w:type="dxa"/>
-              <w:left w:w="108" w:type="dxa"/>
-              <w:bottom w:w="0" w:type="dxa"/>
-              <w:right w:w="108" w:type="dxa"/>
-            </w:tcMar>
-            <w:hideMark/>
-          </w:tcPr>
-          <w:p>
-            <w:pPr>
-              <w:rPr>
-                <w:rFonts w:ascii="Arial Narrow" w:hAnsi="Arial Narrow" w:cs="Arial"/>
-                <w:bCs/>
-                <w:sz w:val="22"/>
-                <w:szCs w:val="22"/>
-                <w:lang w:val="es-CO"/>
-              </w:rPr>
-            </w:pPr>
-            <w:bookmarkStart w:id="16" w:name="OLE_LINK15"/>
-            <w:r>
-              <w:rPr>
-                <w:rFonts w:ascii="Arial Narrow" w:hAnsi="Arial Narrow"/>
-                <w:sz w:val="22"/>
-                <w:szCs w:val="22"/>
-              </w:rPr>
-              <w:t>Cargo:</w:t>
-            </w:r>
-            <w:r>
-              <w:rPr>
-                <w:rFonts w:ascii="Arial Narrow" w:hAnsi="Arial Narrow" w:cs="Arial"/>
-                <w:bCs/>
-                <w:sz w:val="22"/>
-                <w:szCs w:val="22"/>
-                <w:lang w:val="es-CO"/>
-              </w:rPr>
-              <w:t xml:space="preserve"> </w:t>
-            </w:r>
-            <w:proofErr w:type="gramStart"/>
-            <w:r>
-              <w:rPr>
-                <w:rFonts w:ascii="Arial Narrow" w:hAnsi="Arial Narrow" w:cs="Arial"/>
-                <w:bCs/>
-                <w:sz w:val="22"/>
-                <w:szCs w:val="22"/>
-                <w:lang w:val="es-CO"/>
-              </w:rPr>
-              <w:t>{{</w:t>
-            </w:r>
-            <w:r>
-              <w:rPr>
-                <w:rFonts w:ascii="Arial Narrow" w:hAnsi="Arial Narrow" w:cs="Arial"/>
-                <w:bCs/>
-                <w:sz w:val="22"/>
-                <w:szCs w:val="22"/>
-                <w:lang w:val="es-CO"/>
-              </w:rPr>
-              <w:t xml:space="preserve"> </w:t>
-            </w:r>
-            <w:proofErr w:type="spellStart"/>
-            <w:r>
-              <w:rPr>
-                <w:rFonts w:ascii="Arial Narrow" w:hAnsi="Arial Narrow" w:cs="Arial"/>
-                <w:bCs/>
-                <w:sz w:val="22"/>
-                <w:szCs w:val="22"/>
-                <w:lang w:val="es-CO"/>
-              </w:rPr>
-              <w:t>cargo</w:t>
-            </w:r>
-            <w:proofErr w:type="gramEnd"/>
-            <w:r>
-              <w:rPr>
-                <w:rFonts w:ascii="Arial Narrow" w:hAnsi="Arial Narrow" w:cs="Arial"/>
-                <w:bCs/>
-                <w:sz w:val="22"/>
-                <w:szCs w:val="22"/>
-                <w:lang w:val="es-CO"/>
-              </w:rPr>
-              <w:t>_</w:t>
-            </w:r>
-            <w:proofErr w:type="gramStart"/>
-            <w:r>
-              <w:rPr>
-                <w:rFonts w:ascii="Arial Narrow" w:hAnsi="Arial Narrow" w:cs="Arial"/>
-                <w:bCs/>
-                <w:sz w:val="22"/>
-                <w:szCs w:val="22"/>
-                <w:lang w:val="es-CO"/>
-              </w:rPr>
-              <w:t>recibe</w:t>
-            </w:r>
-            <w:proofErr w:type="spellEnd"/>
-            <w:r>
-              <w:rPr>
-                <w:rFonts w:ascii="Arial Narrow" w:hAnsi="Arial Narrow" w:cs="Arial"/>
-                <w:bCs/>
-                <w:sz w:val="22"/>
-                <w:szCs w:val="22"/>
-                <w:lang w:val="es-CO"/>
-              </w:rPr>
-              <w:t xml:space="preserve"> }</w:t>
-            </w:r>
-            <w:proofErr w:type="gramEnd"/>
-            <w:r>
-              <w:rPr>
-                <w:rFonts w:ascii="Arial Narrow" w:hAnsi="Arial Narrow" w:cs="Arial"/>
-                <w:bCs/>
-                <w:sz w:val="22"/>
-                <w:szCs w:val="22"/>
-                <w:lang w:val="es-CO"/>
-              </w:rPr>
-              <w:t>}</w:t>
-            </w:r>
-          </w:p>
-          <w:p/>
-        </w:tc>
-      </w:tr>
-    </w:tbl>
-    <w:tbl>
-      <w:tblPr>
-        <w:tblpPr w:leftFromText="141" w:rightFromText="141" w:vertAnchor="text" w:horzAnchor="page" w:tblpX="8071" w:tblpY="416"/>
-        <w:tblW w:w="3285" w:type="dxa"/>
-        <w:tblCellMar>
-          <w:left w:w="0" w:type="dxa"/>
-          <w:right w:w="0" w:type="dxa"/>
-        </w:tblCellMar>
-        <w:tblLook w:val="04A0" w:firstRow="1" w:lastRow="0" w:firstColumn="1" w:lastColumn="0" w:noHBand="0" w:noVBand="1"/>
-      </w:tblPr>
-      <w:tblGrid>
-        <w:gridCol w:w="3285"/>
-      </w:tblGrid>
-      <w:tr>
-        <w:tc>
-          <w:tcPr>
-            <w:tcW w:w="3285" w:type="dxa"/>
-            <w:tcBorders>
-              <w:top w:val="single" w:sz="8" w:space="0" w:color="auto"/>
-              <w:left w:val="single" w:sz="8" w:space="0" w:color="auto"/>
-              <w:bottom w:val="single" w:sz="8" w:space="0" w:color="auto"/>
-              <w:right w:val="single" w:sz="8" w:space="0" w:color="auto"/>
-            </w:tcBorders>
-            <w:shd w:val="clear" w:color="auto" w:fill="F2F2F2"/>
-            <w:tcMar>
-              <w:top w:w="0" w:type="dxa"/>
-              <w:left w:w="108" w:type="dxa"/>
-              <w:bottom w:w="0" w:type="dxa"/>
-              <w:right w:w="108" w:type="dxa"/>
-            </w:tcMar>
-            <w:vAlign w:val="center"/>
-            <w:hideMark/>
-          </w:tcPr>
           <w:p>
             <w:pPr>
               <w:jc w:val="center"/>
               <w:rPr>
-                <w:u w:val="single"/>
-              </w:rPr>
-            </w:pPr>
-            <w:bookmarkStart w:id="17" w:name="OLE_LINK19"/>
-            <w:r>
-              <w:rPr>
-                <w:rFonts w:ascii="Arial Narrow" w:hAnsi="Arial Narrow"/>
-                <w:b/>
-                <w:bCs/>
-                <w:color w:val="000000"/>
-                <w:sz w:val="22"/>
-                <w:szCs w:val="22"/>
-              </w:rPr>
-              <w:t>Foto Usuario</w:t>
-            </w:r>
-          </w:p>
-        </w:tc>
-      </w:tr>
-      <w:tr>
-        <w:trPr>
-          <w:trHeight w:val="1276"/>
-        </w:trPr>
-        <w:tc>
-          <w:tcPr>
-            <w:tcW w:w="3285" w:type="dxa"/>
-            <w:tcBorders>
-              <w:top w:val="nil"/>
-              <w:left w:val="single" w:sz="8" w:space="0" w:color="auto"/>
-              <w:right w:val="single" w:sz="8" w:space="0" w:color="auto"/>
-            </w:tcBorders>
-            <w:tcMar>
-              <w:top w:w="0" w:type="dxa"/>
-              <w:left w:w="108" w:type="dxa"/>
-              <w:bottom w:w="0" w:type="dxa"/>
-              <w:right w:w="108" w:type="dxa"/>
-            </w:tcMar>
-            <w:vAlign w:val="center"/>
-            <w:hideMark/>
-          </w:tcPr>
-          <w:p>
-            <w:pPr>
-              <w:jc w:val="center"/>
-              <w:rPr>
-                <w:rFonts w:ascii="Arial" w:hAnsi="Arial" w:cs="Arial"/>
-                <w:u w:val="single"/>
-              </w:rPr>
-            </w:pPr>
-            <w:bookmarkStart w:id="18" w:name="OLE_LINK16"/>
-            <w:r>
-              <w:rPr>
-                <w:rFonts w:ascii="Arial Narrow" w:hAnsi="Arial Narrow" w:cs="Arial"/>
-                <w:bCs/>
-                <w:sz w:val="22"/>
-                <w:szCs w:val="22"/>
-              </w:rPr>
-              <w:t>{{</w:t>
-            </w:r>
-            <w:proofErr w:type="spellStart"/>
-            <w:r>
-              <w:rPr>
-                <w:rFonts w:ascii="Arial Narrow" w:hAnsi="Arial Narrow" w:cs="Arial"/>
-                <w:bCs/>
-                <w:sz w:val="22"/>
-                <w:szCs w:val="22"/>
-              </w:rPr>
-              <w:t>foto_usuario</w:t>
-            </w:r>
-            <w:proofErr w:type="spellEnd"/>
-            <w:r>
-              <w:rPr>
-                <w:rFonts w:ascii="Arial Narrow" w:hAnsi="Arial Narrow" w:cs="Arial"/>
-                <w:bCs/>
-                <w:sz w:val="22"/>
-                <w:szCs w:val="22"/>
-              </w:rPr>
-              <w:t>}}</w:t>
-            </w:r>
-          </w:p>
-          <w:p/>
-        </w:tc>
-      </w:tr>
-      <w:tr>
-        <w:tc>
-          <w:tcPr>
-            <w:tcW w:w="3285" w:type="dxa"/>
-            <w:tcBorders>
-              <w:top w:val="nil"/>
-              <w:left w:val="single" w:sz="8" w:space="0" w:color="auto"/>
-              <w:bottom w:val="single" w:sz="8" w:space="0" w:color="auto"/>
-              <w:right w:val="single" w:sz="8" w:space="0" w:color="auto"/>
-            </w:tcBorders>
-            <w:tcMar>
-              <w:top w:w="0" w:type="dxa"/>
-              <w:left w:w="108" w:type="dxa"/>
-              <w:bottom w:w="0" w:type="dxa"/>
-              <w:right w:w="108" w:type="dxa"/>
-            </w:tcMar>
-            <w:vAlign w:val="center"/>
-          </w:tcPr>
-          <w:p/>
-        </w:tc>
-      </w:tr>
-    </w:tbl>
-    <w:tbl>
-      <w:tblPr>
-        <w:tblpPr w:leftFromText="141" w:rightFromText="141" w:vertAnchor="text" w:horzAnchor="page" w:tblpX="1126" w:tblpY="401"/>
-        <w:tblW w:w="3285" w:type="dxa"/>
-        <w:tblCellMar>
-          <w:left w:w="0" w:type="dxa"/>
-          <w:right w:w="0" w:type="dxa"/>
-        </w:tblCellMar>
-        <w:tblLook w:val="04A0" w:firstRow="1" w:lastRow="0" w:firstColumn="1" w:lastColumn="0" w:noHBand="0" w:noVBand="1"/>
-      </w:tblPr>
-      <w:tblGrid>
-        <w:gridCol w:w="3285"/>
-      </w:tblGrid>
-      <w:tr>
-        <w:tc>
-          <w:tcPr>
-            <w:tcW w:w="3285" w:type="dxa"/>
-            <w:tcBorders>
-              <w:top w:val="single" w:sz="8" w:space="0" w:color="auto"/>
-              <w:left w:val="single" w:sz="8" w:space="0" w:color="auto"/>
-              <w:bottom w:val="single" w:sz="8" w:space="0" w:color="auto"/>
-              <w:right w:val="single" w:sz="8" w:space="0" w:color="auto"/>
-            </w:tcBorders>
-            <w:shd w:val="clear" w:color="auto" w:fill="F2F2F2"/>
-            <w:tcMar>
-              <w:top w:w="0" w:type="dxa"/>
-              <w:left w:w="108" w:type="dxa"/>
-              <w:bottom w:w="0" w:type="dxa"/>
-              <w:right w:w="108" w:type="dxa"/>
-            </w:tcMar>
-            <w:vAlign w:val="center"/>
-            <w:hideMark/>
-          </w:tcPr>
-          <w:p>
-            <w:pPr>
-              <w:jc w:val="center"/>
-            </w:pPr>
-            <w:bookmarkStart w:id="19" w:name="OLE_LINK18"/>
-            <w:bookmarkEnd w:id="14"/>
-            <w:bookmarkEnd w:id="17"/>
-            <w:r>
-              <w:rPr>
-                <w:rFonts w:ascii="Arial Narrow" w:hAnsi="Arial Narrow"/>
-                <w:b/>
-                <w:bCs/>
-                <w:color w:val="000000"/>
-                <w:sz w:val="22"/>
-                <w:szCs w:val="22"/>
-              </w:rPr>
-              <w:t>Dirección Infraestructura</w:t>
-            </w:r>
-          </w:p>
-        </w:tc>
-      </w:tr>
-      <w:bookmarkEnd w:id="15"/>
-      <w:bookmarkEnd w:id="16"/>
-      <w:bookmarkEnd w:id="18"/>
-      <w:tr>
-        <w:trPr>
-          <w:trHeight w:val="1217"/>
-        </w:trPr>
-        <w:tc>
-          <w:tcPr>
-            <w:tcW w:w="3285" w:type="dxa"/>
-            <w:tcBorders>
-              <w:top w:val="nil"/>
-              <w:left w:val="single" w:sz="8" w:space="0" w:color="auto"/>
-              <w:right w:val="single" w:sz="8" w:space="0" w:color="auto"/>
-            </w:tcBorders>
-            <w:tcMar>
-              <w:top w:w="0" w:type="dxa"/>
-              <w:left w:w="108" w:type="dxa"/>
-              <w:bottom w:w="0" w:type="dxa"/>
-              <w:right w:w="108" w:type="dxa"/>
-            </w:tcMar>
-            <w:vAlign w:val="center"/>
-            <w:hideMark/>
-          </w:tcPr>
-          <w:p>
-            <w:pPr>
-              <w:rPr>
-                <w:rFonts w:ascii="Arial" w:hAnsi="Arial" w:cs="Arial"/>
-              </w:rPr>
-            </w:pPr>
-            <w:r>
-              <w:rPr>
-                <w:rFonts w:ascii="Arial Narrow" w:hAnsi="Arial Narrow" w:cs="Arial"/>
-                <w:bCs/>
-                <w:sz w:val="22"/>
-                <w:szCs w:val="22"/>
-              </w:rPr>
-              <w:t xml:space="preserve">         </w:t>
-            </w:r>
-            <w:r>
-              <w:rPr>
-                <w:rFonts w:ascii="Arial Narrow" w:hAnsi="Arial Narrow" w:cs="Arial"/>
-                <w:bCs/>
-                <w:sz w:val="22"/>
-                <w:szCs w:val="22"/>
-              </w:rPr>
-              <w:t xml:space="preserve">      </w:t>
-            </w:r>
-          </w:p>
-          <w:p>
-            <w:pPr>
-              <w:rPr>
-                <w:u w:val="single"/>
+                <w:rFonts w:ascii="Arial Narrow" w:hAnsi="Arial Narrow" w:cs="Arial"/>
+                <w:sz w:val="22"/>
+                <w:szCs w:val="22"/>
               </w:rPr>
             </w:pPr>
           </w:p>
@@ -3684,34 +3341,465 @@
       </w:tr>
       <w:tr>
         <w:trPr>
-          <w:trHeight w:val="323"/>
+          <w:trHeight w:val="280"/>
         </w:trPr>
         <w:tc>
           <w:tcPr>
-            <w:tcW w:w="3285" w:type="dxa"/>
+            <w:tcW w:w="3189" w:type="dxa"/>
             <w:tcBorders>
-              <w:top w:val="nil"/>
-              <w:left w:val="single" w:sz="8" w:space="0" w:color="auto"/>
-              <w:bottom w:val="single" w:sz="8" w:space="0" w:color="auto"/>
-              <w:right w:val="single" w:sz="8" w:space="0" w:color="auto"/>
+              <w:top w:val="single" w:sz="12" w:space="0" w:color="auto"/>
+              <w:left w:val="single" w:sz="12" w:space="0" w:color="auto"/>
+              <w:bottom w:val="single" w:sz="12" w:space="0" w:color="auto"/>
+              <w:right w:val="single" w:sz="12" w:space="0" w:color="auto"/>
             </w:tcBorders>
-            <w:tcMar>
-              <w:top w:w="0" w:type="dxa"/>
-              <w:left w:w="108" w:type="dxa"/>
-              <w:bottom w:w="0" w:type="dxa"/>
-              <w:right w:w="108" w:type="dxa"/>
-            </w:tcMar>
-            <w:hideMark/>
           </w:tcPr>
-          <w:p/>
+          <w:p>
+            <w:pPr>
+              <w:ind w:left="88"/>
+              <w:rPr>
+                <w:rFonts w:ascii="Arial Narrow" w:hAnsi="Arial Narrow" w:cs="Arial"/>
+                <w:sz w:val="22"/>
+                <w:szCs w:val="22"/>
+              </w:rPr>
+            </w:pPr>
+            <w:r>
+              <w:rPr>
+                <w:rFonts w:ascii="Arial Narrow" w:hAnsi="Arial Narrow" w:cs="Arial"/>
+                <w:sz w:val="22"/>
+                <w:szCs w:val="22"/>
+              </w:rPr>
+              <w:t>Recibido por</w:t>
+            </w:r>
+            <w:r>
+              <w:rPr>
+                <w:rFonts w:ascii="Arial Narrow" w:hAnsi="Arial Narrow"/>
+                <w:sz w:val="22"/>
+                <w:szCs w:val="22"/>
+              </w:rPr>
+              <w:t>: {{</w:t>
+            </w:r>
+            <w:proofErr w:type="spellStart"/>
+            <w:r>
+              <w:rPr>
+                <w:rFonts w:ascii="Arial Narrow" w:hAnsi="Arial Narrow"/>
+                <w:sz w:val="22"/>
+                <w:szCs w:val="22"/>
+              </w:rPr>
+              <w:t>entregado_por</w:t>
+            </w:r>
+            <w:proofErr w:type="spellEnd"/>
+            <w:r>
+              <w:rPr>
+                <w:rFonts w:ascii="Arial Narrow" w:hAnsi="Arial Narrow"/>
+                <w:sz w:val="22"/>
+                <w:szCs w:val="22"/>
+              </w:rPr>
+              <w:t>}}</w:t>
+            </w:r>
+          </w:p>
+        </w:tc>
+        <w:tc>
+          <w:tcPr>
+            <w:tcW w:w="2977" w:type="dxa"/>
+            <w:vMerge/>
+            <w:tcBorders>
+              <w:top w:val="single" w:sz="12" w:space="0" w:color="auto"/>
+              <w:left w:val="single" w:sz="12" w:space="0" w:color="auto"/>
+              <w:bottom w:val="single" w:sz="12" w:space="0" w:color="auto"/>
+              <w:right w:val="single" w:sz="12" w:space="0" w:color="auto"/>
+            </w:tcBorders>
+          </w:tcPr>
+          <w:p>
+            <w:pPr>
+              <w:jc w:val="center"/>
+              <w:rPr>
+                <w:rFonts w:ascii="Arial Narrow" w:hAnsi="Arial Narrow" w:cs="Arial"/>
+                <w:sz w:val="22"/>
+                <w:szCs w:val="22"/>
+              </w:rPr>
+            </w:pPr>
+          </w:p>
         </w:tc>
       </w:tr>
-      <w:bookmarkEnd w:id="19"/>
+      <w:tr>
+        <w:trPr>
+          <w:trHeight w:val="240"/>
+        </w:trPr>
+        <w:tc>
+          <w:tcPr>
+            <w:tcW w:w="3189" w:type="dxa"/>
+            <w:tcBorders>
+              <w:top w:val="single" w:sz="12" w:space="0" w:color="auto"/>
+              <w:left w:val="single" w:sz="12" w:space="0" w:color="auto"/>
+              <w:bottom w:val="single" w:sz="12" w:space="0" w:color="auto"/>
+              <w:right w:val="single" w:sz="12" w:space="0" w:color="auto"/>
+            </w:tcBorders>
+          </w:tcPr>
+          <w:p>
+            <w:pPr>
+              <w:ind w:left="88"/>
+              <w:rPr>
+                <w:rFonts w:ascii="Arial Narrow" w:hAnsi="Arial Narrow" w:cs="Arial"/>
+                <w:sz w:val="22"/>
+                <w:szCs w:val="22"/>
+              </w:rPr>
+            </w:pPr>
+            <w:r>
+              <w:rPr>
+                <w:rFonts w:ascii="Arial Narrow" w:hAnsi="Arial Narrow"/>
+                <w:sz w:val="22"/>
+                <w:szCs w:val="22"/>
+              </w:rPr>
+              <w:t>Cargo:</w:t>
+            </w:r>
+            <w:r>
+              <w:rPr>
+                <w:rFonts w:ascii="Arial Narrow" w:hAnsi="Arial Narrow" w:cs="Arial"/>
+                <w:bCs/>
+                <w:sz w:val="22"/>
+                <w:szCs w:val="22"/>
+                <w:lang w:val="es-CO"/>
+              </w:rPr>
+              <w:t xml:space="preserve"> {{</w:t>
+            </w:r>
+            <w:proofErr w:type="spellStart"/>
+            <w:r>
+              <w:rPr>
+                <w:rFonts w:ascii="Arial Narrow" w:hAnsi="Arial Narrow" w:cs="Arial"/>
+                <w:bCs/>
+                <w:sz w:val="22"/>
+                <w:szCs w:val="22"/>
+                <w:lang w:val="es-CO"/>
+              </w:rPr>
+              <w:t>cargo_entrega</w:t>
+            </w:r>
+            <w:proofErr w:type="spellEnd"/>
+            <w:r>
+              <w:rPr>
+                <w:rFonts w:ascii="Arial Narrow" w:hAnsi="Arial Narrow" w:cs="Arial"/>
+                <w:bCs/>
+                <w:sz w:val="22"/>
+                <w:szCs w:val="22"/>
+                <w:lang w:val="es-CO"/>
+              </w:rPr>
+              <w:t>}}</w:t>
+            </w:r>
+          </w:p>
+        </w:tc>
+        <w:tc>
+          <w:tcPr>
+            <w:tcW w:w="2977" w:type="dxa"/>
+            <w:vMerge/>
+            <w:tcBorders>
+              <w:top w:val="single" w:sz="12" w:space="0" w:color="auto"/>
+              <w:left w:val="single" w:sz="12" w:space="0" w:color="auto"/>
+              <w:bottom w:val="single" w:sz="12" w:space="0" w:color="auto"/>
+              <w:right w:val="single" w:sz="12" w:space="0" w:color="auto"/>
+            </w:tcBorders>
+          </w:tcPr>
+          <w:p>
+            <w:pPr>
+              <w:jc w:val="center"/>
+              <w:rPr>
+                <w:rFonts w:ascii="Arial Narrow" w:hAnsi="Arial Narrow" w:cs="Arial"/>
+                <w:sz w:val="22"/>
+                <w:szCs w:val="22"/>
+              </w:rPr>
+            </w:pPr>
+          </w:p>
+        </w:tc>
+      </w:tr>
+    </w:tbl>
+    <w:tbl>
+      <w:tblPr>
+        <w:tblpPr w:leftFromText="141" w:rightFromText="141" w:vertAnchor="text" w:horzAnchor="page" w:tblpX="982" w:tblpY="381"/>
+        <w:tblW w:w="0" w:type="auto"/>
+        <w:tblBorders>
+          <w:top w:val="single" w:sz="4" w:space="0" w:color="auto"/>
+          <w:left w:val="single" w:sz="4" w:space="0" w:color="auto"/>
+          <w:bottom w:val="single" w:sz="4" w:space="0" w:color="auto"/>
+          <w:right w:val="single" w:sz="4" w:space="0" w:color="auto"/>
+          <w:insideH w:val="single" w:sz="4" w:space="0" w:color="auto"/>
+          <w:insideV w:val="single" w:sz="4" w:space="0" w:color="auto"/>
+        </w:tblBorders>
+        <w:tblCellMar>
+          <w:left w:w="70" w:type="dxa"/>
+          <w:right w:w="70" w:type="dxa"/>
+        </w:tblCellMar>
+        <w:tblLook w:val="0000" w:firstRow="0" w:lastRow="0" w:firstColumn="0" w:lastColumn="0" w:noHBand="0" w:noVBand="0"/>
+      </w:tblPr>
+      <w:tblGrid>
+        <w:gridCol w:w="3189"/>
+      </w:tblGrid>
+      <w:tr>
+        <w:trPr>
+          <w:trHeight w:val="360"/>
+        </w:trPr>
+        <w:tc>
+          <w:tcPr>
+            <w:tcW w:w="3189" w:type="dxa"/>
+            <w:tcBorders>
+              <w:top w:val="single" w:sz="12" w:space="0" w:color="auto"/>
+              <w:left w:val="single" w:sz="12" w:space="0" w:color="auto"/>
+              <w:bottom w:val="single" w:sz="12" w:space="0" w:color="auto"/>
+              <w:right w:val="single" w:sz="12" w:space="0" w:color="auto"/>
+            </w:tcBorders>
+            <w:shd w:val="clear" w:color="auto" w:fill="D9D9D9" w:themeFill="background1" w:themeFillShade="D9"/>
+          </w:tcPr>
+          <w:bookmarkEnd w:id="15"/>
+          <w:p>
+            <w:pPr>
+              <w:jc w:val="center"/>
+            </w:pPr>
+            <w:r>
+              <w:rPr>
+                <w:rFonts w:ascii="Arial Narrow" w:hAnsi="Arial Narrow"/>
+                <w:b/>
+                <w:bCs/>
+                <w:color w:val="000000"/>
+                <w:sz w:val="22"/>
+                <w:szCs w:val="22"/>
+              </w:rPr>
+              <w:t>Recepción</w:t>
+            </w:r>
+          </w:p>
+          <w:p>
+            <w:pPr>
+              <w:jc w:val="center"/>
+              <w:rPr>
+                <w:rFonts w:ascii="Arial Narrow" w:hAnsi="Arial Narrow" w:cs="Arial"/>
+                <w:b/>
+                <w:bCs/>
+                <w:sz w:val="22"/>
+                <w:szCs w:val="22"/>
+              </w:rPr>
+            </w:pPr>
+            <w:r>
+              <w:rPr>
+                <w:rFonts w:ascii="Arial Narrow" w:hAnsi="Arial Narrow"/>
+                <w:b/>
+                <w:bCs/>
+                <w:color w:val="000000"/>
+                <w:sz w:val="22"/>
+                <w:szCs w:val="22"/>
+              </w:rPr>
+              <w:t>(Dirección de Infraestructura)</w:t>
+            </w:r>
+          </w:p>
+        </w:tc>
+      </w:tr>
+      <w:tr>
+        <w:trPr>
+          <w:trHeight w:val="1147"/>
+        </w:trPr>
+        <w:tc>
+          <w:tcPr>
+            <w:tcW w:w="3189" w:type="dxa"/>
+            <w:tcBorders>
+              <w:top w:val="single" w:sz="12" w:space="0" w:color="auto"/>
+              <w:left w:val="single" w:sz="12" w:space="0" w:color="auto"/>
+              <w:bottom w:val="single" w:sz="12" w:space="0" w:color="auto"/>
+              <w:right w:val="single" w:sz="12" w:space="0" w:color="auto"/>
+            </w:tcBorders>
+            <w:vAlign w:val="center"/>
+          </w:tcPr>
+          <w:p>
+            <w:pPr>
+              <w:ind w:left="88"/>
+              <w:jc w:val="center"/>
+              <w:rPr>
+                <w:rFonts w:ascii="Arial Narrow" w:hAnsi="Arial Narrow" w:cs="Arial"/>
+                <w:sz w:val="22"/>
+                <w:szCs w:val="22"/>
+                <w:u w:val="single"/>
+              </w:rPr>
+            </w:pPr>
+            <w:r>
+              <w:rPr>
+                <w:rFonts w:ascii="Arial Narrow" w:hAnsi="Arial Narrow" w:cs="Arial"/>
+                <w:sz w:val="22"/>
+                <w:szCs w:val="22"/>
+              </w:rPr>
+              <w:t>{{</w:t>
+            </w:r>
+            <w:proofErr w:type="spellStart"/>
+            <w:r>
+              <w:rPr>
+                <w:rFonts w:ascii="Arial Narrow" w:hAnsi="Arial Narrow" w:cs="Arial"/>
+                <w:sz w:val="22"/>
+                <w:szCs w:val="22"/>
+              </w:rPr>
+              <w:t>firma_tecnico</w:t>
+            </w:r>
+            <w:proofErr w:type="spellEnd"/>
+            <w:r>
+              <w:rPr>
+                <w:rFonts w:ascii="Arial Narrow" w:hAnsi="Arial Narrow" w:cs="Arial"/>
+                <w:sz w:val="22"/>
+                <w:szCs w:val="22"/>
+              </w:rPr>
+              <w:t>}}</w:t>
+            </w:r>
+          </w:p>
+        </w:tc>
+      </w:tr>
+      <w:tr>
+        <w:trPr>
+          <w:trHeight w:val="280"/>
+        </w:trPr>
+        <w:tc>
+          <w:tcPr>
+            <w:tcW w:w="3189" w:type="dxa"/>
+            <w:tcBorders>
+              <w:top w:val="single" w:sz="12" w:space="0" w:color="auto"/>
+              <w:left w:val="single" w:sz="12" w:space="0" w:color="auto"/>
+              <w:bottom w:val="single" w:sz="12" w:space="0" w:color="auto"/>
+              <w:right w:val="single" w:sz="12" w:space="0" w:color="auto"/>
+            </w:tcBorders>
+          </w:tcPr>
+          <w:p>
+            <w:pPr>
+              <w:ind w:left="88"/>
+              <w:rPr>
+                <w:rFonts w:ascii="Arial Narrow" w:hAnsi="Arial Narrow" w:cs="Arial"/>
+                <w:sz w:val="22"/>
+                <w:szCs w:val="22"/>
+              </w:rPr>
+            </w:pPr>
+            <w:r>
+              <w:rPr>
+                <w:rFonts w:ascii="Arial Narrow" w:hAnsi="Arial Narrow"/>
+                <w:sz w:val="22"/>
+                <w:szCs w:val="22"/>
+              </w:rPr>
+              <w:t xml:space="preserve">Nombre: </w:t>
+            </w:r>
+            <w:r>
+              <w:rPr>
+                <w:rFonts w:ascii="Arial Narrow" w:hAnsi="Arial Narrow" w:cs="Arial"/>
+                <w:bCs/>
+                <w:sz w:val="22"/>
+                <w:szCs w:val="22"/>
+                <w:lang w:val="es-CO"/>
+              </w:rPr>
+              <w:t xml:space="preserve">{{ </w:t>
+            </w:r>
+            <w:proofErr w:type="spellStart"/>
+            <w:r>
+              <w:rPr>
+                <w:rFonts w:ascii="Arial Narrow" w:hAnsi="Arial Narrow" w:cs="Arial"/>
+                <w:bCs/>
+                <w:sz w:val="22"/>
+                <w:szCs w:val="22"/>
+                <w:lang w:val="es-CO"/>
+              </w:rPr>
+              <w:t>entregado_</w:t>
+            </w:r>
+            <w:r>
+              <w:rPr>
+                <w:rFonts w:ascii="Arial Narrow" w:hAnsi="Arial Narrow" w:cs="Arial"/>
+                <w:bCs/>
+                <w:sz w:val="22"/>
+                <w:szCs w:val="22"/>
+                <w:lang w:val="es-CO"/>
+              </w:rPr>
+              <w:t>por</w:t>
+            </w:r>
+            <w:proofErr w:type="spellEnd"/>
+            <w:r>
+              <w:rPr>
+                <w:rFonts w:ascii="Arial Narrow" w:hAnsi="Arial Narrow" w:cs="Arial"/>
+                <w:bCs/>
+                <w:sz w:val="22"/>
+                <w:szCs w:val="22"/>
+                <w:lang w:val="es-CO"/>
+              </w:rPr>
+              <w:t xml:space="preserve"> }}</w:t>
+            </w:r>
+          </w:p>
+        </w:tc>
+      </w:tr>
+      <w:tr>
+        <w:trPr>
+          <w:trHeight w:val="240"/>
+        </w:trPr>
+        <w:tc>
+          <w:tcPr>
+            <w:tcW w:w="3189" w:type="dxa"/>
+            <w:tcBorders>
+              <w:top w:val="single" w:sz="12" w:space="0" w:color="auto"/>
+              <w:left w:val="single" w:sz="12" w:space="0" w:color="auto"/>
+              <w:bottom w:val="single" w:sz="12" w:space="0" w:color="auto"/>
+              <w:right w:val="single" w:sz="12" w:space="0" w:color="auto"/>
+            </w:tcBorders>
+          </w:tcPr>
+          <w:p>
+            <w:pPr>
+              <w:ind w:left="88"/>
+              <w:rPr>
+                <w:rFonts w:ascii="Arial Narrow" w:hAnsi="Arial Narrow" w:cs="Arial"/>
+                <w:sz w:val="22"/>
+                <w:szCs w:val="22"/>
+              </w:rPr>
+            </w:pPr>
+            <w:r>
+              <w:rPr>
+                <w:rFonts w:ascii="Arial Narrow" w:hAnsi="Arial Narrow"/>
+                <w:sz w:val="22"/>
+                <w:szCs w:val="22"/>
+              </w:rPr>
+              <w:t xml:space="preserve">Cargo: </w:t>
+            </w:r>
+            <w:r>
+              <w:rPr>
+                <w:rFonts w:ascii="Arial Narrow" w:hAnsi="Arial Narrow" w:cs="Arial"/>
+                <w:bCs/>
+                <w:sz w:val="22"/>
+                <w:szCs w:val="22"/>
+                <w:lang w:val="es-CO"/>
+              </w:rPr>
+              <w:t>{{</w:t>
+            </w:r>
+            <w:r>
+              <w:rPr>
+                <w:rFonts w:ascii="Arial Narrow" w:hAnsi="Arial Narrow" w:cs="Arial"/>
+                <w:bCs/>
+                <w:sz w:val="22"/>
+                <w:szCs w:val="22"/>
+                <w:lang w:val="es-CO"/>
+              </w:rPr>
+              <w:t xml:space="preserve"> </w:t>
+            </w:r>
+            <w:proofErr w:type="spellStart"/>
+            <w:r>
+              <w:rPr>
+                <w:rFonts w:ascii="Arial Narrow" w:hAnsi="Arial Narrow" w:cs="Arial"/>
+                <w:bCs/>
+                <w:sz w:val="22"/>
+                <w:szCs w:val="22"/>
+                <w:lang w:val="es-CO"/>
+              </w:rPr>
+              <w:t>cargo_entrega</w:t>
+            </w:r>
+            <w:proofErr w:type="spellEnd"/>
+            <w:r>
+              <w:rPr>
+                <w:rFonts w:ascii="Arial Narrow" w:hAnsi="Arial Narrow" w:cs="Arial"/>
+                <w:bCs/>
+                <w:sz w:val="22"/>
+                <w:szCs w:val="22"/>
+                <w:lang w:val="es-CO"/>
+              </w:rPr>
+              <w:t xml:space="preserve"> }}</w:t>
+            </w:r>
+          </w:p>
+        </w:tc>
+      </w:tr>
     </w:tbl>
     <w:p>
       <w:pPr>
         <w:pStyle w:val="Textoindependiente"/>
-        <w:ind w:hanging="993"/>
+        <w:ind w:left="-1620" w:right="-1216"/>
         <w:jc w:val="left"/>
         <w:rPr>
           <w:rFonts w:ascii="Arial Narrow" w:hAnsi="Arial Narrow" w:cs="Arial"/>
@@ -3736,6 +3824,7 @@
     </w:p>
     <w:p>
       <w:pPr>
+        <w:ind w:left="-1440" w:right="-441" w:hanging="180"/>
         <w:rPr>
           <w:rFonts w:ascii="Arial Narrow" w:hAnsi="Arial Narrow" w:cs="Arial"/>
           <w:bCs/>
@@ -3749,7 +3838,7 @@
       <w:headerReference w:type="default" r:id="rId10"/>
       <w:footerReference w:type="default" r:id="rId11"/>
       <w:pgSz w:w="11906" w:h="16838" w:code="9"/>
-      <w:pgMar w:top="1418" w:right="1701" w:bottom="1418" w:left="1701" w:header="709" w:footer="709" w:gutter="0"/>
+      <w:pgMar w:top="1418" w:right="1466" w:bottom="1418" w:left="1701" w:header="709" w:footer="709" w:gutter="0"/>
       <w:cols w:space="708"/>
       <w:docGrid w:linePitch="360"/>
     </w:sectPr>
@@ -3758,7 +3847,7 @@
 </file>
 
 <file path=word/endnotes.xml><?xml version="1.0" encoding="utf-8"?>
-<w:endnotes xmlns:wpc="http://schemas.microsoft.com/office/word/2010/wordprocessingCanvas" xmlns:cx="http://schemas.microsoft.com/office/drawing/2014/chartex" xmlns:cx1="http://schemas.microsoft.com/office/drawing/2015/9/8/chartex" xmlns:cx2="http://schemas.microsoft.com/office/drawing/2015/10/21/chartex" xmlns:cx3="http://schemas.microsoft.com/office/drawing/2016/5/9/chartex" xmlns:cx4="http://schemas.microsoft.com/office/drawing/2016/5/10/chartex" xmlns:cx5="http://schemas.microsoft.com/office/drawing/2016/5/11/chartex" xmlns:cx6="http://schemas.microsoft.com/office/drawing/2016/5/12/chartex" xmlns:cx7="http://schemas.microsoft.com/office/drawing/2016/5/13/chartex" xmlns:cx8="http://schemas.microsoft.com/office/drawing/2016/5/14/chartex" xmlns:mc="http://schemas.openxmlformats.org/markup-compatibility/2006" xmlns:aink="http://schemas.microsoft.com/office/drawing/2016/ink" xmlns:am3d="http://schemas.microsoft.com/office/drawing/2017/model3d" xmlns:o="urn:schemas-microsoft-com:office:office" xmlns:oel="http://schemas.microsoft.com/office/2019/extlst" xmlns:r="http://schemas.openxmlformats.org/officeDocument/2006/relationships" xmlns:m="http://schemas.openxmlformats.org/officeDocument/2006/math" xmlns:v="urn:schemas-microsoft-com:vml" xmlns:wp14="http://schemas.microsoft.com/office/word/2010/wordprocessingDrawing" xmlns:wp="http://schemas.openxmlformats.org/drawingml/2006/wordprocessingDrawing" xmlns:w10="urn:schemas-microsoft-com:office:word" xmlns:w="http://schemas.openxmlformats.org/wordprocessingml/2006/main" xmlns:w14="http://schemas.microsoft.com/office/word/2010/wordml" xmlns:w15="http://schemas.microsoft.com/office/word/2012/wordml" xmlns:w16cei="http://schemas.microsoft.com/office/word/2026/wordml/cei" xmlns:w16cex="http://schemas.microsoft.com/office/word/2018/wordml/cex" xmlns:w16cid="http://schemas.microsoft.com/office/word/2016/wordml/cid" xmlns:w16="http://schemas.microsoft.com/office/word/2018/wordml" xmlns:w16du="http://schemas.microsoft.com/office/word/2023/wordml/word16du" xmlns:w16sdtdh="http://schemas.microsoft.com/office/word/2020/wordml/sdtdatahash" xmlns:w16sdtfl="http://schemas.microsoft.com/office/word/2024/wordml/sdtformatlock" xmlns:w16se="http://schemas.microsoft.com/office/word/2015/wordml/symex" xmlns:wpg="http://schemas.microsoft.com/office/word/2010/wordprocessingGroup" xmlns:wpi="http://schemas.microsoft.com/office/word/2010/wordprocessingInk" xmlns:wne="http://schemas.microsoft.com/office/word/2006/wordml" xmlns:wps="http://schemas.microsoft.com/office/word/2010/wordprocessingShape" mc:Ignorable="w14 w15 w16se w16cid w16 w16cex w16sdtdh w16sdtfl w16du wp14">
+<w:endnotes xmlns:wpc="http://schemas.microsoft.com/office/word/2010/wordprocessingCanvas" xmlns:cx="http://schemas.microsoft.com/office/drawing/2014/chartex" xmlns:cx1="http://schemas.microsoft.com/office/drawing/2015/9/8/chartex" xmlns:cx2="http://schemas.microsoft.com/office/drawing/2015/10/21/chartex" xmlns:cx3="http://schemas.microsoft.com/office/drawing/2016/5/9/chartex" xmlns:cx4="http://schemas.microsoft.com/office/drawing/2016/5/10/chartex" xmlns:cx5="http://schemas.microsoft.com/office/drawing/2016/5/11/chartex" xmlns:cx6="http://schemas.microsoft.com/office/drawing/2016/5/12/chartex" xmlns:cx7="http://schemas.microsoft.com/office/drawing/2016/5/13/chartex" xmlns:cx8="http://schemas.microsoft.com/office/drawing/2016/5/14/chartex" xmlns:mc="http://schemas.openxmlformats.org/markup-compatibility/2006" xmlns:aink="http://schemas.microsoft.com/office/drawing/2016/ink" xmlns:am3d="http://schemas.microsoft.com/office/drawing/2017/model3d" xmlns:o="urn:schemas-microsoft-com:office:office" xmlns:oel="http://schemas.microsoft.com/office/2019/extlst" xmlns:r="http://schemas.openxmlformats.org/officeDocument/2006/relationships" xmlns:m="http://schemas.openxmlformats.org/officeDocument/2006/math" xmlns:v="urn:schemas-microsoft-com:vml" xmlns:wp14="http://schemas.microsoft.com/office/word/2010/wordprocessingDrawing" xmlns:wp="http://schemas.openxmlformats.org/drawingml/2006/wordprocessingDrawing" xmlns:w10="urn:schemas-microsoft-com:office:word" xmlns:w="http://schemas.openxmlformats.org/wordprocessingml/2006/main" xmlns:w14="http://schemas.microsoft.com/office/word/2010/wordml" xmlns:w15="http://schemas.microsoft.com/office/word/2012/wordml" xmlns:w16cex="http://schemas.microsoft.com/office/word/2018/wordml/cex" xmlns:w16cid="http://schemas.microsoft.com/office/word/2016/wordml/cid" xmlns:w16="http://schemas.microsoft.com/office/word/2018/wordml" xmlns:w16du="http://schemas.microsoft.com/office/word/2023/wordml/word16du" xmlns:w16sdtdh="http://schemas.microsoft.com/office/word/2020/wordml/sdtdatahash" xmlns:w16sdtfl="http://schemas.microsoft.com/office/word/2024/wordml/sdtformatlock" xmlns:w16se="http://schemas.microsoft.com/office/word/2015/wordml/symex" xmlns:wpg="http://schemas.microsoft.com/office/word/2010/wordprocessingGroup" xmlns:wpi="http://schemas.microsoft.com/office/word/2010/wordprocessingInk" xmlns:wne="http://schemas.microsoft.com/office/word/2006/wordml" xmlns:wps="http://schemas.microsoft.com/office/word/2010/wordprocessingShape" mc:Ignorable="w14 w15 w16se w16cid w16 w16cex w16sdtdh w16sdtfl w16du wp14">
   <w:endnote w:type="separator" w:id="-1">
     <w:p>
       <w:r>
@@ -3777,7 +3866,7 @@
 </file>
 
 <file path=word/footer1.xml><?xml version="1.0" encoding="utf-8"?>
-<w:ftr xmlns:wpc="http://schemas.microsoft.com/office/word/2010/wordprocessingCanvas" xmlns:cx="http://schemas.microsoft.com/office/drawing/2014/chartex" xmlns:cx1="http://schemas.microsoft.com/office/drawing/2015/9/8/chartex" xmlns:cx2="http://schemas.microsoft.com/office/drawing/2015/10/21/chartex" xmlns:cx3="http://schemas.microsoft.com/office/drawing/2016/5/9/chartex" xmlns:cx4="http://schemas.microsoft.com/office/drawing/2016/5/10/chartex" xmlns:cx5="http://schemas.microsoft.com/office/drawing/2016/5/11/chartex" xmlns:cx6="http://schemas.microsoft.com/office/drawing/2016/5/12/chartex" xmlns:cx7="http://schemas.microsoft.com/office/drawing/2016/5/13/chartex" xmlns:cx8="http://schemas.microsoft.com/office/drawing/2016/5/14/chartex" xmlns:mc="http://schemas.openxmlformats.org/markup-compatibility/2006" xmlns:aink="http://schemas.microsoft.com/office/drawing/2016/ink" xmlns:am3d="http://schemas.microsoft.com/office/drawing/2017/model3d" xmlns:o="urn:schemas-microsoft-com:office:office" xmlns:oel="http://schemas.microsoft.com/office/2019/extlst" xmlns:r="http://schemas.openxmlformats.org/officeDocument/2006/relationships" xmlns:m="http://schemas.openxmlformats.org/officeDocument/2006/math" xmlns:v="urn:schemas-microsoft-com:vml" xmlns:wp14="http://schemas.microsoft.com/office/word/2010/wordprocessingDrawing" xmlns:wp="http://schemas.openxmlformats.org/drawingml/2006/wordprocessingDrawing" xmlns:w10="urn:schemas-microsoft-com:office:word" xmlns:w="http://schemas.openxmlformats.org/wordprocessingml/2006/main" xmlns:w14="http://schemas.microsoft.com/office/word/2010/wordml" xmlns:w15="http://schemas.microsoft.com/office/word/2012/wordml" xmlns:w16cei="http://schemas.microsoft.com/office/word/2026/wordml/cei" xmlns:w16cex="http://schemas.microsoft.com/office/word/2018/wordml/cex" xmlns:w16cid="http://schemas.microsoft.com/office/word/2016/wordml/cid" xmlns:w16="http://schemas.microsoft.com/office/word/2018/wordml" xmlns:w16du="http://schemas.microsoft.com/office/word/2023/wordml/word16du" xmlns:w16sdtdh="http://schemas.microsoft.com/office/word/2020/wordml/sdtdatahash" xmlns:w16sdtfl="http://schemas.microsoft.com/office/word/2024/wordml/sdtformatlock" xmlns:w16se="http://schemas.microsoft.com/office/word/2015/wordml/symex" xmlns:wpg="http://schemas.microsoft.com/office/word/2010/wordprocessingGroup" xmlns:wpi="http://schemas.microsoft.com/office/word/2010/wordprocessingInk" xmlns:wne="http://schemas.microsoft.com/office/word/2006/wordml" xmlns:wps="http://schemas.microsoft.com/office/word/2010/wordprocessingShape" mc:Ignorable="w14 w15 w16se w16cid w16 w16cex w16sdtdh w16sdtfl w16du wp14">
+<w:ftr xmlns:wpc="http://schemas.microsoft.com/office/word/2010/wordprocessingCanvas" xmlns:cx="http://schemas.microsoft.com/office/drawing/2014/chartex" xmlns:cx1="http://schemas.microsoft.com/office/drawing/2015/9/8/chartex" xmlns:cx2="http://schemas.microsoft.com/office/drawing/2015/10/21/chartex" xmlns:cx3="http://schemas.microsoft.com/office/drawing/2016/5/9/chartex" xmlns:cx4="http://schemas.microsoft.com/office/drawing/2016/5/10/chartex" xmlns:cx5="http://schemas.microsoft.com/office/drawing/2016/5/11/chartex" xmlns:cx6="http://schemas.microsoft.com/office/drawing/2016/5/12/chartex" xmlns:cx7="http://schemas.microsoft.com/office/drawing/2016/5/13/chartex" xmlns:cx8="http://schemas.microsoft.com/office/drawing/2016/5/14/chartex" xmlns:mc="http://schemas.openxmlformats.org/markup-compatibility/2006" xmlns:aink="http://schemas.microsoft.com/office/drawing/2016/ink" xmlns:am3d="http://schemas.microsoft.com/office/drawing/2017/model3d" xmlns:o="urn:schemas-microsoft-com:office:office" xmlns:oel="http://schemas.microsoft.com/office/2019/extlst" xmlns:r="http://schemas.openxmlformats.org/officeDocument/2006/relationships" xmlns:m="http://schemas.openxmlformats.org/officeDocument/2006/math" xmlns:v="urn:schemas-microsoft-com:vml" xmlns:wp14="http://schemas.microsoft.com/office/word/2010/wordprocessingDrawing" xmlns:wp="http://schemas.openxmlformats.org/drawingml/2006/wordprocessingDrawing" xmlns:w10="urn:schemas-microsoft-com:office:word" xmlns:w="http://schemas.openxmlformats.org/wordprocessingml/2006/main" xmlns:w14="http://schemas.microsoft.com/office/word/2010/wordml" xmlns:w15="http://schemas.microsoft.com/office/word/2012/wordml" xmlns:w16cex="http://schemas.microsoft.com/office/word/2018/wordml/cex" xmlns:w16cid="http://schemas.microsoft.com/office/word/2016/wordml/cid" xmlns:w16="http://schemas.microsoft.com/office/word/2018/wordml" xmlns:w16du="http://schemas.microsoft.com/office/word/2023/wordml/word16du" xmlns:w16sdtdh="http://schemas.microsoft.com/office/word/2020/wordml/sdtdatahash" xmlns:w16sdtfl="http://schemas.microsoft.com/office/word/2024/wordml/sdtformatlock" xmlns:w16se="http://schemas.microsoft.com/office/word/2015/wordml/symex" xmlns:wpg="http://schemas.microsoft.com/office/word/2010/wordprocessingGroup" xmlns:wpi="http://schemas.microsoft.com/office/word/2010/wordprocessingInk" xmlns:wne="http://schemas.microsoft.com/office/word/2006/wordml" xmlns:wps="http://schemas.microsoft.com/office/word/2010/wordprocessingShape" mc:Ignorable="w14 w15 w16se w16cid w16 w16cex w16sdtdh w16sdtfl w16du wp14">
   <w:tbl>
     <w:tblPr>
       <w:tblW w:w="10508" w:type="dxa"/>
@@ -4047,7 +4136,7 @@
 </file>
 
 <file path=word/footnotes.xml><?xml version="1.0" encoding="utf-8"?>
-<w:footnotes xmlns:wpc="http://schemas.microsoft.com/office/word/2010/wordprocessingCanvas" xmlns:cx="http://schemas.microsoft.com/office/drawing/2014/chartex" xmlns:cx1="http://schemas.microsoft.com/office/drawing/2015/9/8/chartex" xmlns:cx2="http://schemas.microsoft.com/office/drawing/2015/10/21/chartex" xmlns:cx3="http://schemas.microsoft.com/office/drawing/2016/5/9/chartex" xmlns:cx4="http://schemas.microsoft.com/office/drawing/2016/5/10/chartex" xmlns:cx5="http://schemas.microsoft.com/office/drawing/2016/5/11/chartex" xmlns:cx6="http://schemas.microsoft.com/office/drawing/2016/5/12/chartex" xmlns:cx7="http://schemas.microsoft.com/office/drawing/2016/5/13/chartex" xmlns:cx8="http://schemas.microsoft.com/office/drawing/2016/5/14/chartex" xmlns:mc="http://schemas.openxmlformats.org/markup-compatibility/2006" xmlns:aink="http://schemas.microsoft.com/office/drawing/2016/ink" xmlns:am3d="http://schemas.microsoft.com/office/drawing/2017/model3d" xmlns:o="urn:schemas-microsoft-com:office:office" xmlns:oel="http://schemas.microsoft.com/office/2019/extlst" xmlns:r="http://schemas.openxmlformats.org/officeDocument/2006/relationships" xmlns:m="http://schemas.openxmlformats.org/officeDocument/2006/math" xmlns:v="urn:schemas-microsoft-com:vml" xmlns:wp14="http://schemas.microsoft.com/office/word/2010/wordprocessingDrawing" xmlns:wp="http://schemas.openxmlformats.org/drawingml/2006/wordprocessingDrawing" xmlns:w10="urn:schemas-microsoft-com:office:word" xmlns:w="http://schemas.openxmlformats.org/wordprocessingml/2006/main" xmlns:w14="http://schemas.microsoft.com/office/word/2010/wordml" xmlns:w15="http://schemas.microsoft.com/office/word/2012/wordml" xmlns:w16cei="http://schemas.microsoft.com/office/word/2026/wordml/cei" xmlns:w16cex="http://schemas.microsoft.com/office/word/2018/wordml/cex" xmlns:w16cid="http://schemas.microsoft.com/office/word/2016/wordml/cid" xmlns:w16="http://schemas.microsoft.com/office/word/2018/wordml" xmlns:w16du="http://schemas.microsoft.com/office/word/2023/wordml/word16du" xmlns:w16sdtdh="http://schemas.microsoft.com/office/word/2020/wordml/sdtdatahash" xmlns:w16sdtfl="http://schemas.microsoft.com/office/word/2024/wordml/sdtformatlock" xmlns:w16se="http://schemas.microsoft.com/office/word/2015/wordml/symex" xmlns:wpg="http://schemas.microsoft.com/office/word/2010/wordprocessingGroup" xmlns:wpi="http://schemas.microsoft.com/office/word/2010/wordprocessingInk" xmlns:wne="http://schemas.microsoft.com/office/word/2006/wordml" xmlns:wps="http://schemas.microsoft.com/office/word/2010/wordprocessingShape" mc:Ignorable="w14 w15 w16se w16cid w16 w16cex w16sdtdh w16sdtfl w16du wp14">
+<w:footnotes xmlns:wpc="http://schemas.microsoft.com/office/word/2010/wordprocessingCanvas" xmlns:cx="http://schemas.microsoft.com/office/drawing/2014/chartex" xmlns:cx1="http://schemas.microsoft.com/office/drawing/2015/9/8/chartex" xmlns:cx2="http://schemas.microsoft.com/office/drawing/2015/10/21/chartex" xmlns:cx3="http://schemas.microsoft.com/office/drawing/2016/5/9/chartex" xmlns:cx4="http://schemas.microsoft.com/office/drawing/2016/5/10/chartex" xmlns:cx5="http://schemas.microsoft.com/office/drawing/2016/5/11/chartex" xmlns:cx6="http://schemas.microsoft.com/office/drawing/2016/5/12/chartex" xmlns:cx7="http://schemas.microsoft.com/office/drawing/2016/5/13/chartex" xmlns:cx8="http://schemas.microsoft.com/office/drawing/2016/5/14/chartex" xmlns:mc="http://schemas.openxmlformats.org/markup-compatibility/2006" xmlns:aink="http://schemas.microsoft.com/office/drawing/2016/ink" xmlns:am3d="http://schemas.microsoft.com/office/drawing/2017/model3d" xmlns:o="urn:schemas-microsoft-com:office:office" xmlns:oel="http://schemas.microsoft.com/office/2019/extlst" xmlns:r="http://schemas.openxmlformats.org/officeDocument/2006/relationships" xmlns:m="http://schemas.openxmlformats.org/officeDocument/2006/math" xmlns:v="urn:schemas-microsoft-com:vml" xmlns:wp14="http://schemas.microsoft.com/office/word/2010/wordprocessingDrawing" xmlns:wp="http://schemas.openxmlformats.org/drawingml/2006/wordprocessingDrawing" xmlns:w10="urn:schemas-microsoft-com:office:word" xmlns:w="http://schemas.openxmlformats.org/wordprocessingml/2006/main" xmlns:w14="http://schemas.microsoft.com/office/word/2010/wordml" xmlns:w15="http://schemas.microsoft.com/office/word/2012/wordml" xmlns:w16cex="http://schemas.microsoft.com/office/word/2018/wordml/cex" xmlns:w16cid="http://schemas.microsoft.com/office/word/2016/wordml/cid" xmlns:w16="http://schemas.microsoft.com/office/word/2018/wordml" xmlns:w16du="http://schemas.microsoft.com/office/word/2023/wordml/word16du" xmlns:w16sdtdh="http://schemas.microsoft.com/office/word/2020/wordml/sdtdatahash" xmlns:w16sdtfl="http://schemas.microsoft.com/office/word/2024/wordml/sdtformatlock" xmlns:w16se="http://schemas.microsoft.com/office/word/2015/wordml/symex" xmlns:wpg="http://schemas.microsoft.com/office/word/2010/wordprocessingGroup" xmlns:wpi="http://schemas.microsoft.com/office/word/2010/wordprocessingInk" xmlns:wne="http://schemas.microsoft.com/office/word/2006/wordml" xmlns:wps="http://schemas.microsoft.com/office/word/2010/wordprocessingShape" mc:Ignorable="w14 w15 w16se w16cid w16 w16cex w16sdtdh w16sdtfl w16du wp14">
   <w:footnote w:type="separator" w:id="-1">
     <w:p>
       <w:r>
@@ -4066,7 +4155,7 @@
 </file>
 
 <file path=word/header1.xml><?xml version="1.0" encoding="utf-8"?>
-<w:hdr xmlns:wpc="http://schemas.microsoft.com/office/word/2010/wordprocessingCanvas" xmlns:cx="http://schemas.microsoft.com/office/drawing/2014/chartex" xmlns:cx1="http://schemas.microsoft.com/office/drawing/2015/9/8/chartex" xmlns:cx2="http://schemas.microsoft.com/office/drawing/2015/10/21/chartex" xmlns:cx3="http://schemas.microsoft.com/office/drawing/2016/5/9/chartex" xmlns:cx4="http://schemas.microsoft.com/office/drawing/2016/5/10/chartex" xmlns:cx5="http://schemas.microsoft.com/office/drawing/2016/5/11/chartex" xmlns:cx6="http://schemas.microsoft.com/office/drawing/2016/5/12/chartex" xmlns:cx7="http://schemas.microsoft.com/office/drawing/2016/5/13/chartex" xmlns:cx8="http://schemas.microsoft.com/office/drawing/2016/5/14/chartex" xmlns:mc="http://schemas.openxmlformats.org/markup-compatibility/2006" xmlns:aink="http://schemas.microsoft.com/office/drawing/2016/ink" xmlns:am3d="http://schemas.microsoft.com/office/drawing/2017/model3d" xmlns:o="urn:schemas-microsoft-com:office:office" xmlns:oel="http://schemas.microsoft.com/office/2019/extlst" xmlns:r="http://schemas.openxmlformats.org/officeDocument/2006/relationships" xmlns:m="http://schemas.openxmlformats.org/officeDocument/2006/math" xmlns:v="urn:schemas-microsoft-com:vml" xmlns:wp14="http://schemas.microsoft.com/office/word/2010/wordprocessingDrawing" xmlns:wp="http://schemas.openxmlformats.org/drawingml/2006/wordprocessingDrawing" xmlns:w10="urn:schemas-microsoft-com:office:word" xmlns:w="http://schemas.openxmlformats.org/wordprocessingml/2006/main" xmlns:w14="http://schemas.microsoft.com/office/word/2010/wordml" xmlns:w15="http://schemas.microsoft.com/office/word/2012/wordml" xmlns:w16cei="http://schemas.microsoft.com/office/word/2026/wordml/cei" xmlns:w16cex="http://schemas.microsoft.com/office/word/2018/wordml/cex" xmlns:w16cid="http://schemas.microsoft.com/office/word/2016/wordml/cid" xmlns:w16="http://schemas.microsoft.com/office/word/2018/wordml" xmlns:w16du="http://schemas.microsoft.com/office/word/2023/wordml/word16du" xmlns:w16sdtdh="http://schemas.microsoft.com/office/word/2020/wordml/sdtdatahash" xmlns:w16sdtfl="http://schemas.microsoft.com/office/word/2024/wordml/sdtformatlock" xmlns:w16se="http://schemas.microsoft.com/office/word/2015/wordml/symex" xmlns:wpg="http://schemas.microsoft.com/office/word/2010/wordprocessingGroup" xmlns:wpi="http://schemas.microsoft.com/office/word/2010/wordprocessingInk" xmlns:wne="http://schemas.microsoft.com/office/word/2006/wordml" xmlns:wps="http://schemas.microsoft.com/office/word/2010/wordprocessingShape" mc:Ignorable="w14 w15 w16se w16cid w16 w16cex w16sdtdh w16sdtfl w16du wp14">
+<w:hdr xmlns:wpc="http://schemas.microsoft.com/office/word/2010/wordprocessingCanvas" xmlns:cx="http://schemas.microsoft.com/office/drawing/2014/chartex" xmlns:cx1="http://schemas.microsoft.com/office/drawing/2015/9/8/chartex" xmlns:cx2="http://schemas.microsoft.com/office/drawing/2015/10/21/chartex" xmlns:cx3="http://schemas.microsoft.com/office/drawing/2016/5/9/chartex" xmlns:cx4="http://schemas.microsoft.com/office/drawing/2016/5/10/chartex" xmlns:cx5="http://schemas.microsoft.com/office/drawing/2016/5/11/chartex" xmlns:cx6="http://schemas.microsoft.com/office/drawing/2016/5/12/chartex" xmlns:cx7="http://schemas.microsoft.com/office/drawing/2016/5/13/chartex" xmlns:cx8="http://schemas.microsoft.com/office/drawing/2016/5/14/chartex" xmlns:mc="http://schemas.openxmlformats.org/markup-compatibility/2006" xmlns:aink="http://schemas.microsoft.com/office/drawing/2016/ink" xmlns:am3d="http://schemas.microsoft.com/office/drawing/2017/model3d" xmlns:o="urn:schemas-microsoft-com:office:office" xmlns:oel="http://schemas.microsoft.com/office/2019/extlst" xmlns:r="http://schemas.openxmlformats.org/officeDocument/2006/relationships" xmlns:m="http://schemas.openxmlformats.org/officeDocument/2006/math" xmlns:v="urn:schemas-microsoft-com:vml" xmlns:wp14="http://schemas.microsoft.com/office/word/2010/wordprocessingDrawing" xmlns:wp="http://schemas.openxmlformats.org/drawingml/2006/wordprocessingDrawing" xmlns:w10="urn:schemas-microsoft-com:office:word" xmlns:w="http://schemas.openxmlformats.org/wordprocessingml/2006/main" xmlns:w14="http://schemas.microsoft.com/office/word/2010/wordml" xmlns:w15="http://schemas.microsoft.com/office/word/2012/wordml" xmlns:w16cex="http://schemas.microsoft.com/office/word/2018/wordml/cex" xmlns:w16cid="http://schemas.microsoft.com/office/word/2016/wordml/cid" xmlns:w16="http://schemas.microsoft.com/office/word/2018/wordml" xmlns:w16du="http://schemas.microsoft.com/office/word/2023/wordml/word16du" xmlns:w16sdtdh="http://schemas.microsoft.com/office/word/2020/wordml/sdtdatahash" xmlns:w16sdtfl="http://schemas.microsoft.com/office/word/2024/wordml/sdtformatlock" xmlns:w16se="http://schemas.microsoft.com/office/word/2015/wordml/symex" xmlns:wpg="http://schemas.microsoft.com/office/word/2010/wordprocessingGroup" xmlns:wpi="http://schemas.microsoft.com/office/word/2010/wordprocessingInk" xmlns:wne="http://schemas.microsoft.com/office/word/2006/wordml" xmlns:wps="http://schemas.microsoft.com/office/word/2010/wordprocessingShape" mc:Ignorable="w14 w15 w16se w16cid w16 w16cex w16sdtdh w16sdtfl w16du wp14">
   <w:p>
     <w:pPr>
       <w:pStyle w:val="Encabezado"/>
@@ -4096,7 +4185,7 @@
 </file>
 
 <file path=word/numbering.xml><?xml version="1.0" encoding="utf-8"?>
-<w:numbering xmlns:wpc="http://schemas.microsoft.com/office/word/2010/wordprocessingCanvas" xmlns:cx="http://schemas.microsoft.com/office/drawing/2014/chartex" xmlns:cx1="http://schemas.microsoft.com/office/drawing/2015/9/8/chartex" xmlns:cx2="http://schemas.microsoft.com/office/drawing/2015/10/21/chartex" xmlns:cx3="http://schemas.microsoft.com/office/drawing/2016/5/9/chartex" xmlns:cx4="http://schemas.microsoft.com/office/drawing/2016/5/10/chartex" xmlns:cx5="http://schemas.microsoft.com/office/drawing/2016/5/11/chartex" xmlns:cx6="http://schemas.microsoft.com/office/drawing/2016/5/12/chartex" xmlns:cx7="http://schemas.microsoft.com/office/drawing/2016/5/13/chartex" xmlns:cx8="http://schemas.microsoft.com/office/drawing/2016/5/14/chartex" xmlns:mc="http://schemas.openxmlformats.org/markup-compatibility/2006" xmlns:aink="http://schemas.microsoft.com/office/drawing/2016/ink" xmlns:am3d="http://schemas.microsoft.com/office/drawing/2017/model3d" xmlns:o="urn:schemas-microsoft-com:office:office" xmlns:oel="http://schemas.microsoft.com/office/2019/extlst" xmlns:r="http://schemas.openxmlformats.org/officeDocument/2006/relationships" xmlns:m="http://schemas.openxmlformats.org/officeDocument/2006/math" xmlns:v="urn:schemas-microsoft-com:vml" xmlns:wp14="http://schemas.microsoft.com/office/word/2010/wordprocessingDrawing" xmlns:wp="http://schemas.openxmlformats.org/drawingml/2006/wordprocessingDrawing" xmlns:w10="urn:schemas-microsoft-com:office:word" xmlns:w="http://schemas.openxmlformats.org/wordprocessingml/2006/main" xmlns:w14="http://schemas.microsoft.com/office/word/2010/wordml" xmlns:w15="http://schemas.microsoft.com/office/word/2012/wordml" xmlns:w16cei="http://schemas.microsoft.com/office/word/2026/wordml/cei" xmlns:w16cex="http://schemas.microsoft.com/office/word/2018/wordml/cex" xmlns:w16cid="http://schemas.microsoft.com/office/word/2016/wordml/cid" xmlns:w16="http://schemas.microsoft.com/office/word/2018/wordml" xmlns:w16du="http://schemas.microsoft.com/office/word/2023/wordml/word16du" xmlns:w16sdtdh="http://schemas.microsoft.com/office/word/2020/wordml/sdtdatahash" xmlns:w16sdtfl="http://schemas.microsoft.com/office/word/2024/wordml/sdtformatlock" xmlns:w16se="http://schemas.microsoft.com/office/word/2015/wordml/symex" xmlns:wpg="http://schemas.microsoft.com/office/word/2010/wordprocessingGroup" xmlns:wpi="http://schemas.microsoft.com/office/word/2010/wordprocessingInk" xmlns:wne="http://schemas.microsoft.com/office/word/2006/wordml" xmlns:wps="http://schemas.microsoft.com/office/word/2010/wordprocessingShape" mc:Ignorable="w14 w15 w16se w16cid w16 w16cex w16sdtdh w16sdtfl w16du wp14">
+<w:numbering xmlns:wpc="http://schemas.microsoft.com/office/word/2010/wordprocessingCanvas" xmlns:cx="http://schemas.microsoft.com/office/drawing/2014/chartex" xmlns:cx1="http://schemas.microsoft.com/office/drawing/2015/9/8/chartex" xmlns:cx2="http://schemas.microsoft.com/office/drawing/2015/10/21/chartex" xmlns:cx3="http://schemas.microsoft.com/office/drawing/2016/5/9/chartex" xmlns:cx4="http://schemas.microsoft.com/office/drawing/2016/5/10/chartex" xmlns:cx5="http://schemas.microsoft.com/office/drawing/2016/5/11/chartex" xmlns:cx6="http://schemas.microsoft.com/office/drawing/2016/5/12/chartex" xmlns:cx7="http://schemas.microsoft.com/office/drawing/2016/5/13/chartex" xmlns:cx8="http://schemas.microsoft.com/office/drawing/2016/5/14/chartex" xmlns:mc="http://schemas.openxmlformats.org/markup-compatibility/2006" xmlns:aink="http://schemas.microsoft.com/office/drawing/2016/ink" xmlns:am3d="http://schemas.microsoft.com/office/drawing/2017/model3d" xmlns:o="urn:schemas-microsoft-com:office:office" xmlns:oel="http://schemas.microsoft.com/office/2019/extlst" xmlns:r="http://schemas.openxmlformats.org/officeDocument/2006/relationships" xmlns:m="http://schemas.openxmlformats.org/officeDocument/2006/math" xmlns:v="urn:schemas-microsoft-com:vml" xmlns:wp14="http://schemas.microsoft.com/office/word/2010/wordprocessingDrawing" xmlns:wp="http://schemas.openxmlformats.org/drawingml/2006/wordprocessingDrawing" xmlns:w10="urn:schemas-microsoft-com:office:word" xmlns:w="http://schemas.openxmlformats.org/wordprocessingml/2006/main" xmlns:w14="http://schemas.microsoft.com/office/word/2010/wordml" xmlns:w15="http://schemas.microsoft.com/office/word/2012/wordml" xmlns:w16cex="http://schemas.microsoft.com/office/word/2018/wordml/cex" xmlns:w16cid="http://schemas.microsoft.com/office/word/2016/wordml/cid" xmlns:w16="http://schemas.microsoft.com/office/word/2018/wordml" xmlns:w16du="http://schemas.microsoft.com/office/word/2023/wordml/word16du" xmlns:w16sdtdh="http://schemas.microsoft.com/office/word/2020/wordml/sdtdatahash" xmlns:w16sdtfl="http://schemas.microsoft.com/office/word/2024/wordml/sdtformatlock" xmlns:w16se="http://schemas.microsoft.com/office/word/2015/wordml/symex" xmlns:wpg="http://schemas.microsoft.com/office/word/2010/wordprocessingGroup" xmlns:wpi="http://schemas.microsoft.com/office/word/2010/wordprocessingInk" xmlns:wne="http://schemas.microsoft.com/office/word/2006/wordml" xmlns:wps="http://schemas.microsoft.com/office/word/2010/wordprocessingShape" mc:Ignorable="w14 w15 w16se w16cid w16 w16cex w16sdtdh w16sdtfl w16du wp14">
   <w:abstractNum w:abstractNumId="0" w15:restartNumberingAfterBreak="0">
     <w:nsid w:val="FFFFFFFE"/>
     <w:multiLevelType w:val="singleLevel"/>
@@ -9642,7 +9731,7 @@
   <w:style w:type="paragraph" w:default="1" w:styleId="Normal">
     <w:name w:val="Normal"/>
     <w:qFormat/>
-    <w:rsid w:val="0034516F"/>
+    <w:rsid w:val="0012066F"/>
     <w:rPr>
       <w:sz w:val="24"/>
       <w:szCs w:val="24"/>

</xml_diff>

<commit_message>
Java 3.5.4 "Arreglos Modulo de Auditorias"
</commit_message>
<xml_diff>
--- a/backend/src/main/resources/plantillas/Acta de Entrega 2 2 - copia.docx
+++ b/backend/src/main/resources/plantillas/Acta de Entrega 2 2 - copia.docx
@@ -62,7 +62,7 @@
                 <v:shape id="_x0000_i1025" type="#_x0000_t75" style="width:2in;height:42pt" o:ole="">
                   <v:imagedata r:id="rId8" o:title=""/>
                 </v:shape>
-                <o:OLEObject Type="Embed" ProgID="PBrush" ShapeID="_x0000_i1025" DrawAspect="Content" ObjectID="_1849180962" r:id="rId9"/>
+                <o:OLEObject Type="Embed" ProgID="PBrush" ShapeID="_x0000_i1025" DrawAspect="Content" ObjectID="_1849771154" r:id="rId9"/>
               </w:object>
             </w:r>
           </w:p>
@@ -312,7 +312,6 @@
               </w:rPr>
               <w:t xml:space="preserve">{{ </w:t>
             </w:r>
-            <w:proofErr w:type="spellStart"/>
             <w:r>
               <w:rPr>
                 <w:rFonts w:ascii="Arial Narrow" w:hAnsi="Arial Narrow"/>
@@ -323,7 +322,6 @@
               </w:rPr>
               <w:t>dia</w:t>
             </w:r>
-            <w:proofErr w:type="spellEnd"/>
             <w:r>
               <w:rPr>
                 <w:rFonts w:ascii="Arial Narrow" w:hAnsi="Arial Narrow"/>
@@ -411,7 +409,6 @@
               </w:rPr>
               <w:t xml:space="preserve">{{ </w:t>
             </w:r>
-            <w:proofErr w:type="spellStart"/>
             <w:r>
               <w:rPr>
                 <w:rFonts w:ascii="Arial Narrow" w:hAnsi="Arial Narrow" w:cs="Arial"/>
@@ -442,7 +439,6 @@
               </w:rPr>
               <w:t>o</w:t>
             </w:r>
-            <w:proofErr w:type="spellEnd"/>
             <w:r>
               <w:rPr>
                 <w:rFonts w:ascii="Arial Narrow" w:hAnsi="Arial Narrow" w:cs="Arial"/>
@@ -515,29 +511,7 @@
                 <w:szCs w:val="22"/>
                 <w:lang w:val="es-CO"/>
               </w:rPr>
-              <w:t xml:space="preserve">{{ </w:t>
-            </w:r>
-            <w:proofErr w:type="spellStart"/>
-            <w:r>
-              <w:rPr>
-                <w:rFonts w:ascii="Arial Narrow" w:hAnsi="Arial Narrow" w:cs="Arial"/>
-                <w:bCs/>
-                <w:sz w:val="22"/>
-                <w:szCs w:val="22"/>
-                <w:lang w:val="es-CO"/>
-              </w:rPr>
-              <w:t>entregado_a</w:t>
-            </w:r>
-            <w:proofErr w:type="spellEnd"/>
-            <w:r>
-              <w:rPr>
-                <w:rFonts w:ascii="Arial Narrow" w:hAnsi="Arial Narrow" w:cs="Arial"/>
-                <w:bCs/>
-                <w:sz w:val="22"/>
-                <w:szCs w:val="22"/>
-                <w:lang w:val="es-CO"/>
-              </w:rPr>
-              <w:t xml:space="preserve"> }}</w:t>
+              <w:t>{{ entregado_a }}</w:t>
             </w:r>
             <w:bookmarkEnd w:id="1"/>
           </w:p>
@@ -603,18 +577,7 @@
                 <w:szCs w:val="22"/>
                 <w:lang w:val="es-CO"/>
               </w:rPr>
-              <w:t xml:space="preserve"> </w:t>
-            </w:r>
-            <w:proofErr w:type="spellStart"/>
-            <w:r>
-              <w:rPr>
-                <w:rFonts w:ascii="Arial Narrow" w:hAnsi="Arial Narrow" w:cs="Arial"/>
-                <w:bCs/>
-                <w:sz w:val="22"/>
-                <w:szCs w:val="22"/>
-                <w:lang w:val="es-CO"/>
-              </w:rPr>
-              <w:t>cargo_</w:t>
+              <w:t xml:space="preserve"> cargo_</w:t>
             </w:r>
             <w:r>
               <w:rPr>
@@ -626,7 +589,6 @@
               </w:rPr>
               <w:t>recibe</w:t>
             </w:r>
-            <w:proofErr w:type="spellEnd"/>
             <w:r>
               <w:rPr>
                 <w:rFonts w:ascii="Arial Narrow" w:hAnsi="Arial Narrow" w:cs="Arial"/>
@@ -712,18 +674,7 @@
                 <w:szCs w:val="22"/>
                 <w:lang w:val="es-CO"/>
               </w:rPr>
-              <w:t xml:space="preserve">{{ </w:t>
-            </w:r>
-            <w:proofErr w:type="spellStart"/>
-            <w:r>
-              <w:rPr>
-                <w:rFonts w:ascii="Arial Narrow" w:hAnsi="Arial Narrow" w:cs="Arial"/>
-                <w:bCs/>
-                <w:sz w:val="22"/>
-                <w:szCs w:val="22"/>
-                <w:lang w:val="es-CO"/>
-              </w:rPr>
-              <w:t>entregado_</w:t>
+              <w:t>{{ entregado_</w:t>
             </w:r>
             <w:r>
               <w:rPr>
@@ -735,7 +686,6 @@
               </w:rPr>
               <w:t>por</w:t>
             </w:r>
-            <w:proofErr w:type="spellEnd"/>
             <w:r>
               <w:rPr>
                 <w:rFonts w:ascii="Arial Narrow" w:hAnsi="Arial Narrow" w:cs="Arial"/>
@@ -812,20 +762,8 @@
                 <w:szCs w:val="22"/>
                 <w:lang w:val="es-CO"/>
               </w:rPr>
-              <w:t xml:space="preserve"> </w:t>
-            </w:r>
-            <w:proofErr w:type="spellStart"/>
-            <w:r>
-              <w:rPr>
-                <w:rFonts w:ascii="Arial Narrow" w:hAnsi="Arial Narrow" w:cs="Arial"/>
-                <w:bCs/>
-                <w:sz w:val="22"/>
-                <w:szCs w:val="22"/>
-                <w:lang w:val="es-CO"/>
-              </w:rPr>
-              <w:t>cargo_entrega</w:t>
-            </w:r>
-            <w:proofErr w:type="spellEnd"/>
+              <w:t xml:space="preserve"> cargo_entrega</w:t>
+            </w:r>
             <w:r>
               <w:rPr>
                 <w:rFonts w:ascii="Arial Narrow" w:hAnsi="Arial Narrow" w:cs="Arial"/>
@@ -3174,6 +3112,7 @@
               </w:rPr>
             </w:pPr>
             <w:bookmarkStart w:id="15" w:name="OLE_LINK28"/>
+            <w:bookmarkStart w:id="16" w:name="OLE_LINK17"/>
             <w:r>
               <w:rPr>
                 <w:rFonts w:ascii="Arial Narrow" w:hAnsi="Arial Narrow" w:cs="Arial"/>
@@ -3182,7 +3121,7 @@
                 <w:sz w:val="22"/>
                 <w:szCs w:val="22"/>
               </w:rPr>
-              <w:t>Entrega</w:t>
+              <w:t>Recibe</w:t>
             </w:r>
           </w:p>
         </w:tc>
@@ -3246,34 +3185,15 @@
                 <w:szCs w:val="22"/>
               </w:rPr>
             </w:pPr>
-            <w:r>
-              <w:rPr>
-                <w:rFonts w:ascii="Arial Narrow" w:hAnsi="Arial Narrow" w:cs="Arial"/>
-                <w:bCs/>
-                <w:sz w:val="22"/>
-                <w:szCs w:val="22"/>
-              </w:rPr>
-              <w:t>{{</w:t>
-            </w:r>
-            <w:proofErr w:type="spellStart"/>
-            <w:r>
-              <w:rPr>
-                <w:rFonts w:ascii="Arial Narrow" w:hAnsi="Arial Narrow" w:cs="Arial"/>
-                <w:bCs/>
-                <w:sz w:val="22"/>
-                <w:szCs w:val="22"/>
-              </w:rPr>
-              <w:t>firma_usuario</w:t>
-            </w:r>
-            <w:proofErr w:type="spellEnd"/>
-            <w:r>
-              <w:rPr>
-                <w:rFonts w:ascii="Arial Narrow" w:hAnsi="Arial Narrow" w:cs="Arial"/>
-                <w:bCs/>
-                <w:sz w:val="22"/>
-                <w:szCs w:val="22"/>
-              </w:rPr>
-              <w:t>}}</w:t>
+            <w:bookmarkStart w:id="17" w:name="OLE_LINK16"/>
+            <w:r>
+              <w:rPr>
+                <w:rFonts w:ascii="Arial Narrow" w:hAnsi="Arial Narrow" w:cs="Arial"/>
+                <w:bCs/>
+                <w:sz w:val="22"/>
+                <w:szCs w:val="22"/>
+              </w:rPr>
+              <w:t>{{firma_usuario}}</w:t>
             </w:r>
           </w:p>
         </w:tc>
@@ -3304,27 +3224,7 @@
                 <w:sz w:val="22"/>
                 <w:szCs w:val="22"/>
               </w:rPr>
-              <w:t>{{</w:t>
-            </w:r>
-            <w:proofErr w:type="spellStart"/>
-            <w:r>
-              <w:rPr>
-                <w:rFonts w:ascii="Arial Narrow" w:hAnsi="Arial Narrow" w:cs="Arial"/>
-                <w:bCs/>
-                <w:sz w:val="22"/>
-                <w:szCs w:val="22"/>
-              </w:rPr>
-              <w:t>foto_usuario</w:t>
-            </w:r>
-            <w:proofErr w:type="spellEnd"/>
-            <w:r>
-              <w:rPr>
-                <w:rFonts w:ascii="Arial Narrow" w:hAnsi="Arial Narrow" w:cs="Arial"/>
-                <w:bCs/>
-                <w:sz w:val="22"/>
-                <w:szCs w:val="22"/>
-              </w:rPr>
-              <w:t>}}</w:t>
+              <w:t>{{foto_usuario}}</w:t>
             </w:r>
           </w:p>
           <w:p>
@@ -3376,18 +3276,16 @@
                 <w:sz w:val="22"/>
                 <w:szCs w:val="22"/>
               </w:rPr>
-              <w:t>: {{</w:t>
-            </w:r>
-            <w:proofErr w:type="spellStart"/>
-            <w:r>
-              <w:rPr>
-                <w:rFonts w:ascii="Arial Narrow" w:hAnsi="Arial Narrow"/>
-                <w:sz w:val="22"/>
-                <w:szCs w:val="22"/>
-              </w:rPr>
-              <w:t>entregado_por</w:t>
-            </w:r>
-            <w:proofErr w:type="spellEnd"/>
+              <w:t>: {{entregado_</w:t>
+            </w:r>
+            <w:r>
+              <w:rPr>
+                <w:rFonts w:ascii="Arial Narrow" w:hAnsi="Arial Narrow"/>
+                <w:sz w:val="22"/>
+                <w:szCs w:val="22"/>
+              </w:rPr>
+              <w:t>a</w:t>
+            </w:r>
             <w:r>
               <w:rPr>
                 <w:rFonts w:ascii="Arial Narrow" w:hAnsi="Arial Narrow"/>
@@ -3462,18 +3360,26 @@
               </w:rPr>
               <w:t xml:space="preserve"> {{</w:t>
             </w:r>
-            <w:proofErr w:type="spellStart"/>
-            <w:r>
-              <w:rPr>
-                <w:rFonts w:ascii="Arial Narrow" w:hAnsi="Arial Narrow" w:cs="Arial"/>
-                <w:bCs/>
-                <w:sz w:val="22"/>
-                <w:szCs w:val="22"/>
-                <w:lang w:val="es-CO"/>
-              </w:rPr>
-              <w:t>cargo_entrega</w:t>
-            </w:r>
-            <w:proofErr w:type="spellEnd"/>
+            <w:r>
+              <w:rPr>
+                <w:rFonts w:ascii="Arial Narrow" w:hAnsi="Arial Narrow" w:cs="Arial"/>
+                <w:bCs/>
+                <w:sz w:val="22"/>
+                <w:szCs w:val="22"/>
+                <w:lang w:val="es-CO"/>
+              </w:rPr>
+              <w:t>cargo_</w:t>
+            </w:r>
+            <w:r>
+              <w:rPr>
+                <w:rFonts w:ascii="Arial Narrow" w:hAnsi="Arial Narrow" w:cs="Arial"/>
+                <w:bCs/>
+                <w:sz w:val="22"/>
+                <w:szCs w:val="22"/>
+                <w:lang w:val="es-CO"/>
+              </w:rPr>
+              <w:t>recibe</w:t>
+            </w:r>
             <w:r>
               <w:rPr>
                 <w:rFonts w:ascii="Arial Narrow" w:hAnsi="Arial Narrow" w:cs="Arial"/>
@@ -3550,6 +3456,13 @@
           <w:p>
             <w:pPr>
               <w:jc w:val="center"/>
+              <w:rPr>
+                <w:rFonts w:ascii="Arial Narrow" w:hAnsi="Arial Narrow" w:cs="Arial"/>
+                <w:b/>
+                <w:bCs/>
+                <w:sz w:val="22"/>
+                <w:szCs w:val="22"/>
+              </w:rPr>
             </w:pPr>
             <w:r>
               <w:rPr>
@@ -3560,30 +3473,7 @@
                 <w:sz w:val="22"/>
                 <w:szCs w:val="22"/>
               </w:rPr>
-              <w:t>Recepción</w:t>
-            </w:r>
-          </w:p>
-          <w:p>
-            <w:pPr>
-              <w:jc w:val="center"/>
-              <w:rPr>
-                <w:rFonts w:ascii="Arial Narrow" w:hAnsi="Arial Narrow" w:cs="Arial"/>
-                <w:b/>
-                <w:bCs/>
-                <w:sz w:val="22"/>
-                <w:szCs w:val="22"/>
-              </w:rPr>
-            </w:pPr>
-            <w:r>
-              <w:rPr>
-                <w:rFonts w:ascii="Arial Narrow" w:hAnsi="Arial Narrow"/>
-                <w:b/>
-                <w:bCs/>
-                <w:color w:val="000000"/>
-                <w:sz w:val="22"/>
-                <w:szCs w:val="22"/>
-              </w:rPr>
-              <w:t>(Dirección de Infraestructura)</w:t>
+              <w:t>Entrega</w:t>
             </w:r>
           </w:p>
         </w:tc>
@@ -3620,25 +3510,7 @@
                 <w:sz w:val="22"/>
                 <w:szCs w:val="22"/>
               </w:rPr>
-              <w:t>{{</w:t>
-            </w:r>
-            <w:proofErr w:type="spellStart"/>
-            <w:r>
-              <w:rPr>
-                <w:rFonts w:ascii="Arial Narrow" w:hAnsi="Arial Narrow" w:cs="Arial"/>
-                <w:sz w:val="22"/>
-                <w:szCs w:val="22"/>
-              </w:rPr>
-              <w:t>firma_tecnico</w:t>
-            </w:r>
-            <w:proofErr w:type="spellEnd"/>
-            <w:r>
-              <w:rPr>
-                <w:rFonts w:ascii="Arial Narrow" w:hAnsi="Arial Narrow" w:cs="Arial"/>
-                <w:sz w:val="22"/>
-                <w:szCs w:val="22"/>
-              </w:rPr>
-              <w:t>}}</w:t>
+              <w:t>{{firma_tecnico}}</w:t>
             </w:r>
           </w:p>
         </w:tc>
@@ -3682,18 +3554,7 @@
                 <w:szCs w:val="22"/>
                 <w:lang w:val="es-CO"/>
               </w:rPr>
-              <w:t xml:space="preserve">{{ </w:t>
-            </w:r>
-            <w:proofErr w:type="spellStart"/>
-            <w:r>
-              <w:rPr>
-                <w:rFonts w:ascii="Arial Narrow" w:hAnsi="Arial Narrow" w:cs="Arial"/>
-                <w:bCs/>
-                <w:sz w:val="22"/>
-                <w:szCs w:val="22"/>
-                <w:lang w:val="es-CO"/>
-              </w:rPr>
-              <w:t>entregado_</w:t>
+              <w:t>{{ entregado_</w:t>
             </w:r>
             <w:r>
               <w:rPr>
@@ -3705,7 +3566,6 @@
               </w:rPr>
               <w:t>por</w:t>
             </w:r>
-            <w:proofErr w:type="spellEnd"/>
             <w:r>
               <w:rPr>
                 <w:rFonts w:ascii="Arial Narrow" w:hAnsi="Arial Narrow" w:cs="Arial"/>
@@ -3768,20 +3628,8 @@
                 <w:szCs w:val="22"/>
                 <w:lang w:val="es-CO"/>
               </w:rPr>
-              <w:t xml:space="preserve"> </w:t>
-            </w:r>
-            <w:proofErr w:type="spellStart"/>
-            <w:r>
-              <w:rPr>
-                <w:rFonts w:ascii="Arial Narrow" w:hAnsi="Arial Narrow" w:cs="Arial"/>
-                <w:bCs/>
-                <w:sz w:val="22"/>
-                <w:szCs w:val="22"/>
-                <w:lang w:val="es-CO"/>
-              </w:rPr>
-              <w:t>cargo_entrega</w:t>
-            </w:r>
-            <w:proofErr w:type="spellEnd"/>
+              <w:t xml:space="preserve"> cargo_entrega</w:t>
+            </w:r>
             <w:r>
               <w:rPr>
                 <w:rFonts w:ascii="Arial Narrow" w:hAnsi="Arial Narrow" w:cs="Arial"/>
@@ -3808,6 +3656,7 @@
         </w:rPr>
       </w:pPr>
     </w:p>
+    <w:bookmarkEnd w:id="17"/>
     <w:p>
       <w:pPr>
         <w:rPr>
@@ -3822,6 +3671,7 @@
         </w:rPr>
       </w:pPr>
     </w:p>
+    <w:bookmarkEnd w:id="16"/>
     <w:p>
       <w:pPr>
         <w:ind w:left="-1440" w:right="-441" w:hanging="180"/>

</xml_diff>